<commit_message>
Added the GitHub Link Yutube Link will be added later on
</commit_message>
<xml_diff>
--- a/ReadME.docx
+++ b/ReadME.docx
@@ -8,13 +8,13 @@
         <w:spacing w:after="240" w:line="240" w:lineRule="auto"/>
         <w:outlineLvl w:val="0"/>
         <w:rPr>
-          <w:rFonts w:ascii="Segoe UI" w:eastAsia="Times New Roman" w:hAnsi="Segoe UI" w:cs="Segoe UI"/>
+          <w:rFonts w:ascii="Arial" w:eastAsia="Times New Roman" w:hAnsi="Arial" w:cs="Arial"/>
           <w:b/>
           <w:bCs/>
           <w:color w:val="1F2328"/>
           <w:kern w:val="36"/>
-          <w:sz w:val="48"/>
-          <w:szCs w:val="48"/>
+          <w:sz w:val="32"/>
+          <w:szCs w:val="32"/>
           <w:lang w:eastAsia="en-ZA"/>
           <w14:ligatures w14:val="none"/>
         </w:rPr>
@@ -26,8 +26,8 @@
           <w:bCs/>
           <w:color w:val="1F2328"/>
           <w:kern w:val="36"/>
-          <w:sz w:val="48"/>
-          <w:szCs w:val="48"/>
+          <w:sz w:val="32"/>
+          <w:szCs w:val="32"/>
           <w:lang w:eastAsia="en-ZA"/>
           <w14:ligatures w14:val="none"/>
         </w:rPr>
@@ -35,13 +35,13 @@
       </w:r>
       <w:r>
         <w:rPr>
-          <w:rFonts w:ascii="Segoe UI" w:eastAsia="Times New Roman" w:hAnsi="Segoe UI" w:cs="Segoe UI"/>
+          <w:rFonts w:ascii="Arial" w:eastAsia="Times New Roman" w:hAnsi="Arial" w:cs="Arial"/>
           <w:b/>
           <w:bCs/>
           <w:color w:val="1F2328"/>
           <w:kern w:val="36"/>
-          <w:sz w:val="48"/>
-          <w:szCs w:val="48"/>
+          <w:sz w:val="32"/>
+          <w:szCs w:val="32"/>
           <w:lang w:eastAsia="en-ZA"/>
           <w14:ligatures w14:val="none"/>
         </w:rPr>
@@ -54,13 +54,13 @@
         <w:spacing w:before="360" w:after="240" w:line="240" w:lineRule="auto"/>
         <w:outlineLvl w:val="1"/>
         <w:rPr>
-          <w:rFonts w:ascii="Segoe UI" w:eastAsia="Times New Roman" w:hAnsi="Segoe UI" w:cs="Segoe UI"/>
+          <w:rFonts w:ascii="Arial" w:eastAsia="Times New Roman" w:hAnsi="Arial" w:cs="Arial"/>
           <w:b/>
           <w:bCs/>
           <w:color w:val="1F2328"/>
           <w:kern w:val="0"/>
-          <w:sz w:val="36"/>
-          <w:szCs w:val="36"/>
+          <w:sz w:val="28"/>
+          <w:szCs w:val="28"/>
           <w:lang w:eastAsia="en-ZA"/>
           <w14:ligatures w14:val="none"/>
         </w:rPr>
@@ -72,8 +72,8 @@
           <w:bCs/>
           <w:color w:val="1F2328"/>
           <w:kern w:val="0"/>
-          <w:sz w:val="36"/>
-          <w:szCs w:val="36"/>
+          <w:sz w:val="28"/>
+          <w:szCs w:val="28"/>
           <w:lang w:eastAsia="en-ZA"/>
           <w14:ligatures w14:val="none"/>
         </w:rPr>
@@ -81,13 +81,13 @@
       </w:r>
       <w:r>
         <w:rPr>
-          <w:rFonts w:ascii="Segoe UI" w:eastAsia="Times New Roman" w:hAnsi="Segoe UI" w:cs="Segoe UI"/>
+          <w:rFonts w:ascii="Arial" w:eastAsia="Times New Roman" w:hAnsi="Arial" w:cs="Arial"/>
           <w:b/>
           <w:bCs/>
           <w:color w:val="1F2328"/>
           <w:kern w:val="0"/>
-          <w:sz w:val="36"/>
-          <w:szCs w:val="36"/>
+          <w:sz w:val="28"/>
+          <w:szCs w:val="28"/>
           <w:lang w:eastAsia="en-ZA"/>
           <w14:ligatures w14:val="none"/>
         </w:rPr>
@@ -99,18 +99,22 @@
         <w:shd w:val="clear" w:color="auto" w:fill="FFFFFF"/>
         <w:spacing w:after="240" w:line="240" w:lineRule="auto"/>
         <w:rPr>
-          <w:rFonts w:ascii="Segoe UI" w:eastAsia="Times New Roman" w:hAnsi="Segoe UI" w:cs="Segoe UI"/>
-          <w:color w:val="1F2328"/>
-          <w:kern w:val="0"/>
-          <w:lang w:eastAsia="en-ZA"/>
-          <w14:ligatures w14:val="none"/>
-        </w:rPr>
-      </w:pPr>
-      <w:r>
-        <w:rPr>
-          <w:rFonts w:ascii="Segoe UI" w:eastAsia="Times New Roman" w:hAnsi="Segoe UI" w:cs="Segoe UI"/>
-          <w:color w:val="1F2328"/>
-          <w:kern w:val="0"/>
+          <w:rFonts w:ascii="Arial" w:eastAsia="Times New Roman" w:hAnsi="Arial" w:cs="Arial"/>
+          <w:color w:val="1F2328"/>
+          <w:kern w:val="0"/>
+          <w:sz w:val="28"/>
+          <w:szCs w:val="28"/>
+          <w:lang w:eastAsia="en-ZA"/>
+          <w14:ligatures w14:val="none"/>
+        </w:rPr>
+      </w:pPr>
+      <w:r>
+        <w:rPr>
+          <w:rFonts w:ascii="Arial" w:eastAsia="Times New Roman" w:hAnsi="Arial" w:cs="Arial"/>
+          <w:color w:val="1F2328"/>
+          <w:kern w:val="0"/>
+          <w:sz w:val="28"/>
+          <w:szCs w:val="28"/>
           <w:lang w:eastAsia="en-ZA"/>
           <w14:ligatures w14:val="none"/>
         </w:rPr>
@@ -122,19 +126,23 @@
         <w:shd w:val="clear" w:color="auto" w:fill="FFFFFF"/>
         <w:spacing w:after="240" w:line="240" w:lineRule="auto"/>
         <w:rPr>
-          <w:rFonts w:ascii="Segoe UI" w:eastAsia="Times New Roman" w:hAnsi="Segoe UI" w:cs="Segoe UI"/>
-          <w:color w:val="1F2328"/>
-          <w:kern w:val="0"/>
-          <w:lang w:eastAsia="en-ZA"/>
-          <w14:ligatures w14:val="none"/>
-        </w:rPr>
-      </w:pPr>
-      <w:r>
-        <w:rPr>
-          <w:rFonts w:ascii="Segoe UI" w:eastAsia="Times New Roman" w:hAnsi="Segoe UI" w:cs="Segoe UI"/>
+          <w:rFonts w:ascii="Arial" w:eastAsia="Times New Roman" w:hAnsi="Arial" w:cs="Arial"/>
+          <w:color w:val="1F2328"/>
+          <w:kern w:val="0"/>
+          <w:sz w:val="28"/>
+          <w:szCs w:val="28"/>
+          <w:lang w:eastAsia="en-ZA"/>
+          <w14:ligatures w14:val="none"/>
+        </w:rPr>
+      </w:pPr>
+      <w:r>
+        <w:rPr>
+          <w:rFonts w:ascii="Arial" w:eastAsia="Times New Roman" w:hAnsi="Arial" w:cs="Arial"/>
           <w:noProof/>
           <w:color w:val="0969DA"/>
           <w:kern w:val="0"/>
+          <w:sz w:val="28"/>
+          <w:szCs w:val="28"/>
           <w:lang w:eastAsia="en-ZA"/>
           <w14:ligatures w14:val="none"/>
         </w:rPr>
@@ -198,13 +206,13 @@
         <w:spacing w:before="360" w:after="240" w:line="240" w:lineRule="auto"/>
         <w:outlineLvl w:val="1"/>
         <w:rPr>
-          <w:rFonts w:ascii="Segoe UI" w:eastAsia="Times New Roman" w:hAnsi="Segoe UI" w:cs="Segoe UI"/>
+          <w:rFonts w:ascii="Arial" w:eastAsia="Times New Roman" w:hAnsi="Arial" w:cs="Arial"/>
           <w:b/>
           <w:bCs/>
           <w:color w:val="1F2328"/>
           <w:kern w:val="0"/>
-          <w:sz w:val="36"/>
-          <w:szCs w:val="36"/>
+          <w:sz w:val="28"/>
+          <w:szCs w:val="28"/>
           <w:lang w:eastAsia="en-ZA"/>
           <w14:ligatures w14:val="none"/>
         </w:rPr>
@@ -216,8 +224,8 @@
           <w:bCs/>
           <w:color w:val="1F2328"/>
           <w:kern w:val="0"/>
-          <w:sz w:val="36"/>
-          <w:szCs w:val="36"/>
+          <w:sz w:val="28"/>
+          <w:szCs w:val="28"/>
           <w:lang w:eastAsia="en-ZA"/>
           <w14:ligatures w14:val="none"/>
         </w:rPr>
@@ -225,13 +233,13 @@
       </w:r>
       <w:r>
         <w:rPr>
-          <w:rFonts w:ascii="Segoe UI" w:eastAsia="Times New Roman" w:hAnsi="Segoe UI" w:cs="Segoe UI"/>
+          <w:rFonts w:ascii="Arial" w:eastAsia="Times New Roman" w:hAnsi="Arial" w:cs="Arial"/>
           <w:b/>
           <w:bCs/>
           <w:color w:val="1F2328"/>
           <w:kern w:val="0"/>
-          <w:sz w:val="36"/>
-          <w:szCs w:val="36"/>
+          <w:sz w:val="28"/>
+          <w:szCs w:val="28"/>
           <w:lang w:eastAsia="en-ZA"/>
           <w14:ligatures w14:val="none"/>
         </w:rPr>
@@ -243,18 +251,22 @@
         <w:shd w:val="clear" w:color="auto" w:fill="FFFFFF"/>
         <w:spacing w:after="240" w:line="240" w:lineRule="auto"/>
         <w:rPr>
-          <w:rFonts w:ascii="Segoe UI" w:eastAsia="Times New Roman" w:hAnsi="Segoe UI" w:cs="Segoe UI"/>
-          <w:color w:val="1F2328"/>
-          <w:kern w:val="0"/>
-          <w:lang w:eastAsia="en-ZA"/>
-          <w14:ligatures w14:val="none"/>
-        </w:rPr>
-      </w:pPr>
-      <w:r>
-        <w:rPr>
-          <w:rFonts w:ascii="Segoe UI" w:eastAsia="Times New Roman" w:hAnsi="Segoe UI" w:cs="Segoe UI"/>
-          <w:color w:val="1F2328"/>
-          <w:kern w:val="0"/>
+          <w:rFonts w:ascii="Arial" w:eastAsia="Times New Roman" w:hAnsi="Arial" w:cs="Arial"/>
+          <w:color w:val="1F2328"/>
+          <w:kern w:val="0"/>
+          <w:sz w:val="28"/>
+          <w:szCs w:val="28"/>
+          <w:lang w:eastAsia="en-ZA"/>
+          <w14:ligatures w14:val="none"/>
+        </w:rPr>
+      </w:pPr>
+      <w:r>
+        <w:rPr>
+          <w:rFonts w:ascii="Arial" w:eastAsia="Times New Roman" w:hAnsi="Arial" w:cs="Arial"/>
+          <w:color w:val="1F2328"/>
+          <w:kern w:val="0"/>
+          <w:sz w:val="28"/>
+          <w:szCs w:val="28"/>
           <w:lang w:eastAsia="en-ZA"/>
           <w14:ligatures w14:val="none"/>
         </w:rPr>
@@ -270,18 +282,22 @@
         <w:shd w:val="clear" w:color="auto" w:fill="FFFFFF"/>
         <w:spacing w:before="100" w:beforeAutospacing="1" w:after="100" w:afterAutospacing="1" w:line="240" w:lineRule="auto"/>
         <w:rPr>
-          <w:rFonts w:ascii="Segoe UI" w:eastAsia="Times New Roman" w:hAnsi="Segoe UI" w:cs="Segoe UI"/>
-          <w:color w:val="1F2328"/>
-          <w:kern w:val="0"/>
-          <w:lang w:eastAsia="en-ZA"/>
-          <w14:ligatures w14:val="none"/>
-        </w:rPr>
-      </w:pPr>
-      <w:r>
-        <w:rPr>
-          <w:rFonts w:ascii="Segoe UI" w:eastAsia="Times New Roman" w:hAnsi="Segoe UI" w:cs="Segoe UI"/>
-          <w:color w:val="1F2328"/>
-          <w:kern w:val="0"/>
+          <w:rFonts w:ascii="Arial" w:eastAsia="Times New Roman" w:hAnsi="Arial" w:cs="Arial"/>
+          <w:color w:val="1F2328"/>
+          <w:kern w:val="0"/>
+          <w:sz w:val="28"/>
+          <w:szCs w:val="28"/>
+          <w:lang w:eastAsia="en-ZA"/>
+          <w14:ligatures w14:val="none"/>
+        </w:rPr>
+      </w:pPr>
+      <w:r>
+        <w:rPr>
+          <w:rFonts w:ascii="Arial" w:eastAsia="Times New Roman" w:hAnsi="Arial" w:cs="Arial"/>
+          <w:color w:val="1F2328"/>
+          <w:kern w:val="0"/>
+          <w:sz w:val="28"/>
+          <w:szCs w:val="28"/>
           <w:lang w:eastAsia="en-ZA"/>
           <w14:ligatures w14:val="none"/>
         </w:rPr>
@@ -297,18 +313,22 @@
         <w:shd w:val="clear" w:color="auto" w:fill="FFFFFF"/>
         <w:spacing w:before="60" w:after="100" w:afterAutospacing="1" w:line="240" w:lineRule="auto"/>
         <w:rPr>
-          <w:rFonts w:ascii="Segoe UI" w:eastAsia="Times New Roman" w:hAnsi="Segoe UI" w:cs="Segoe UI"/>
-          <w:color w:val="1F2328"/>
-          <w:kern w:val="0"/>
-          <w:lang w:eastAsia="en-ZA"/>
-          <w14:ligatures w14:val="none"/>
-        </w:rPr>
-      </w:pPr>
-      <w:r>
-        <w:rPr>
-          <w:rFonts w:ascii="Segoe UI" w:eastAsia="Times New Roman" w:hAnsi="Segoe UI" w:cs="Segoe UI"/>
-          <w:color w:val="1F2328"/>
-          <w:kern w:val="0"/>
+          <w:rFonts w:ascii="Arial" w:eastAsia="Times New Roman" w:hAnsi="Arial" w:cs="Arial"/>
+          <w:color w:val="1F2328"/>
+          <w:kern w:val="0"/>
+          <w:sz w:val="28"/>
+          <w:szCs w:val="28"/>
+          <w:lang w:eastAsia="en-ZA"/>
+          <w14:ligatures w14:val="none"/>
+        </w:rPr>
+      </w:pPr>
+      <w:r>
+        <w:rPr>
+          <w:rFonts w:ascii="Arial" w:eastAsia="Times New Roman" w:hAnsi="Arial" w:cs="Arial"/>
+          <w:color w:val="1F2328"/>
+          <w:kern w:val="0"/>
+          <w:sz w:val="28"/>
+          <w:szCs w:val="28"/>
           <w:lang w:eastAsia="en-ZA"/>
           <w14:ligatures w14:val="none"/>
         </w:rPr>
@@ -324,18 +344,22 @@
         <w:shd w:val="clear" w:color="auto" w:fill="FFFFFF"/>
         <w:spacing w:before="60" w:after="100" w:afterAutospacing="1" w:line="240" w:lineRule="auto"/>
         <w:rPr>
-          <w:rFonts w:ascii="Segoe UI" w:eastAsia="Times New Roman" w:hAnsi="Segoe UI" w:cs="Segoe UI"/>
-          <w:color w:val="1F2328"/>
-          <w:kern w:val="0"/>
-          <w:lang w:eastAsia="en-ZA"/>
-          <w14:ligatures w14:val="none"/>
-        </w:rPr>
-      </w:pPr>
-      <w:r>
-        <w:rPr>
-          <w:rFonts w:ascii="Segoe UI" w:eastAsia="Times New Roman" w:hAnsi="Segoe UI" w:cs="Segoe UI"/>
-          <w:color w:val="1F2328"/>
-          <w:kern w:val="0"/>
+          <w:rFonts w:ascii="Arial" w:eastAsia="Times New Roman" w:hAnsi="Arial" w:cs="Arial"/>
+          <w:color w:val="1F2328"/>
+          <w:kern w:val="0"/>
+          <w:sz w:val="28"/>
+          <w:szCs w:val="28"/>
+          <w:lang w:eastAsia="en-ZA"/>
+          <w14:ligatures w14:val="none"/>
+        </w:rPr>
+      </w:pPr>
+      <w:r>
+        <w:rPr>
+          <w:rFonts w:ascii="Arial" w:eastAsia="Times New Roman" w:hAnsi="Arial" w:cs="Arial"/>
+          <w:color w:val="1F2328"/>
+          <w:kern w:val="0"/>
+          <w:sz w:val="28"/>
+          <w:szCs w:val="28"/>
           <w:lang w:eastAsia="en-ZA"/>
           <w14:ligatures w14:val="none"/>
         </w:rPr>
@@ -351,18 +375,22 @@
         <w:shd w:val="clear" w:color="auto" w:fill="FFFFFF"/>
         <w:spacing w:before="60" w:after="100" w:afterAutospacing="1" w:line="240" w:lineRule="auto"/>
         <w:rPr>
-          <w:rFonts w:ascii="Segoe UI" w:eastAsia="Times New Roman" w:hAnsi="Segoe UI" w:cs="Segoe UI"/>
-          <w:color w:val="1F2328"/>
-          <w:kern w:val="0"/>
-          <w:lang w:eastAsia="en-ZA"/>
-          <w14:ligatures w14:val="none"/>
-        </w:rPr>
-      </w:pPr>
-      <w:r>
-        <w:rPr>
-          <w:rFonts w:ascii="Segoe UI" w:eastAsia="Times New Roman" w:hAnsi="Segoe UI" w:cs="Segoe UI"/>
-          <w:color w:val="1F2328"/>
-          <w:kern w:val="0"/>
+          <w:rFonts w:ascii="Arial" w:eastAsia="Times New Roman" w:hAnsi="Arial" w:cs="Arial"/>
+          <w:color w:val="1F2328"/>
+          <w:kern w:val="0"/>
+          <w:sz w:val="28"/>
+          <w:szCs w:val="28"/>
+          <w:lang w:eastAsia="en-ZA"/>
+          <w14:ligatures w14:val="none"/>
+        </w:rPr>
+      </w:pPr>
+      <w:r>
+        <w:rPr>
+          <w:rFonts w:ascii="Arial" w:eastAsia="Times New Roman" w:hAnsi="Arial" w:cs="Arial"/>
+          <w:color w:val="1F2328"/>
+          <w:kern w:val="0"/>
+          <w:sz w:val="28"/>
+          <w:szCs w:val="28"/>
           <w:lang w:eastAsia="en-ZA"/>
           <w14:ligatures w14:val="none"/>
         </w:rPr>
@@ -378,18 +406,22 @@
         <w:shd w:val="clear" w:color="auto" w:fill="FFFFFF"/>
         <w:spacing w:before="60" w:after="100" w:afterAutospacing="1" w:line="240" w:lineRule="auto"/>
         <w:rPr>
-          <w:rFonts w:ascii="Segoe UI" w:eastAsia="Times New Roman" w:hAnsi="Segoe UI" w:cs="Segoe UI"/>
-          <w:color w:val="1F2328"/>
-          <w:kern w:val="0"/>
-          <w:lang w:eastAsia="en-ZA"/>
-          <w14:ligatures w14:val="none"/>
-        </w:rPr>
-      </w:pPr>
-      <w:r>
-        <w:rPr>
-          <w:rFonts w:ascii="Segoe UI" w:eastAsia="Times New Roman" w:hAnsi="Segoe UI" w:cs="Segoe UI"/>
-          <w:color w:val="1F2328"/>
-          <w:kern w:val="0"/>
+          <w:rFonts w:ascii="Arial" w:eastAsia="Times New Roman" w:hAnsi="Arial" w:cs="Arial"/>
+          <w:color w:val="1F2328"/>
+          <w:kern w:val="0"/>
+          <w:sz w:val="28"/>
+          <w:szCs w:val="28"/>
+          <w:lang w:eastAsia="en-ZA"/>
+          <w14:ligatures w14:val="none"/>
+        </w:rPr>
+      </w:pPr>
+      <w:r>
+        <w:rPr>
+          <w:rFonts w:ascii="Arial" w:eastAsia="Times New Roman" w:hAnsi="Arial" w:cs="Arial"/>
+          <w:color w:val="1F2328"/>
+          <w:kern w:val="0"/>
+          <w:sz w:val="28"/>
+          <w:szCs w:val="28"/>
           <w:lang w:eastAsia="en-ZA"/>
           <w14:ligatures w14:val="none"/>
         </w:rPr>
@@ -402,13 +434,13 @@
         <w:spacing w:before="360" w:after="240" w:line="240" w:lineRule="auto"/>
         <w:outlineLvl w:val="1"/>
         <w:rPr>
-          <w:rFonts w:ascii="Segoe UI" w:eastAsia="Times New Roman" w:hAnsi="Segoe UI" w:cs="Segoe UI"/>
+          <w:rFonts w:ascii="Arial" w:eastAsia="Times New Roman" w:hAnsi="Arial" w:cs="Arial"/>
           <w:b/>
           <w:bCs/>
           <w:color w:val="1F2328"/>
           <w:kern w:val="0"/>
-          <w:sz w:val="36"/>
-          <w:szCs w:val="36"/>
+          <w:sz w:val="28"/>
+          <w:szCs w:val="28"/>
           <w:lang w:eastAsia="en-ZA"/>
           <w14:ligatures w14:val="none"/>
         </w:rPr>
@@ -420,8 +452,8 @@
           <w:bCs/>
           <w:color w:val="1F2328"/>
           <w:kern w:val="0"/>
-          <w:sz w:val="36"/>
-          <w:szCs w:val="36"/>
+          <w:sz w:val="28"/>
+          <w:szCs w:val="28"/>
           <w:lang w:eastAsia="en-ZA"/>
           <w14:ligatures w14:val="none"/>
         </w:rPr>
@@ -429,13 +461,13 @@
       </w:r>
       <w:r>
         <w:rPr>
-          <w:rFonts w:ascii="Segoe UI" w:eastAsia="Times New Roman" w:hAnsi="Segoe UI" w:cs="Segoe UI"/>
+          <w:rFonts w:ascii="Arial" w:eastAsia="Times New Roman" w:hAnsi="Arial" w:cs="Arial"/>
           <w:b/>
           <w:bCs/>
           <w:color w:val="1F2328"/>
           <w:kern w:val="0"/>
-          <w:sz w:val="36"/>
-          <w:szCs w:val="36"/>
+          <w:sz w:val="28"/>
+          <w:szCs w:val="28"/>
           <w:lang w:eastAsia="en-ZA"/>
           <w14:ligatures w14:val="none"/>
         </w:rPr>
@@ -448,13 +480,13 @@
         <w:spacing w:before="360" w:after="240" w:line="240" w:lineRule="auto"/>
         <w:outlineLvl w:val="2"/>
         <w:rPr>
-          <w:rFonts w:ascii="Segoe UI" w:eastAsia="Times New Roman" w:hAnsi="Segoe UI" w:cs="Segoe UI"/>
+          <w:rFonts w:ascii="Arial" w:eastAsia="Times New Roman" w:hAnsi="Arial" w:cs="Arial"/>
           <w:b/>
           <w:bCs/>
           <w:color w:val="1F2328"/>
           <w:kern w:val="0"/>
-          <w:sz w:val="30"/>
-          <w:szCs w:val="30"/>
+          <w:sz w:val="28"/>
+          <w:szCs w:val="28"/>
           <w:lang w:eastAsia="en-ZA"/>
           <w14:ligatures w14:val="none"/>
         </w:rPr>
@@ -466,8 +498,8 @@
           <w:bCs/>
           <w:color w:val="1F2328"/>
           <w:kern w:val="0"/>
-          <w:sz w:val="30"/>
-          <w:szCs w:val="30"/>
+          <w:sz w:val="28"/>
+          <w:szCs w:val="28"/>
           <w:lang w:eastAsia="en-ZA"/>
           <w14:ligatures w14:val="none"/>
         </w:rPr>
@@ -476,13 +508,13 @@
       </w:r>
       <w:r>
         <w:rPr>
-          <w:rFonts w:ascii="Segoe UI" w:eastAsia="Times New Roman" w:hAnsi="Segoe UI" w:cs="Segoe UI"/>
+          <w:rFonts w:ascii="Arial" w:eastAsia="Times New Roman" w:hAnsi="Arial" w:cs="Arial"/>
           <w:b/>
           <w:bCs/>
           <w:color w:val="1F2328"/>
           <w:kern w:val="0"/>
-          <w:sz w:val="30"/>
-          <w:szCs w:val="30"/>
+          <w:sz w:val="28"/>
+          <w:szCs w:val="28"/>
           <w:lang w:eastAsia="en-ZA"/>
           <w14:ligatures w14:val="none"/>
         </w:rPr>
@@ -495,8 +527,8 @@
           <w:bCs/>
           <w:color w:val="1F2328"/>
           <w:kern w:val="0"/>
-          <w:sz w:val="30"/>
-          <w:szCs w:val="30"/>
+          <w:sz w:val="28"/>
+          <w:szCs w:val="28"/>
           <w:lang w:eastAsia="en-ZA"/>
           <w14:ligatures w14:val="none"/>
         </w:rPr>
@@ -504,13 +536,13 @@
       </w:r>
       <w:r>
         <w:rPr>
-          <w:rFonts w:ascii="Segoe UI" w:eastAsia="Times New Roman" w:hAnsi="Segoe UI" w:cs="Segoe UI"/>
+          <w:rFonts w:ascii="Arial" w:eastAsia="Times New Roman" w:hAnsi="Arial" w:cs="Arial"/>
           <w:b/>
           <w:bCs/>
           <w:color w:val="1F2328"/>
           <w:kern w:val="0"/>
-          <w:sz w:val="30"/>
-          <w:szCs w:val="30"/>
+          <w:sz w:val="28"/>
+          <w:szCs w:val="28"/>
           <w:lang w:eastAsia="en-ZA"/>
           <w14:ligatures w14:val="none"/>
         </w:rPr>
@@ -526,18 +558,22 @@
         <w:shd w:val="clear" w:color="auto" w:fill="FFFFFF"/>
         <w:spacing w:before="100" w:beforeAutospacing="1" w:after="100" w:afterAutospacing="1" w:line="240" w:lineRule="auto"/>
         <w:rPr>
-          <w:rFonts w:ascii="Segoe UI" w:eastAsia="Times New Roman" w:hAnsi="Segoe UI" w:cs="Segoe UI"/>
-          <w:color w:val="1F2328"/>
-          <w:kern w:val="0"/>
-          <w:lang w:eastAsia="en-ZA"/>
-          <w14:ligatures w14:val="none"/>
-        </w:rPr>
-      </w:pPr>
-      <w:r>
-        <w:rPr>
-          <w:rFonts w:ascii="Segoe UI" w:eastAsia="Times New Roman" w:hAnsi="Segoe UI" w:cs="Segoe UI"/>
-          <w:color w:val="1F2328"/>
-          <w:kern w:val="0"/>
+          <w:rFonts w:ascii="Arial" w:eastAsia="Times New Roman" w:hAnsi="Arial" w:cs="Arial"/>
+          <w:color w:val="1F2328"/>
+          <w:kern w:val="0"/>
+          <w:sz w:val="28"/>
+          <w:szCs w:val="28"/>
+          <w:lang w:eastAsia="en-ZA"/>
+          <w14:ligatures w14:val="none"/>
+        </w:rPr>
+      </w:pPr>
+      <w:r>
+        <w:rPr>
+          <w:rFonts w:ascii="Arial" w:eastAsia="Times New Roman" w:hAnsi="Arial" w:cs="Arial"/>
+          <w:color w:val="1F2328"/>
+          <w:kern w:val="0"/>
+          <w:sz w:val="28"/>
+          <w:szCs w:val="28"/>
           <w:lang w:eastAsia="en-ZA"/>
           <w14:ligatures w14:val="none"/>
         </w:rPr>
@@ -553,18 +589,22 @@
         <w:shd w:val="clear" w:color="auto" w:fill="FFFFFF"/>
         <w:spacing w:before="60" w:after="100" w:afterAutospacing="1" w:line="240" w:lineRule="auto"/>
         <w:rPr>
-          <w:rFonts w:ascii="Segoe UI" w:eastAsia="Times New Roman" w:hAnsi="Segoe UI" w:cs="Segoe UI"/>
-          <w:color w:val="1F2328"/>
-          <w:kern w:val="0"/>
-          <w:lang w:eastAsia="en-ZA"/>
-          <w14:ligatures w14:val="none"/>
-        </w:rPr>
-      </w:pPr>
-      <w:r>
-        <w:rPr>
-          <w:rFonts w:ascii="Segoe UI" w:eastAsia="Times New Roman" w:hAnsi="Segoe UI" w:cs="Segoe UI"/>
-          <w:color w:val="1F2328"/>
-          <w:kern w:val="0"/>
+          <w:rFonts w:ascii="Arial" w:eastAsia="Times New Roman" w:hAnsi="Arial" w:cs="Arial"/>
+          <w:color w:val="1F2328"/>
+          <w:kern w:val="0"/>
+          <w:sz w:val="28"/>
+          <w:szCs w:val="28"/>
+          <w:lang w:eastAsia="en-ZA"/>
+          <w14:ligatures w14:val="none"/>
+        </w:rPr>
+      </w:pPr>
+      <w:r>
+        <w:rPr>
+          <w:rFonts w:ascii="Arial" w:eastAsia="Times New Roman" w:hAnsi="Arial" w:cs="Arial"/>
+          <w:color w:val="1F2328"/>
+          <w:kern w:val="0"/>
+          <w:sz w:val="28"/>
+          <w:szCs w:val="28"/>
           <w:lang w:eastAsia="en-ZA"/>
           <w14:ligatures w14:val="none"/>
         </w:rPr>
@@ -576,19 +616,23 @@
         <w:shd w:val="clear" w:color="auto" w:fill="FFFFFF"/>
         <w:spacing w:after="240" w:line="240" w:lineRule="auto"/>
         <w:rPr>
-          <w:rFonts w:ascii="Segoe UI" w:eastAsia="Times New Roman" w:hAnsi="Segoe UI" w:cs="Segoe UI"/>
-          <w:color w:val="1F2328"/>
-          <w:kern w:val="0"/>
-          <w:lang w:eastAsia="en-ZA"/>
-          <w14:ligatures w14:val="none"/>
-        </w:rPr>
-      </w:pPr>
-      <w:r>
-        <w:rPr>
-          <w:rFonts w:ascii="Segoe UI" w:eastAsia="Times New Roman" w:hAnsi="Segoe UI" w:cs="Segoe UI"/>
+          <w:rFonts w:ascii="Arial" w:eastAsia="Times New Roman" w:hAnsi="Arial" w:cs="Arial"/>
+          <w:color w:val="1F2328"/>
+          <w:kern w:val="0"/>
+          <w:sz w:val="28"/>
+          <w:szCs w:val="28"/>
+          <w:lang w:eastAsia="en-ZA"/>
+          <w14:ligatures w14:val="none"/>
+        </w:rPr>
+      </w:pPr>
+      <w:r>
+        <w:rPr>
+          <w:rFonts w:ascii="Arial" w:eastAsia="Times New Roman" w:hAnsi="Arial" w:cs="Arial"/>
           <w:noProof/>
           <w:color w:val="0969DA"/>
           <w:kern w:val="0"/>
+          <w:sz w:val="28"/>
+          <w:szCs w:val="28"/>
           <w:lang w:eastAsia="en-ZA"/>
           <w14:ligatures w14:val="none"/>
         </w:rPr>
@@ -651,9 +695,11 @@
         <w:shd w:val="clear" w:color="auto" w:fill="FFFFFF"/>
         <w:spacing w:after="240" w:line="240" w:lineRule="auto"/>
         <w:rPr>
-          <w:rFonts w:ascii="Segoe UI" w:eastAsia="Times New Roman" w:hAnsi="Segoe UI" w:cs="Segoe UI"/>
-          <w:color w:val="1F2328"/>
-          <w:kern w:val="0"/>
+          <w:rFonts w:ascii="Arial" w:eastAsia="Times New Roman" w:hAnsi="Arial" w:cs="Arial"/>
+          <w:color w:val="1F2328"/>
+          <w:kern w:val="0"/>
+          <w:sz w:val="28"/>
+          <w:szCs w:val="28"/>
           <w:lang w:eastAsia="en-ZA"/>
           <w14:ligatures w14:val="none"/>
         </w:rPr>
@@ -664,9 +710,11 @@
         <w:shd w:val="clear" w:color="auto" w:fill="FFFFFF"/>
         <w:spacing w:after="240" w:line="240" w:lineRule="auto"/>
         <w:rPr>
-          <w:rFonts w:ascii="Segoe UI" w:eastAsia="Times New Roman" w:hAnsi="Segoe UI" w:cs="Segoe UI"/>
-          <w:color w:val="1F2328"/>
-          <w:kern w:val="0"/>
+          <w:rFonts w:ascii="Arial" w:eastAsia="Times New Roman" w:hAnsi="Arial" w:cs="Arial"/>
+          <w:color w:val="1F2328"/>
+          <w:kern w:val="0"/>
+          <w:sz w:val="28"/>
+          <w:szCs w:val="28"/>
           <w:lang w:eastAsia="en-ZA"/>
           <w14:ligatures w14:val="none"/>
         </w:rPr>
@@ -677,9 +725,11 @@
         <w:shd w:val="clear" w:color="auto" w:fill="FFFFFF"/>
         <w:spacing w:after="240" w:line="240" w:lineRule="auto"/>
         <w:rPr>
-          <w:rFonts w:ascii="Segoe UI" w:eastAsia="Times New Roman" w:hAnsi="Segoe UI" w:cs="Segoe UI"/>
-          <w:color w:val="1F2328"/>
-          <w:kern w:val="0"/>
+          <w:rFonts w:ascii="Arial" w:eastAsia="Times New Roman" w:hAnsi="Arial" w:cs="Arial"/>
+          <w:color w:val="1F2328"/>
+          <w:kern w:val="0"/>
+          <w:sz w:val="28"/>
+          <w:szCs w:val="28"/>
           <w:lang w:eastAsia="en-ZA"/>
           <w14:ligatures w14:val="none"/>
         </w:rPr>
@@ -690,9 +740,11 @@
         <w:shd w:val="clear" w:color="auto" w:fill="FFFFFF"/>
         <w:spacing w:after="240" w:line="240" w:lineRule="auto"/>
         <w:rPr>
-          <w:rFonts w:ascii="Segoe UI" w:eastAsia="Times New Roman" w:hAnsi="Segoe UI" w:cs="Segoe UI"/>
-          <w:color w:val="1F2328"/>
-          <w:kern w:val="0"/>
+          <w:rFonts w:ascii="Arial" w:eastAsia="Times New Roman" w:hAnsi="Arial" w:cs="Arial"/>
+          <w:color w:val="1F2328"/>
+          <w:kern w:val="0"/>
+          <w:sz w:val="28"/>
+          <w:szCs w:val="28"/>
           <w:lang w:eastAsia="en-ZA"/>
           <w14:ligatures w14:val="none"/>
         </w:rPr>
@@ -703,9 +755,11 @@
         <w:shd w:val="clear" w:color="auto" w:fill="FFFFFF"/>
         <w:spacing w:after="240" w:line="240" w:lineRule="auto"/>
         <w:rPr>
-          <w:rFonts w:ascii="Segoe UI" w:eastAsia="Times New Roman" w:hAnsi="Segoe UI" w:cs="Segoe UI"/>
-          <w:color w:val="1F2328"/>
-          <w:kern w:val="0"/>
+          <w:rFonts w:ascii="Arial" w:eastAsia="Times New Roman" w:hAnsi="Arial" w:cs="Arial"/>
+          <w:color w:val="1F2328"/>
+          <w:kern w:val="0"/>
+          <w:sz w:val="28"/>
+          <w:szCs w:val="28"/>
           <w:lang w:eastAsia="en-ZA"/>
           <w14:ligatures w14:val="none"/>
         </w:rPr>
@@ -716,9 +770,11 @@
         <w:shd w:val="clear" w:color="auto" w:fill="FFFFFF"/>
         <w:spacing w:after="240" w:line="240" w:lineRule="auto"/>
         <w:rPr>
-          <w:rFonts w:ascii="Segoe UI" w:eastAsia="Times New Roman" w:hAnsi="Segoe UI" w:cs="Segoe UI"/>
-          <w:color w:val="1F2328"/>
-          <w:kern w:val="0"/>
+          <w:rFonts w:ascii="Arial" w:eastAsia="Times New Roman" w:hAnsi="Arial" w:cs="Arial"/>
+          <w:color w:val="1F2328"/>
+          <w:kern w:val="0"/>
+          <w:sz w:val="28"/>
+          <w:szCs w:val="28"/>
           <w:lang w:eastAsia="en-ZA"/>
           <w14:ligatures w14:val="none"/>
         </w:rPr>
@@ -729,9 +785,11 @@
         <w:shd w:val="clear" w:color="auto" w:fill="FFFFFF"/>
         <w:spacing w:after="240" w:line="240" w:lineRule="auto"/>
         <w:rPr>
-          <w:rFonts w:ascii="Segoe UI" w:eastAsia="Times New Roman" w:hAnsi="Segoe UI" w:cs="Segoe UI"/>
-          <w:color w:val="1F2328"/>
-          <w:kern w:val="0"/>
+          <w:rFonts w:ascii="Arial" w:eastAsia="Times New Roman" w:hAnsi="Arial" w:cs="Arial"/>
+          <w:color w:val="1F2328"/>
+          <w:kern w:val="0"/>
+          <w:sz w:val="28"/>
+          <w:szCs w:val="28"/>
           <w:lang w:eastAsia="en-ZA"/>
           <w14:ligatures w14:val="none"/>
         </w:rPr>
@@ -742,9 +800,11 @@
         <w:shd w:val="clear" w:color="auto" w:fill="FFFFFF"/>
         <w:spacing w:after="240" w:line="240" w:lineRule="auto"/>
         <w:rPr>
-          <w:rFonts w:ascii="Segoe UI" w:eastAsia="Times New Roman" w:hAnsi="Segoe UI" w:cs="Segoe UI"/>
-          <w:color w:val="1F2328"/>
-          <w:kern w:val="0"/>
+          <w:rFonts w:ascii="Arial" w:eastAsia="Times New Roman" w:hAnsi="Arial" w:cs="Arial"/>
+          <w:color w:val="1F2328"/>
+          <w:kern w:val="0"/>
+          <w:sz w:val="28"/>
+          <w:szCs w:val="28"/>
           <w:lang w:eastAsia="en-ZA"/>
           <w14:ligatures w14:val="none"/>
         </w:rPr>
@@ -755,9 +815,11 @@
         <w:shd w:val="clear" w:color="auto" w:fill="FFFFFF"/>
         <w:spacing w:after="240" w:line="240" w:lineRule="auto"/>
         <w:rPr>
-          <w:rFonts w:ascii="Segoe UI" w:eastAsia="Times New Roman" w:hAnsi="Segoe UI" w:cs="Segoe UI"/>
-          <w:color w:val="1F2328"/>
-          <w:kern w:val="0"/>
+          <w:rFonts w:ascii="Arial" w:eastAsia="Times New Roman" w:hAnsi="Arial" w:cs="Arial"/>
+          <w:color w:val="1F2328"/>
+          <w:kern w:val="0"/>
+          <w:sz w:val="28"/>
+          <w:szCs w:val="28"/>
           <w:lang w:eastAsia="en-ZA"/>
           <w14:ligatures w14:val="none"/>
         </w:rPr>
@@ -769,13 +831,13 @@
         <w:spacing w:before="360" w:after="240" w:line="240" w:lineRule="auto"/>
         <w:outlineLvl w:val="2"/>
         <w:rPr>
-          <w:rFonts w:ascii="Segoe UI" w:eastAsia="Times New Roman" w:hAnsi="Segoe UI" w:cs="Segoe UI"/>
+          <w:rFonts w:ascii="Arial" w:eastAsia="Times New Roman" w:hAnsi="Arial" w:cs="Arial"/>
           <w:b/>
           <w:bCs/>
           <w:color w:val="1F2328"/>
           <w:kern w:val="0"/>
-          <w:sz w:val="30"/>
-          <w:szCs w:val="30"/>
+          <w:sz w:val="28"/>
+          <w:szCs w:val="28"/>
           <w:lang w:eastAsia="en-ZA"/>
           <w14:ligatures w14:val="none"/>
         </w:rPr>
@@ -787,23 +849,22 @@
           <w:bCs/>
           <w:color w:val="1F2328"/>
           <w:kern w:val="0"/>
-          <w:sz w:val="30"/>
-          <w:szCs w:val="30"/>
-          <w:lang w:eastAsia="en-ZA"/>
-          <w14:ligatures w14:val="none"/>
-        </w:rPr>
-        <w:lastRenderedPageBreak/>
+          <w:sz w:val="28"/>
+          <w:szCs w:val="28"/>
+          <w:lang w:eastAsia="en-ZA"/>
+          <w14:ligatures w14:val="none"/>
+        </w:rPr>
         <w:t>❓</w:t>
       </w:r>
       <w:r>
         <w:rPr>
-          <w:rFonts w:ascii="Segoe UI" w:eastAsia="Times New Roman" w:hAnsi="Segoe UI" w:cs="Segoe UI"/>
+          <w:rFonts w:ascii="Arial" w:eastAsia="Times New Roman" w:hAnsi="Arial" w:cs="Arial"/>
           <w:b/>
           <w:bCs/>
           <w:color w:val="1F2328"/>
           <w:kern w:val="0"/>
-          <w:sz w:val="30"/>
-          <w:szCs w:val="30"/>
+          <w:sz w:val="28"/>
+          <w:szCs w:val="28"/>
           <w:lang w:eastAsia="en-ZA"/>
           <w14:ligatures w14:val="none"/>
         </w:rPr>
@@ -816,13 +877,13 @@
         <w:spacing w:before="360" w:after="240" w:line="240" w:lineRule="auto"/>
         <w:outlineLvl w:val="2"/>
         <w:rPr>
-          <w:rFonts w:ascii="Segoe UI" w:eastAsia="Times New Roman" w:hAnsi="Segoe UI" w:cs="Segoe UI"/>
+          <w:rFonts w:ascii="Arial" w:eastAsia="Times New Roman" w:hAnsi="Arial" w:cs="Arial"/>
           <w:b/>
           <w:bCs/>
           <w:color w:val="1F2328"/>
           <w:kern w:val="0"/>
-          <w:sz w:val="30"/>
-          <w:szCs w:val="30"/>
+          <w:sz w:val="28"/>
+          <w:szCs w:val="28"/>
           <w:lang w:eastAsia="en-ZA"/>
           <w14:ligatures w14:val="none"/>
         </w:rPr>
@@ -833,19 +894,23 @@
         <w:shd w:val="clear" w:color="auto" w:fill="FFFFFF"/>
         <w:spacing w:after="240" w:line="240" w:lineRule="auto"/>
         <w:rPr>
-          <w:rFonts w:ascii="Segoe UI" w:eastAsia="Times New Roman" w:hAnsi="Segoe UI" w:cs="Segoe UI"/>
-          <w:color w:val="1F2328"/>
-          <w:kern w:val="0"/>
-          <w:lang w:eastAsia="en-ZA"/>
-          <w14:ligatures w14:val="none"/>
-        </w:rPr>
-      </w:pPr>
-      <w:r>
-        <w:rPr>
-          <w:rFonts w:ascii="Segoe UI" w:eastAsia="Times New Roman" w:hAnsi="Segoe UI" w:cs="Segoe UI"/>
+          <w:rFonts w:ascii="Arial" w:eastAsia="Times New Roman" w:hAnsi="Arial" w:cs="Arial"/>
+          <w:color w:val="1F2328"/>
+          <w:kern w:val="0"/>
+          <w:sz w:val="28"/>
+          <w:szCs w:val="28"/>
+          <w:lang w:eastAsia="en-ZA"/>
+          <w14:ligatures w14:val="none"/>
+        </w:rPr>
+      </w:pPr>
+      <w:r>
+        <w:rPr>
+          <w:rFonts w:ascii="Arial" w:eastAsia="Times New Roman" w:hAnsi="Arial" w:cs="Arial"/>
           <w:noProof/>
           <w:color w:val="0969DA"/>
           <w:kern w:val="0"/>
+          <w:sz w:val="28"/>
+          <w:szCs w:val="28"/>
           <w:lang w:eastAsia="en-ZA"/>
           <w14:ligatures w14:val="none"/>
         </w:rPr>
@@ -912,9 +977,11 @@
         <w:shd w:val="clear" w:color="auto" w:fill="FFFFFF"/>
         <w:spacing w:before="240" w:after="240" w:line="240" w:lineRule="auto"/>
         <w:rPr>
-          <w:rFonts w:ascii="Segoe UI" w:eastAsia="Times New Roman" w:hAnsi="Segoe UI" w:cs="Segoe UI"/>
-          <w:color w:val="1F2328"/>
-          <w:kern w:val="0"/>
+          <w:rFonts w:ascii="Arial" w:eastAsia="Times New Roman" w:hAnsi="Arial" w:cs="Arial"/>
+          <w:color w:val="1F2328"/>
+          <w:kern w:val="0"/>
+          <w:sz w:val="28"/>
+          <w:szCs w:val="28"/>
           <w:lang w:eastAsia="en-ZA"/>
           <w14:ligatures w14:val="none"/>
         </w:rPr>
@@ -922,9 +989,11 @@
       <w:proofErr w:type="spellStart"/>
       <w:r>
         <w:rPr>
-          <w:rFonts w:ascii="Segoe UI" w:eastAsia="Times New Roman" w:hAnsi="Segoe UI" w:cs="Segoe UI"/>
-          <w:color w:val="1F2328"/>
-          <w:kern w:val="0"/>
+          <w:rFonts w:ascii="Arial" w:eastAsia="Times New Roman" w:hAnsi="Arial" w:cs="Arial"/>
+          <w:color w:val="1F2328"/>
+          <w:kern w:val="0"/>
+          <w:sz w:val="28"/>
+          <w:szCs w:val="28"/>
           <w:lang w:eastAsia="en-ZA"/>
           <w14:ligatures w14:val="none"/>
         </w:rPr>
@@ -933,9 +1002,11 @@
       <w:proofErr w:type="spellEnd"/>
       <w:r>
         <w:rPr>
-          <w:rFonts w:ascii="Segoe UI" w:eastAsia="Times New Roman" w:hAnsi="Segoe UI" w:cs="Segoe UI"/>
-          <w:color w:val="1F2328"/>
-          <w:kern w:val="0"/>
+          <w:rFonts w:ascii="Arial" w:eastAsia="Times New Roman" w:hAnsi="Arial" w:cs="Arial"/>
+          <w:color w:val="1F2328"/>
+          <w:kern w:val="0"/>
+          <w:sz w:val="28"/>
+          <w:szCs w:val="28"/>
           <w:lang w:eastAsia="en-ZA"/>
           <w14:ligatures w14:val="none"/>
         </w:rPr>
@@ -951,18 +1022,22 @@
         <w:shd w:val="clear" w:color="auto" w:fill="FFFFFF"/>
         <w:spacing w:before="240" w:after="240" w:line="240" w:lineRule="auto"/>
         <w:rPr>
-          <w:rFonts w:ascii="Segoe UI" w:eastAsia="Times New Roman" w:hAnsi="Segoe UI" w:cs="Segoe UI"/>
-          <w:color w:val="1F2328"/>
-          <w:kern w:val="0"/>
-          <w:lang w:eastAsia="en-ZA"/>
-          <w14:ligatures w14:val="none"/>
-        </w:rPr>
-      </w:pPr>
-      <w:r>
-        <w:rPr>
-          <w:rFonts w:ascii="Segoe UI" w:eastAsia="Times New Roman" w:hAnsi="Segoe UI" w:cs="Segoe UI"/>
-          <w:color w:val="1F2328"/>
-          <w:kern w:val="0"/>
+          <w:rFonts w:ascii="Arial" w:eastAsia="Times New Roman" w:hAnsi="Arial" w:cs="Arial"/>
+          <w:color w:val="1F2328"/>
+          <w:kern w:val="0"/>
+          <w:sz w:val="28"/>
+          <w:szCs w:val="28"/>
+          <w:lang w:eastAsia="en-ZA"/>
+          <w14:ligatures w14:val="none"/>
+        </w:rPr>
+      </w:pPr>
+      <w:r>
+        <w:rPr>
+          <w:rFonts w:ascii="Arial" w:eastAsia="Times New Roman" w:hAnsi="Arial" w:cs="Arial"/>
+          <w:color w:val="1F2328"/>
+          <w:kern w:val="0"/>
+          <w:sz w:val="28"/>
+          <w:szCs w:val="28"/>
           <w:lang w:eastAsia="en-ZA"/>
           <w14:ligatures w14:val="none"/>
         </w:rPr>
@@ -978,18 +1053,22 @@
         <w:shd w:val="clear" w:color="auto" w:fill="FFFFFF"/>
         <w:spacing w:before="100" w:beforeAutospacing="1" w:after="100" w:afterAutospacing="1" w:line="240" w:lineRule="auto"/>
         <w:rPr>
-          <w:rFonts w:ascii="Segoe UI" w:eastAsia="Times New Roman" w:hAnsi="Segoe UI" w:cs="Segoe UI"/>
-          <w:color w:val="1F2328"/>
-          <w:kern w:val="0"/>
-          <w:lang w:eastAsia="en-ZA"/>
-          <w14:ligatures w14:val="none"/>
-        </w:rPr>
-      </w:pPr>
-      <w:r>
-        <w:rPr>
-          <w:rFonts w:ascii="Segoe UI" w:eastAsia="Times New Roman" w:hAnsi="Segoe UI" w:cs="Segoe UI"/>
-          <w:color w:val="1F2328"/>
-          <w:kern w:val="0"/>
+          <w:rFonts w:ascii="Arial" w:eastAsia="Times New Roman" w:hAnsi="Arial" w:cs="Arial"/>
+          <w:color w:val="1F2328"/>
+          <w:kern w:val="0"/>
+          <w:sz w:val="28"/>
+          <w:szCs w:val="28"/>
+          <w:lang w:eastAsia="en-ZA"/>
+          <w14:ligatures w14:val="none"/>
+        </w:rPr>
+      </w:pPr>
+      <w:r>
+        <w:rPr>
+          <w:rFonts w:ascii="Arial" w:eastAsia="Times New Roman" w:hAnsi="Arial" w:cs="Arial"/>
+          <w:color w:val="1F2328"/>
+          <w:kern w:val="0"/>
+          <w:sz w:val="28"/>
+          <w:szCs w:val="28"/>
           <w:lang w:eastAsia="en-ZA"/>
           <w14:ligatures w14:val="none"/>
         </w:rPr>
@@ -1005,18 +1084,22 @@
         <w:shd w:val="clear" w:color="auto" w:fill="FFFFFF"/>
         <w:spacing w:before="60" w:after="100" w:afterAutospacing="1" w:line="240" w:lineRule="auto"/>
         <w:rPr>
-          <w:rFonts w:ascii="Segoe UI" w:eastAsia="Times New Roman" w:hAnsi="Segoe UI" w:cs="Segoe UI"/>
-          <w:color w:val="1F2328"/>
-          <w:kern w:val="0"/>
-          <w:lang w:eastAsia="en-ZA"/>
-          <w14:ligatures w14:val="none"/>
-        </w:rPr>
-      </w:pPr>
-      <w:r>
-        <w:rPr>
-          <w:rFonts w:ascii="Segoe UI" w:eastAsia="Times New Roman" w:hAnsi="Segoe UI" w:cs="Segoe UI"/>
-          <w:color w:val="1F2328"/>
-          <w:kern w:val="0"/>
+          <w:rFonts w:ascii="Arial" w:eastAsia="Times New Roman" w:hAnsi="Arial" w:cs="Arial"/>
+          <w:color w:val="1F2328"/>
+          <w:kern w:val="0"/>
+          <w:sz w:val="28"/>
+          <w:szCs w:val="28"/>
+          <w:lang w:eastAsia="en-ZA"/>
+          <w14:ligatures w14:val="none"/>
+        </w:rPr>
+      </w:pPr>
+      <w:r>
+        <w:rPr>
+          <w:rFonts w:ascii="Arial" w:eastAsia="Times New Roman" w:hAnsi="Arial" w:cs="Arial"/>
+          <w:color w:val="1F2328"/>
+          <w:kern w:val="0"/>
+          <w:sz w:val="28"/>
+          <w:szCs w:val="28"/>
           <w:lang w:eastAsia="en-ZA"/>
           <w14:ligatures w14:val="none"/>
         </w:rPr>
@@ -1032,9 +1115,11 @@
         <w:shd w:val="clear" w:color="auto" w:fill="FFFFFF"/>
         <w:spacing w:before="60" w:after="100" w:afterAutospacing="1" w:line="240" w:lineRule="auto"/>
         <w:rPr>
-          <w:rFonts w:ascii="Segoe UI" w:eastAsia="Times New Roman" w:hAnsi="Segoe UI" w:cs="Segoe UI"/>
-          <w:color w:val="1F2328"/>
-          <w:kern w:val="0"/>
+          <w:rFonts w:ascii="Arial" w:eastAsia="Times New Roman" w:hAnsi="Arial" w:cs="Arial"/>
+          <w:color w:val="1F2328"/>
+          <w:kern w:val="0"/>
+          <w:sz w:val="28"/>
+          <w:szCs w:val="28"/>
           <w:lang w:eastAsia="en-ZA"/>
           <w14:ligatures w14:val="none"/>
         </w:rPr>
@@ -1044,6 +1129,8 @@
           <w:rFonts w:ascii="Segoe UI Emoji" w:eastAsia="Times New Roman" w:hAnsi="Segoe UI Emoji" w:cs="Segoe UI Emoji"/>
           <w:color w:val="1F2328"/>
           <w:kern w:val="0"/>
+          <w:sz w:val="28"/>
+          <w:szCs w:val="28"/>
           <w:lang w:eastAsia="en-ZA"/>
           <w14:ligatures w14:val="none"/>
         </w:rPr>
@@ -1051,9 +1138,11 @@
       </w:r>
       <w:r>
         <w:rPr>
-          <w:rFonts w:ascii="Segoe UI" w:eastAsia="Times New Roman" w:hAnsi="Segoe UI" w:cs="Segoe UI"/>
-          <w:color w:val="1F2328"/>
-          <w:kern w:val="0"/>
+          <w:rFonts w:ascii="Arial" w:eastAsia="Times New Roman" w:hAnsi="Arial" w:cs="Arial"/>
+          <w:color w:val="1F2328"/>
+          <w:kern w:val="0"/>
+          <w:sz w:val="28"/>
+          <w:szCs w:val="28"/>
           <w:lang w:eastAsia="en-ZA"/>
           <w14:ligatures w14:val="none"/>
         </w:rPr>
@@ -1066,19 +1155,23 @@
         <w:spacing w:before="240" w:after="240" w:line="240" w:lineRule="auto"/>
         <w:ind w:left="720"/>
         <w:rPr>
-          <w:rFonts w:ascii="Segoe UI" w:eastAsia="Times New Roman" w:hAnsi="Segoe UI" w:cs="Segoe UI"/>
-          <w:color w:val="1F2328"/>
-          <w:kern w:val="0"/>
-          <w:lang w:eastAsia="en-ZA"/>
-          <w14:ligatures w14:val="none"/>
-        </w:rPr>
-      </w:pPr>
-      <w:r>
-        <w:rPr>
-          <w:rFonts w:ascii="Segoe UI" w:eastAsia="Times New Roman" w:hAnsi="Segoe UI" w:cs="Segoe UI"/>
+          <w:rFonts w:ascii="Arial" w:eastAsia="Times New Roman" w:hAnsi="Arial" w:cs="Arial"/>
+          <w:color w:val="1F2328"/>
+          <w:kern w:val="0"/>
+          <w:sz w:val="28"/>
+          <w:szCs w:val="28"/>
+          <w:lang w:eastAsia="en-ZA"/>
+          <w14:ligatures w14:val="none"/>
+        </w:rPr>
+      </w:pPr>
+      <w:r>
+        <w:rPr>
+          <w:rFonts w:ascii="Arial" w:eastAsia="Times New Roman" w:hAnsi="Arial" w:cs="Arial"/>
           <w:noProof/>
           <w:color w:val="0969DA"/>
           <w:kern w:val="0"/>
+          <w:sz w:val="28"/>
+          <w:szCs w:val="28"/>
           <w:lang w:eastAsia="en-ZA"/>
           <w14:ligatures w14:val="none"/>
         </w:rPr>
@@ -1145,9 +1238,11 @@
         <w:shd w:val="clear" w:color="auto" w:fill="FFFFFF"/>
         <w:spacing w:before="100" w:beforeAutospacing="1" w:after="100" w:afterAutospacing="1" w:line="240" w:lineRule="auto"/>
         <w:rPr>
-          <w:rFonts w:ascii="Segoe UI" w:eastAsia="Times New Roman" w:hAnsi="Segoe UI" w:cs="Segoe UI"/>
-          <w:color w:val="1F2328"/>
-          <w:kern w:val="0"/>
+          <w:rFonts w:ascii="Arial" w:eastAsia="Times New Roman" w:hAnsi="Arial" w:cs="Arial"/>
+          <w:color w:val="1F2328"/>
+          <w:kern w:val="0"/>
+          <w:sz w:val="28"/>
+          <w:szCs w:val="28"/>
           <w:lang w:eastAsia="en-ZA"/>
           <w14:ligatures w14:val="none"/>
         </w:rPr>
@@ -1157,6 +1252,8 @@
           <w:rFonts w:ascii="Segoe UI Emoji" w:eastAsia="Times New Roman" w:hAnsi="Segoe UI Emoji" w:cs="Segoe UI Emoji"/>
           <w:color w:val="1F2328"/>
           <w:kern w:val="0"/>
+          <w:sz w:val="28"/>
+          <w:szCs w:val="28"/>
           <w:lang w:eastAsia="en-ZA"/>
           <w14:ligatures w14:val="none"/>
         </w:rPr>
@@ -1164,9 +1261,11 @@
       </w:r>
       <w:r>
         <w:rPr>
-          <w:rFonts w:ascii="Segoe UI" w:eastAsia="Times New Roman" w:hAnsi="Segoe UI" w:cs="Segoe UI"/>
-          <w:color w:val="1F2328"/>
-          <w:kern w:val="0"/>
+          <w:rFonts w:ascii="Arial" w:eastAsia="Times New Roman" w:hAnsi="Arial" w:cs="Arial"/>
+          <w:color w:val="1F2328"/>
+          <w:kern w:val="0"/>
+          <w:sz w:val="28"/>
+          <w:szCs w:val="28"/>
           <w:lang w:eastAsia="en-ZA"/>
           <w14:ligatures w14:val="none"/>
         </w:rPr>
@@ -1178,19 +1277,23 @@
         <w:shd w:val="clear" w:color="auto" w:fill="FFFFFF"/>
         <w:spacing w:after="240" w:line="240" w:lineRule="auto"/>
         <w:rPr>
-          <w:rFonts w:ascii="Segoe UI" w:eastAsia="Times New Roman" w:hAnsi="Segoe UI" w:cs="Segoe UI"/>
-          <w:color w:val="1F2328"/>
-          <w:kern w:val="0"/>
-          <w:lang w:eastAsia="en-ZA"/>
-          <w14:ligatures w14:val="none"/>
-        </w:rPr>
-      </w:pPr>
-      <w:r>
-        <w:rPr>
-          <w:rFonts w:ascii="Segoe UI" w:eastAsia="Times New Roman" w:hAnsi="Segoe UI" w:cs="Segoe UI"/>
+          <w:rFonts w:ascii="Arial" w:eastAsia="Times New Roman" w:hAnsi="Arial" w:cs="Arial"/>
+          <w:color w:val="1F2328"/>
+          <w:kern w:val="0"/>
+          <w:sz w:val="28"/>
+          <w:szCs w:val="28"/>
+          <w:lang w:eastAsia="en-ZA"/>
+          <w14:ligatures w14:val="none"/>
+        </w:rPr>
+      </w:pPr>
+      <w:r>
+        <w:rPr>
+          <w:rFonts w:ascii="Arial" w:eastAsia="Times New Roman" w:hAnsi="Arial" w:cs="Arial"/>
           <w:noProof/>
           <w:color w:val="0969DA"/>
           <w:kern w:val="0"/>
+          <w:sz w:val="28"/>
+          <w:szCs w:val="28"/>
           <w:lang w:eastAsia="en-ZA"/>
           <w14:ligatures w14:val="none"/>
         </w:rPr>
@@ -1254,18 +1357,22 @@
         <w:shd w:val="clear" w:color="auto" w:fill="FFFFFF"/>
         <w:spacing w:after="240" w:line="240" w:lineRule="auto"/>
         <w:rPr>
-          <w:rFonts w:ascii="Segoe UI" w:eastAsia="Times New Roman" w:hAnsi="Segoe UI" w:cs="Segoe UI"/>
-          <w:color w:val="1F2328"/>
-          <w:kern w:val="0"/>
-          <w:lang w:eastAsia="en-ZA"/>
-          <w14:ligatures w14:val="none"/>
-        </w:rPr>
-      </w:pPr>
-      <w:r>
-        <w:rPr>
-          <w:rFonts w:ascii="Segoe UI" w:eastAsia="Times New Roman" w:hAnsi="Segoe UI" w:cs="Segoe UI"/>
-          <w:color w:val="1F2328"/>
-          <w:kern w:val="0"/>
+          <w:rFonts w:ascii="Arial" w:eastAsia="Times New Roman" w:hAnsi="Arial" w:cs="Arial"/>
+          <w:color w:val="1F2328"/>
+          <w:kern w:val="0"/>
+          <w:sz w:val="28"/>
+          <w:szCs w:val="28"/>
+          <w:lang w:eastAsia="en-ZA"/>
+          <w14:ligatures w14:val="none"/>
+        </w:rPr>
+      </w:pPr>
+      <w:r>
+        <w:rPr>
+          <w:rFonts w:ascii="Arial" w:eastAsia="Times New Roman" w:hAnsi="Arial" w:cs="Arial"/>
+          <w:color w:val="1F2328"/>
+          <w:kern w:val="0"/>
+          <w:sz w:val="28"/>
+          <w:szCs w:val="28"/>
           <w:lang w:eastAsia="en-ZA"/>
           <w14:ligatures w14:val="none"/>
         </w:rPr>
@@ -1278,13 +1385,13 @@
         <w:spacing w:before="360" w:after="240" w:line="240" w:lineRule="auto"/>
         <w:outlineLvl w:val="2"/>
         <w:rPr>
-          <w:rFonts w:ascii="Segoe UI" w:eastAsia="Times New Roman" w:hAnsi="Segoe UI" w:cs="Segoe UI"/>
+          <w:rFonts w:ascii="Arial" w:eastAsia="Times New Roman" w:hAnsi="Arial" w:cs="Arial"/>
           <w:b/>
           <w:bCs/>
           <w:color w:val="1F2328"/>
           <w:kern w:val="0"/>
-          <w:sz w:val="30"/>
-          <w:szCs w:val="30"/>
+          <w:sz w:val="28"/>
+          <w:szCs w:val="28"/>
           <w:lang w:eastAsia="en-ZA"/>
           <w14:ligatures w14:val="none"/>
         </w:rPr>
@@ -1296,8 +1403,8 @@
           <w:bCs/>
           <w:color w:val="1F2328"/>
           <w:kern w:val="0"/>
-          <w:sz w:val="30"/>
-          <w:szCs w:val="30"/>
+          <w:sz w:val="28"/>
+          <w:szCs w:val="28"/>
           <w:lang w:eastAsia="en-ZA"/>
           <w14:ligatures w14:val="none"/>
         </w:rPr>
@@ -1305,13 +1412,13 @@
       </w:r>
       <w:r>
         <w:rPr>
-          <w:rFonts w:ascii="Segoe UI" w:eastAsia="Times New Roman" w:hAnsi="Segoe UI" w:cs="Segoe UI"/>
+          <w:rFonts w:ascii="Arial" w:eastAsia="Times New Roman" w:hAnsi="Arial" w:cs="Arial"/>
           <w:b/>
           <w:bCs/>
           <w:color w:val="1F2328"/>
           <w:kern w:val="0"/>
-          <w:sz w:val="30"/>
-          <w:szCs w:val="30"/>
+          <w:sz w:val="28"/>
+          <w:szCs w:val="28"/>
           <w:lang w:eastAsia="en-ZA"/>
           <w14:ligatures w14:val="none"/>
         </w:rPr>
@@ -1327,18 +1434,22 @@
         <w:shd w:val="clear" w:color="auto" w:fill="FFFFFF"/>
         <w:spacing w:before="100" w:beforeAutospacing="1" w:after="100" w:afterAutospacing="1" w:line="240" w:lineRule="auto"/>
         <w:rPr>
-          <w:rFonts w:ascii="Segoe UI" w:eastAsia="Times New Roman" w:hAnsi="Segoe UI" w:cs="Segoe UI"/>
-          <w:color w:val="1F2328"/>
-          <w:kern w:val="0"/>
-          <w:lang w:eastAsia="en-ZA"/>
-          <w14:ligatures w14:val="none"/>
-        </w:rPr>
-      </w:pPr>
-      <w:r>
-        <w:rPr>
-          <w:rFonts w:ascii="Segoe UI" w:eastAsia="Times New Roman" w:hAnsi="Segoe UI" w:cs="Segoe UI"/>
-          <w:color w:val="1F2328"/>
-          <w:kern w:val="0"/>
+          <w:rFonts w:ascii="Arial" w:eastAsia="Times New Roman" w:hAnsi="Arial" w:cs="Arial"/>
+          <w:color w:val="1F2328"/>
+          <w:kern w:val="0"/>
+          <w:sz w:val="28"/>
+          <w:szCs w:val="28"/>
+          <w:lang w:eastAsia="en-ZA"/>
+          <w14:ligatures w14:val="none"/>
+        </w:rPr>
+      </w:pPr>
+      <w:r>
+        <w:rPr>
+          <w:rFonts w:ascii="Arial" w:eastAsia="Times New Roman" w:hAnsi="Arial" w:cs="Arial"/>
+          <w:color w:val="1F2328"/>
+          <w:kern w:val="0"/>
+          <w:sz w:val="28"/>
+          <w:szCs w:val="28"/>
           <w:lang w:eastAsia="en-ZA"/>
           <w14:ligatures w14:val="none"/>
         </w:rPr>
@@ -1354,18 +1465,22 @@
         <w:shd w:val="clear" w:color="auto" w:fill="FFFFFF"/>
         <w:spacing w:before="60" w:after="100" w:afterAutospacing="1" w:line="240" w:lineRule="auto"/>
         <w:rPr>
-          <w:rFonts w:ascii="Segoe UI" w:eastAsia="Times New Roman" w:hAnsi="Segoe UI" w:cs="Segoe UI"/>
-          <w:color w:val="1F2328"/>
-          <w:kern w:val="0"/>
-          <w:lang w:eastAsia="en-ZA"/>
-          <w14:ligatures w14:val="none"/>
-        </w:rPr>
-      </w:pPr>
-      <w:r>
-        <w:rPr>
-          <w:rFonts w:ascii="Segoe UI" w:eastAsia="Times New Roman" w:hAnsi="Segoe UI" w:cs="Segoe UI"/>
-          <w:color w:val="1F2328"/>
-          <w:kern w:val="0"/>
+          <w:rFonts w:ascii="Arial" w:eastAsia="Times New Roman" w:hAnsi="Arial" w:cs="Arial"/>
+          <w:color w:val="1F2328"/>
+          <w:kern w:val="0"/>
+          <w:sz w:val="28"/>
+          <w:szCs w:val="28"/>
+          <w:lang w:eastAsia="en-ZA"/>
+          <w14:ligatures w14:val="none"/>
+        </w:rPr>
+      </w:pPr>
+      <w:r>
+        <w:rPr>
+          <w:rFonts w:ascii="Arial" w:eastAsia="Times New Roman" w:hAnsi="Arial" w:cs="Arial"/>
+          <w:color w:val="1F2328"/>
+          <w:kern w:val="0"/>
+          <w:sz w:val="28"/>
+          <w:szCs w:val="28"/>
           <w:lang w:eastAsia="en-ZA"/>
           <w14:ligatures w14:val="none"/>
         </w:rPr>
@@ -1381,18 +1496,22 @@
         <w:shd w:val="clear" w:color="auto" w:fill="FFFFFF"/>
         <w:spacing w:before="60" w:after="100" w:afterAutospacing="1" w:line="240" w:lineRule="auto"/>
         <w:rPr>
-          <w:rFonts w:ascii="Segoe UI" w:eastAsia="Times New Roman" w:hAnsi="Segoe UI" w:cs="Segoe UI"/>
-          <w:color w:val="1F2328"/>
-          <w:kern w:val="0"/>
-          <w:lang w:eastAsia="en-ZA"/>
-          <w14:ligatures w14:val="none"/>
-        </w:rPr>
-      </w:pPr>
-      <w:r>
-        <w:rPr>
-          <w:rFonts w:ascii="Segoe UI" w:eastAsia="Times New Roman" w:hAnsi="Segoe UI" w:cs="Segoe UI"/>
-          <w:color w:val="1F2328"/>
-          <w:kern w:val="0"/>
+          <w:rFonts w:ascii="Arial" w:eastAsia="Times New Roman" w:hAnsi="Arial" w:cs="Arial"/>
+          <w:color w:val="1F2328"/>
+          <w:kern w:val="0"/>
+          <w:sz w:val="28"/>
+          <w:szCs w:val="28"/>
+          <w:lang w:eastAsia="en-ZA"/>
+          <w14:ligatures w14:val="none"/>
+        </w:rPr>
+      </w:pPr>
+      <w:r>
+        <w:rPr>
+          <w:rFonts w:ascii="Arial" w:eastAsia="Times New Roman" w:hAnsi="Arial" w:cs="Arial"/>
+          <w:color w:val="1F2328"/>
+          <w:kern w:val="0"/>
+          <w:sz w:val="28"/>
+          <w:szCs w:val="28"/>
           <w:lang w:eastAsia="en-ZA"/>
           <w14:ligatures w14:val="none"/>
         </w:rPr>
@@ -1404,19 +1523,23 @@
         <w:shd w:val="clear" w:color="auto" w:fill="FFFFFF"/>
         <w:spacing w:after="240" w:line="240" w:lineRule="auto"/>
         <w:rPr>
-          <w:rFonts w:ascii="Segoe UI" w:eastAsia="Times New Roman" w:hAnsi="Segoe UI" w:cs="Segoe UI"/>
-          <w:color w:val="1F2328"/>
-          <w:kern w:val="0"/>
-          <w:lang w:eastAsia="en-ZA"/>
-          <w14:ligatures w14:val="none"/>
-        </w:rPr>
-      </w:pPr>
-      <w:r>
-        <w:rPr>
-          <w:rFonts w:ascii="Segoe UI" w:eastAsia="Times New Roman" w:hAnsi="Segoe UI" w:cs="Segoe UI"/>
+          <w:rFonts w:ascii="Arial" w:eastAsia="Times New Roman" w:hAnsi="Arial" w:cs="Arial"/>
+          <w:color w:val="1F2328"/>
+          <w:kern w:val="0"/>
+          <w:sz w:val="28"/>
+          <w:szCs w:val="28"/>
+          <w:lang w:eastAsia="en-ZA"/>
+          <w14:ligatures w14:val="none"/>
+        </w:rPr>
+      </w:pPr>
+      <w:r>
+        <w:rPr>
+          <w:rFonts w:ascii="Arial" w:eastAsia="Times New Roman" w:hAnsi="Arial" w:cs="Arial"/>
           <w:noProof/>
           <w:color w:val="0969DA"/>
           <w:kern w:val="0"/>
+          <w:sz w:val="28"/>
+          <w:szCs w:val="28"/>
           <w:lang w:eastAsia="en-ZA"/>
           <w14:ligatures w14:val="none"/>
         </w:rPr>
@@ -1479,18 +1602,22 @@
         <w:shd w:val="clear" w:color="auto" w:fill="FFFFFF"/>
         <w:spacing w:after="240" w:line="240" w:lineRule="auto"/>
         <w:rPr>
-          <w:rFonts w:ascii="Segoe UI" w:eastAsia="Times New Roman" w:hAnsi="Segoe UI" w:cs="Segoe UI"/>
-          <w:color w:val="1F2328"/>
-          <w:kern w:val="0"/>
-          <w:lang w:eastAsia="en-ZA"/>
-          <w14:ligatures w14:val="none"/>
-        </w:rPr>
-      </w:pPr>
-      <w:r>
-        <w:rPr>
-          <w:rFonts w:ascii="Segoe UI" w:eastAsia="Times New Roman" w:hAnsi="Segoe UI" w:cs="Segoe UI"/>
-          <w:color w:val="1F2328"/>
-          <w:kern w:val="0"/>
+          <w:rFonts w:ascii="Arial" w:eastAsia="Times New Roman" w:hAnsi="Arial" w:cs="Arial"/>
+          <w:color w:val="1F2328"/>
+          <w:kern w:val="0"/>
+          <w:sz w:val="28"/>
+          <w:szCs w:val="28"/>
+          <w:lang w:eastAsia="en-ZA"/>
+          <w14:ligatures w14:val="none"/>
+        </w:rPr>
+      </w:pPr>
+      <w:r>
+        <w:rPr>
+          <w:rFonts w:ascii="Arial" w:eastAsia="Times New Roman" w:hAnsi="Arial" w:cs="Arial"/>
+          <w:color w:val="1F2328"/>
+          <w:kern w:val="0"/>
+          <w:sz w:val="28"/>
+          <w:szCs w:val="28"/>
           <w:lang w:eastAsia="en-ZA"/>
           <w14:ligatures w14:val="none"/>
         </w:rPr>
@@ -1502,19 +1629,23 @@
         <w:shd w:val="clear" w:color="auto" w:fill="FFFFFF"/>
         <w:spacing w:after="240" w:line="240" w:lineRule="auto"/>
         <w:rPr>
-          <w:rFonts w:ascii="Segoe UI" w:eastAsia="Times New Roman" w:hAnsi="Segoe UI" w:cs="Segoe UI"/>
-          <w:color w:val="1F2328"/>
-          <w:kern w:val="0"/>
-          <w:lang w:eastAsia="en-ZA"/>
-          <w14:ligatures w14:val="none"/>
-        </w:rPr>
-      </w:pPr>
-      <w:r>
-        <w:rPr>
-          <w:rFonts w:ascii="Segoe UI" w:eastAsia="Times New Roman" w:hAnsi="Segoe UI" w:cs="Segoe UI"/>
+          <w:rFonts w:ascii="Arial" w:eastAsia="Times New Roman" w:hAnsi="Arial" w:cs="Arial"/>
+          <w:color w:val="1F2328"/>
+          <w:kern w:val="0"/>
+          <w:sz w:val="28"/>
+          <w:szCs w:val="28"/>
+          <w:lang w:eastAsia="en-ZA"/>
+          <w14:ligatures w14:val="none"/>
+        </w:rPr>
+      </w:pPr>
+      <w:r>
+        <w:rPr>
+          <w:rFonts w:ascii="Arial" w:eastAsia="Times New Roman" w:hAnsi="Arial" w:cs="Arial"/>
           <w:noProof/>
           <w:color w:val="0969DA"/>
           <w:kern w:val="0"/>
+          <w:sz w:val="28"/>
+          <w:szCs w:val="28"/>
           <w:lang w:eastAsia="en-ZA"/>
           <w14:ligatures w14:val="none"/>
         </w:rPr>
@@ -1578,13 +1709,13 @@
         <w:spacing w:before="360" w:after="240" w:line="240" w:lineRule="auto"/>
         <w:outlineLvl w:val="2"/>
         <w:rPr>
-          <w:rFonts w:ascii="Segoe UI" w:eastAsia="Times New Roman" w:hAnsi="Segoe UI" w:cs="Segoe UI"/>
+          <w:rFonts w:ascii="Arial" w:eastAsia="Times New Roman" w:hAnsi="Arial" w:cs="Arial"/>
           <w:b/>
           <w:bCs/>
           <w:color w:val="1F2328"/>
           <w:kern w:val="0"/>
-          <w:sz w:val="30"/>
-          <w:szCs w:val="30"/>
+          <w:sz w:val="28"/>
+          <w:szCs w:val="28"/>
           <w:lang w:eastAsia="en-ZA"/>
           <w14:ligatures w14:val="none"/>
         </w:rPr>
@@ -1596,8 +1727,8 @@
           <w:bCs/>
           <w:color w:val="1F2328"/>
           <w:kern w:val="0"/>
-          <w:sz w:val="30"/>
-          <w:szCs w:val="30"/>
+          <w:sz w:val="28"/>
+          <w:szCs w:val="28"/>
           <w:lang w:eastAsia="en-ZA"/>
           <w14:ligatures w14:val="none"/>
         </w:rPr>
@@ -1606,13 +1737,13 @@
       </w:r>
       <w:r>
         <w:rPr>
-          <w:rFonts w:ascii="Segoe UI" w:eastAsia="Times New Roman" w:hAnsi="Segoe UI" w:cs="Segoe UI"/>
+          <w:rFonts w:ascii="Arial" w:eastAsia="Times New Roman" w:hAnsi="Arial" w:cs="Arial"/>
           <w:b/>
           <w:bCs/>
           <w:color w:val="1F2328"/>
           <w:kern w:val="0"/>
-          <w:sz w:val="30"/>
-          <w:szCs w:val="30"/>
+          <w:sz w:val="28"/>
+          <w:szCs w:val="28"/>
           <w:lang w:eastAsia="en-ZA"/>
           <w14:ligatures w14:val="none"/>
         </w:rPr>
@@ -1628,18 +1759,22 @@
         <w:shd w:val="clear" w:color="auto" w:fill="FFFFFF"/>
         <w:spacing w:before="100" w:beforeAutospacing="1" w:after="100" w:afterAutospacing="1" w:line="240" w:lineRule="auto"/>
         <w:rPr>
-          <w:rFonts w:ascii="Segoe UI" w:eastAsia="Times New Roman" w:hAnsi="Segoe UI" w:cs="Segoe UI"/>
-          <w:color w:val="1F2328"/>
-          <w:kern w:val="0"/>
-          <w:lang w:eastAsia="en-ZA"/>
-          <w14:ligatures w14:val="none"/>
-        </w:rPr>
-      </w:pPr>
-      <w:r>
-        <w:rPr>
-          <w:rFonts w:ascii="Segoe UI" w:eastAsia="Times New Roman" w:hAnsi="Segoe UI" w:cs="Segoe UI"/>
-          <w:color w:val="1F2328"/>
-          <w:kern w:val="0"/>
+          <w:rFonts w:ascii="Arial" w:eastAsia="Times New Roman" w:hAnsi="Arial" w:cs="Arial"/>
+          <w:color w:val="1F2328"/>
+          <w:kern w:val="0"/>
+          <w:sz w:val="28"/>
+          <w:szCs w:val="28"/>
+          <w:lang w:eastAsia="en-ZA"/>
+          <w14:ligatures w14:val="none"/>
+        </w:rPr>
+      </w:pPr>
+      <w:r>
+        <w:rPr>
+          <w:rFonts w:ascii="Arial" w:eastAsia="Times New Roman" w:hAnsi="Arial" w:cs="Arial"/>
+          <w:color w:val="1F2328"/>
+          <w:kern w:val="0"/>
+          <w:sz w:val="28"/>
+          <w:szCs w:val="28"/>
           <w:lang w:eastAsia="en-ZA"/>
           <w14:ligatures w14:val="none"/>
         </w:rPr>
@@ -1655,18 +1790,22 @@
         <w:shd w:val="clear" w:color="auto" w:fill="FFFFFF"/>
         <w:spacing w:before="60" w:after="100" w:afterAutospacing="1" w:line="240" w:lineRule="auto"/>
         <w:rPr>
-          <w:rFonts w:ascii="Segoe UI" w:eastAsia="Times New Roman" w:hAnsi="Segoe UI" w:cs="Segoe UI"/>
-          <w:color w:val="1F2328"/>
-          <w:kern w:val="0"/>
-          <w:lang w:eastAsia="en-ZA"/>
-          <w14:ligatures w14:val="none"/>
-        </w:rPr>
-      </w:pPr>
-      <w:r>
-        <w:rPr>
-          <w:rFonts w:ascii="Segoe UI" w:eastAsia="Times New Roman" w:hAnsi="Segoe UI" w:cs="Segoe UI"/>
-          <w:color w:val="1F2328"/>
-          <w:kern w:val="0"/>
+          <w:rFonts w:ascii="Arial" w:eastAsia="Times New Roman" w:hAnsi="Arial" w:cs="Arial"/>
+          <w:color w:val="1F2328"/>
+          <w:kern w:val="0"/>
+          <w:sz w:val="28"/>
+          <w:szCs w:val="28"/>
+          <w:lang w:eastAsia="en-ZA"/>
+          <w14:ligatures w14:val="none"/>
+        </w:rPr>
+      </w:pPr>
+      <w:r>
+        <w:rPr>
+          <w:rFonts w:ascii="Arial" w:eastAsia="Times New Roman" w:hAnsi="Arial" w:cs="Arial"/>
+          <w:color w:val="1F2328"/>
+          <w:kern w:val="0"/>
+          <w:sz w:val="28"/>
+          <w:szCs w:val="28"/>
           <w:lang w:eastAsia="en-ZA"/>
           <w14:ligatures w14:val="none"/>
         </w:rPr>
@@ -1682,18 +1821,22 @@
         <w:shd w:val="clear" w:color="auto" w:fill="FFFFFF"/>
         <w:spacing w:before="60" w:after="100" w:afterAutospacing="1" w:line="240" w:lineRule="auto"/>
         <w:rPr>
-          <w:rFonts w:ascii="Segoe UI" w:eastAsia="Times New Roman" w:hAnsi="Segoe UI" w:cs="Segoe UI"/>
-          <w:color w:val="1F2328"/>
-          <w:kern w:val="0"/>
-          <w:lang w:eastAsia="en-ZA"/>
-          <w14:ligatures w14:val="none"/>
-        </w:rPr>
-      </w:pPr>
-      <w:r>
-        <w:rPr>
-          <w:rFonts w:ascii="Segoe UI" w:eastAsia="Times New Roman" w:hAnsi="Segoe UI" w:cs="Segoe UI"/>
-          <w:color w:val="1F2328"/>
-          <w:kern w:val="0"/>
+          <w:rFonts w:ascii="Arial" w:eastAsia="Times New Roman" w:hAnsi="Arial" w:cs="Arial"/>
+          <w:color w:val="1F2328"/>
+          <w:kern w:val="0"/>
+          <w:sz w:val="28"/>
+          <w:szCs w:val="28"/>
+          <w:lang w:eastAsia="en-ZA"/>
+          <w14:ligatures w14:val="none"/>
+        </w:rPr>
+      </w:pPr>
+      <w:r>
+        <w:rPr>
+          <w:rFonts w:ascii="Arial" w:eastAsia="Times New Roman" w:hAnsi="Arial" w:cs="Arial"/>
+          <w:color w:val="1F2328"/>
+          <w:kern w:val="0"/>
+          <w:sz w:val="28"/>
+          <w:szCs w:val="28"/>
           <w:lang w:eastAsia="en-ZA"/>
           <w14:ligatures w14:val="none"/>
         </w:rPr>
@@ -1709,9 +1852,11 @@
         <w:shd w:val="clear" w:color="auto" w:fill="FFFFFF"/>
         <w:spacing w:before="60" w:after="100" w:afterAutospacing="1" w:line="240" w:lineRule="auto"/>
         <w:rPr>
-          <w:rFonts w:ascii="Segoe UI" w:eastAsia="Times New Roman" w:hAnsi="Segoe UI" w:cs="Segoe UI"/>
-          <w:color w:val="1F2328"/>
-          <w:kern w:val="0"/>
+          <w:rFonts w:ascii="Arial" w:eastAsia="Times New Roman" w:hAnsi="Arial" w:cs="Arial"/>
+          <w:color w:val="1F2328"/>
+          <w:kern w:val="0"/>
+          <w:sz w:val="28"/>
+          <w:szCs w:val="28"/>
           <w:lang w:eastAsia="en-ZA"/>
           <w14:ligatures w14:val="none"/>
         </w:rPr>
@@ -1719,9 +1864,11 @@
       <w:proofErr w:type="spellStart"/>
       <w:r>
         <w:rPr>
-          <w:rFonts w:ascii="Segoe UI" w:eastAsia="Times New Roman" w:hAnsi="Segoe UI" w:cs="Segoe UI"/>
-          <w:color w:val="1F2328"/>
-          <w:kern w:val="0"/>
+          <w:rFonts w:ascii="Arial" w:eastAsia="Times New Roman" w:hAnsi="Arial" w:cs="Arial"/>
+          <w:color w:val="1F2328"/>
+          <w:kern w:val="0"/>
+          <w:sz w:val="28"/>
+          <w:szCs w:val="28"/>
           <w:lang w:eastAsia="en-ZA"/>
           <w14:ligatures w14:val="none"/>
         </w:rPr>
@@ -1730,9 +1877,11 @@
       <w:proofErr w:type="spellEnd"/>
       <w:r>
         <w:rPr>
-          <w:rFonts w:ascii="Segoe UI" w:eastAsia="Times New Roman" w:hAnsi="Segoe UI" w:cs="Segoe UI"/>
-          <w:color w:val="1F2328"/>
-          <w:kern w:val="0"/>
+          <w:rFonts w:ascii="Arial" w:eastAsia="Times New Roman" w:hAnsi="Arial" w:cs="Arial"/>
+          <w:color w:val="1F2328"/>
+          <w:kern w:val="0"/>
+          <w:sz w:val="28"/>
+          <w:szCs w:val="28"/>
           <w:lang w:eastAsia="en-ZA"/>
           <w14:ligatures w14:val="none"/>
         </w:rPr>
@@ -1744,19 +1893,23 @@
         <w:shd w:val="clear" w:color="auto" w:fill="FFFFFF"/>
         <w:spacing w:after="240" w:line="240" w:lineRule="auto"/>
         <w:rPr>
-          <w:rFonts w:ascii="Segoe UI" w:eastAsia="Times New Roman" w:hAnsi="Segoe UI" w:cs="Segoe UI"/>
-          <w:color w:val="1F2328"/>
-          <w:kern w:val="0"/>
-          <w:lang w:eastAsia="en-ZA"/>
-          <w14:ligatures w14:val="none"/>
-        </w:rPr>
-      </w:pPr>
-      <w:r>
-        <w:rPr>
-          <w:rFonts w:ascii="Segoe UI" w:eastAsia="Times New Roman" w:hAnsi="Segoe UI" w:cs="Segoe UI"/>
+          <w:rFonts w:ascii="Arial" w:eastAsia="Times New Roman" w:hAnsi="Arial" w:cs="Arial"/>
+          <w:color w:val="1F2328"/>
+          <w:kern w:val="0"/>
+          <w:sz w:val="28"/>
+          <w:szCs w:val="28"/>
+          <w:lang w:eastAsia="en-ZA"/>
+          <w14:ligatures w14:val="none"/>
+        </w:rPr>
+      </w:pPr>
+      <w:r>
+        <w:rPr>
+          <w:rFonts w:ascii="Arial" w:eastAsia="Times New Roman" w:hAnsi="Arial" w:cs="Arial"/>
           <w:noProof/>
           <w:color w:val="0969DA"/>
           <w:kern w:val="0"/>
+          <w:sz w:val="28"/>
+          <w:szCs w:val="28"/>
           <w:lang w:eastAsia="en-ZA"/>
           <w14:ligatures w14:val="none"/>
         </w:rPr>
@@ -1820,13 +1973,13 @@
         <w:spacing w:before="360" w:after="240" w:line="240" w:lineRule="auto"/>
         <w:outlineLvl w:val="1"/>
         <w:rPr>
-          <w:rFonts w:ascii="Segoe UI" w:eastAsia="Times New Roman" w:hAnsi="Segoe UI" w:cs="Segoe UI"/>
+          <w:rFonts w:ascii="Arial" w:eastAsia="Times New Roman" w:hAnsi="Arial" w:cs="Arial"/>
           <w:b/>
           <w:bCs/>
           <w:color w:val="1F2328"/>
           <w:kern w:val="0"/>
-          <w:sz w:val="36"/>
-          <w:szCs w:val="36"/>
+          <w:sz w:val="28"/>
+          <w:szCs w:val="28"/>
           <w:lang w:eastAsia="en-ZA"/>
           <w14:ligatures w14:val="none"/>
         </w:rPr>
@@ -1838,8 +1991,8 @@
           <w:bCs/>
           <w:color w:val="1F2328"/>
           <w:kern w:val="0"/>
-          <w:sz w:val="36"/>
-          <w:szCs w:val="36"/>
+          <w:sz w:val="28"/>
+          <w:szCs w:val="28"/>
           <w:lang w:eastAsia="en-ZA"/>
           <w14:ligatures w14:val="none"/>
         </w:rPr>
@@ -1847,13 +2000,13 @@
       </w:r>
       <w:r>
         <w:rPr>
-          <w:rFonts w:ascii="Segoe UI" w:eastAsia="Times New Roman" w:hAnsi="Segoe UI" w:cs="Segoe UI"/>
+          <w:rFonts w:ascii="Arial" w:eastAsia="Times New Roman" w:hAnsi="Arial" w:cs="Arial"/>
           <w:b/>
           <w:bCs/>
           <w:color w:val="1F2328"/>
           <w:kern w:val="0"/>
-          <w:sz w:val="36"/>
-          <w:szCs w:val="36"/>
+          <w:sz w:val="28"/>
+          <w:szCs w:val="28"/>
           <w:lang w:eastAsia="en-ZA"/>
           <w14:ligatures w14:val="none"/>
         </w:rPr>
@@ -1869,18 +2022,22 @@
         <w:shd w:val="clear" w:color="auto" w:fill="FFFFFF"/>
         <w:spacing w:before="100" w:beforeAutospacing="1" w:after="100" w:afterAutospacing="1" w:line="240" w:lineRule="auto"/>
         <w:rPr>
-          <w:rFonts w:ascii="Segoe UI" w:eastAsia="Times New Roman" w:hAnsi="Segoe UI" w:cs="Segoe UI"/>
-          <w:color w:val="1F2328"/>
-          <w:kern w:val="0"/>
-          <w:lang w:eastAsia="en-ZA"/>
-          <w14:ligatures w14:val="none"/>
-        </w:rPr>
-      </w:pPr>
-      <w:r>
-        <w:rPr>
-          <w:rFonts w:ascii="Segoe UI" w:eastAsia="Times New Roman" w:hAnsi="Segoe UI" w:cs="Segoe UI"/>
-          <w:color w:val="1F2328"/>
-          <w:kern w:val="0"/>
+          <w:rFonts w:ascii="Arial" w:eastAsia="Times New Roman" w:hAnsi="Arial" w:cs="Arial"/>
+          <w:color w:val="1F2328"/>
+          <w:kern w:val="0"/>
+          <w:sz w:val="28"/>
+          <w:szCs w:val="28"/>
+          <w:lang w:eastAsia="en-ZA"/>
+          <w14:ligatures w14:val="none"/>
+        </w:rPr>
+      </w:pPr>
+      <w:r>
+        <w:rPr>
+          <w:rFonts w:ascii="Arial" w:eastAsia="Times New Roman" w:hAnsi="Arial" w:cs="Arial"/>
+          <w:color w:val="1F2328"/>
+          <w:kern w:val="0"/>
+          <w:sz w:val="28"/>
+          <w:szCs w:val="28"/>
           <w:lang w:eastAsia="en-ZA"/>
           <w14:ligatures w14:val="none"/>
         </w:rPr>
@@ -1893,13 +2050,13 @@
         <w:spacing w:before="360" w:after="240" w:line="240" w:lineRule="auto"/>
         <w:outlineLvl w:val="1"/>
         <w:rPr>
-          <w:rFonts w:ascii="Segoe UI" w:eastAsia="Times New Roman" w:hAnsi="Segoe UI" w:cs="Segoe UI"/>
+          <w:rFonts w:ascii="Arial" w:eastAsia="Times New Roman" w:hAnsi="Arial" w:cs="Arial"/>
           <w:b/>
           <w:bCs/>
           <w:color w:val="1F2328"/>
           <w:kern w:val="0"/>
-          <w:sz w:val="36"/>
-          <w:szCs w:val="36"/>
+          <w:sz w:val="28"/>
+          <w:szCs w:val="28"/>
           <w:lang w:eastAsia="en-ZA"/>
           <w14:ligatures w14:val="none"/>
         </w:rPr>
@@ -1911,8 +2068,8 @@
           <w:bCs/>
           <w:color w:val="1F2328"/>
           <w:kern w:val="0"/>
-          <w:sz w:val="36"/>
-          <w:szCs w:val="36"/>
+          <w:sz w:val="28"/>
+          <w:szCs w:val="28"/>
           <w:lang w:eastAsia="en-ZA"/>
           <w14:ligatures w14:val="none"/>
         </w:rPr>
@@ -1920,13 +2077,13 @@
       </w:r>
       <w:r>
         <w:rPr>
-          <w:rFonts w:ascii="Segoe UI" w:eastAsia="Times New Roman" w:hAnsi="Segoe UI" w:cs="Segoe UI"/>
+          <w:rFonts w:ascii="Arial" w:eastAsia="Times New Roman" w:hAnsi="Arial" w:cs="Arial"/>
           <w:b/>
           <w:bCs/>
           <w:color w:val="1F2328"/>
           <w:kern w:val="0"/>
-          <w:sz w:val="36"/>
-          <w:szCs w:val="36"/>
+          <w:sz w:val="28"/>
+          <w:szCs w:val="28"/>
           <w:lang w:eastAsia="en-ZA"/>
           <w14:ligatures w14:val="none"/>
         </w:rPr>
@@ -1942,18 +2099,22 @@
         <w:shd w:val="clear" w:color="auto" w:fill="FFFFFF"/>
         <w:spacing w:before="100" w:beforeAutospacing="1" w:after="100" w:afterAutospacing="1" w:line="240" w:lineRule="auto"/>
         <w:rPr>
-          <w:rFonts w:ascii="Segoe UI" w:eastAsia="Times New Roman" w:hAnsi="Segoe UI" w:cs="Segoe UI"/>
-          <w:color w:val="1F2328"/>
-          <w:kern w:val="0"/>
-          <w:lang w:eastAsia="en-ZA"/>
-          <w14:ligatures w14:val="none"/>
-        </w:rPr>
-      </w:pPr>
-      <w:r>
-        <w:rPr>
-          <w:rFonts w:ascii="Segoe UI" w:eastAsia="Times New Roman" w:hAnsi="Segoe UI" w:cs="Segoe UI"/>
-          <w:color w:val="1F2328"/>
-          <w:kern w:val="0"/>
+          <w:rFonts w:ascii="Arial" w:eastAsia="Times New Roman" w:hAnsi="Arial" w:cs="Arial"/>
+          <w:color w:val="1F2328"/>
+          <w:kern w:val="0"/>
+          <w:sz w:val="28"/>
+          <w:szCs w:val="28"/>
+          <w:lang w:eastAsia="en-ZA"/>
+          <w14:ligatures w14:val="none"/>
+        </w:rPr>
+      </w:pPr>
+      <w:r>
+        <w:rPr>
+          <w:rFonts w:ascii="Arial" w:eastAsia="Times New Roman" w:hAnsi="Arial" w:cs="Arial"/>
+          <w:color w:val="1F2328"/>
+          <w:kern w:val="0"/>
+          <w:sz w:val="28"/>
+          <w:szCs w:val="28"/>
           <w:lang w:eastAsia="en-ZA"/>
           <w14:ligatures w14:val="none"/>
         </w:rPr>
@@ -1969,18 +2130,22 @@
         <w:shd w:val="clear" w:color="auto" w:fill="FFFFFF"/>
         <w:spacing w:before="60" w:after="100" w:afterAutospacing="1" w:line="240" w:lineRule="auto"/>
         <w:rPr>
-          <w:rFonts w:ascii="Segoe UI" w:eastAsia="Times New Roman" w:hAnsi="Segoe UI" w:cs="Segoe UI"/>
-          <w:color w:val="1F2328"/>
-          <w:kern w:val="0"/>
-          <w:lang w:eastAsia="en-ZA"/>
-          <w14:ligatures w14:val="none"/>
-        </w:rPr>
-      </w:pPr>
-      <w:r>
-        <w:rPr>
-          <w:rFonts w:ascii="Segoe UI" w:eastAsia="Times New Roman" w:hAnsi="Segoe UI" w:cs="Segoe UI"/>
-          <w:color w:val="1F2328"/>
-          <w:kern w:val="0"/>
+          <w:rFonts w:ascii="Arial" w:eastAsia="Times New Roman" w:hAnsi="Arial" w:cs="Arial"/>
+          <w:color w:val="1F2328"/>
+          <w:kern w:val="0"/>
+          <w:sz w:val="28"/>
+          <w:szCs w:val="28"/>
+          <w:lang w:eastAsia="en-ZA"/>
+          <w14:ligatures w14:val="none"/>
+        </w:rPr>
+      </w:pPr>
+      <w:r>
+        <w:rPr>
+          <w:rFonts w:ascii="Arial" w:eastAsia="Times New Roman" w:hAnsi="Arial" w:cs="Arial"/>
+          <w:color w:val="1F2328"/>
+          <w:kern w:val="0"/>
+          <w:sz w:val="28"/>
+          <w:szCs w:val="28"/>
           <w:lang w:eastAsia="en-ZA"/>
           <w14:ligatures w14:val="none"/>
         </w:rPr>
@@ -1996,18 +2161,22 @@
         <w:shd w:val="clear" w:color="auto" w:fill="FFFFFF"/>
         <w:spacing w:before="60" w:after="100" w:afterAutospacing="1" w:line="240" w:lineRule="auto"/>
         <w:rPr>
-          <w:rFonts w:ascii="Segoe UI" w:eastAsia="Times New Roman" w:hAnsi="Segoe UI" w:cs="Segoe UI"/>
-          <w:color w:val="1F2328"/>
-          <w:kern w:val="0"/>
-          <w:lang w:eastAsia="en-ZA"/>
-          <w14:ligatures w14:val="none"/>
-        </w:rPr>
-      </w:pPr>
-      <w:r>
-        <w:rPr>
-          <w:rFonts w:ascii="Segoe UI" w:eastAsia="Times New Roman" w:hAnsi="Segoe UI" w:cs="Segoe UI"/>
-          <w:color w:val="1F2328"/>
-          <w:kern w:val="0"/>
+          <w:rFonts w:ascii="Arial" w:eastAsia="Times New Roman" w:hAnsi="Arial" w:cs="Arial"/>
+          <w:color w:val="1F2328"/>
+          <w:kern w:val="0"/>
+          <w:sz w:val="28"/>
+          <w:szCs w:val="28"/>
+          <w:lang w:eastAsia="en-ZA"/>
+          <w14:ligatures w14:val="none"/>
+        </w:rPr>
+      </w:pPr>
+      <w:r>
+        <w:rPr>
+          <w:rFonts w:ascii="Arial" w:eastAsia="Times New Roman" w:hAnsi="Arial" w:cs="Arial"/>
+          <w:color w:val="1F2328"/>
+          <w:kern w:val="0"/>
+          <w:sz w:val="28"/>
+          <w:szCs w:val="28"/>
           <w:lang w:eastAsia="en-ZA"/>
           <w14:ligatures w14:val="none"/>
         </w:rPr>
@@ -2023,18 +2192,22 @@
         <w:shd w:val="clear" w:color="auto" w:fill="FFFFFF"/>
         <w:spacing w:before="60" w:after="100" w:afterAutospacing="1" w:line="240" w:lineRule="auto"/>
         <w:rPr>
-          <w:rFonts w:ascii="Segoe UI" w:eastAsia="Times New Roman" w:hAnsi="Segoe UI" w:cs="Segoe UI"/>
-          <w:color w:val="1F2328"/>
-          <w:kern w:val="0"/>
-          <w:lang w:eastAsia="en-ZA"/>
-          <w14:ligatures w14:val="none"/>
-        </w:rPr>
-      </w:pPr>
-      <w:r>
-        <w:rPr>
-          <w:rFonts w:ascii="Segoe UI" w:eastAsia="Times New Roman" w:hAnsi="Segoe UI" w:cs="Segoe UI"/>
-          <w:color w:val="1F2328"/>
-          <w:kern w:val="0"/>
+          <w:rFonts w:ascii="Arial" w:eastAsia="Times New Roman" w:hAnsi="Arial" w:cs="Arial"/>
+          <w:color w:val="1F2328"/>
+          <w:kern w:val="0"/>
+          <w:sz w:val="28"/>
+          <w:szCs w:val="28"/>
+          <w:lang w:eastAsia="en-ZA"/>
+          <w14:ligatures w14:val="none"/>
+        </w:rPr>
+      </w:pPr>
+      <w:r>
+        <w:rPr>
+          <w:rFonts w:ascii="Arial" w:eastAsia="Times New Roman" w:hAnsi="Arial" w:cs="Arial"/>
+          <w:color w:val="1F2328"/>
+          <w:kern w:val="0"/>
+          <w:sz w:val="28"/>
+          <w:szCs w:val="28"/>
           <w:lang w:eastAsia="en-ZA"/>
           <w14:ligatures w14:val="none"/>
         </w:rPr>
@@ -2047,13 +2220,13 @@
         <w:spacing w:before="360" w:after="240" w:line="240" w:lineRule="auto"/>
         <w:outlineLvl w:val="1"/>
         <w:rPr>
-          <w:rFonts w:ascii="Segoe UI" w:eastAsia="Times New Roman" w:hAnsi="Segoe UI" w:cs="Segoe UI"/>
+          <w:rFonts w:ascii="Arial" w:eastAsia="Times New Roman" w:hAnsi="Arial" w:cs="Arial"/>
           <w:b/>
           <w:bCs/>
           <w:color w:val="1F2328"/>
           <w:kern w:val="0"/>
-          <w:sz w:val="36"/>
-          <w:szCs w:val="36"/>
+          <w:sz w:val="28"/>
+          <w:szCs w:val="28"/>
           <w:lang w:eastAsia="en-ZA"/>
           <w14:ligatures w14:val="none"/>
         </w:rPr>
@@ -2065,8 +2238,8 @@
           <w:bCs/>
           <w:color w:val="1F2328"/>
           <w:kern w:val="0"/>
-          <w:sz w:val="36"/>
-          <w:szCs w:val="36"/>
+          <w:sz w:val="28"/>
+          <w:szCs w:val="28"/>
           <w:lang w:eastAsia="en-ZA"/>
           <w14:ligatures w14:val="none"/>
         </w:rPr>
@@ -2074,13 +2247,13 @@
       </w:r>
       <w:r>
         <w:rPr>
-          <w:rFonts w:ascii="Segoe UI" w:eastAsia="Times New Roman" w:hAnsi="Segoe UI" w:cs="Segoe UI"/>
+          <w:rFonts w:ascii="Arial" w:eastAsia="Times New Roman" w:hAnsi="Arial" w:cs="Arial"/>
           <w:b/>
           <w:bCs/>
           <w:color w:val="1F2328"/>
           <w:kern w:val="0"/>
-          <w:sz w:val="36"/>
-          <w:szCs w:val="36"/>
+          <w:sz w:val="28"/>
+          <w:szCs w:val="28"/>
           <w:lang w:eastAsia="en-ZA"/>
           <w14:ligatures w14:val="none"/>
         </w:rPr>
@@ -2096,18 +2269,22 @@
         <w:shd w:val="clear" w:color="auto" w:fill="FFFFFF"/>
         <w:spacing w:before="100" w:beforeAutospacing="1" w:after="100" w:afterAutospacing="1" w:line="240" w:lineRule="auto"/>
         <w:rPr>
-          <w:rFonts w:ascii="Segoe UI" w:eastAsia="Times New Roman" w:hAnsi="Segoe UI" w:cs="Segoe UI"/>
-          <w:color w:val="1F2328"/>
-          <w:kern w:val="0"/>
-          <w:lang w:eastAsia="en-ZA"/>
-          <w14:ligatures w14:val="none"/>
-        </w:rPr>
-      </w:pPr>
-      <w:r>
-        <w:rPr>
-          <w:rFonts w:ascii="Segoe UI" w:eastAsia="Times New Roman" w:hAnsi="Segoe UI" w:cs="Segoe UI"/>
-          <w:color w:val="1F2328"/>
-          <w:kern w:val="0"/>
+          <w:rFonts w:ascii="Arial" w:eastAsia="Times New Roman" w:hAnsi="Arial" w:cs="Arial"/>
+          <w:color w:val="1F2328"/>
+          <w:kern w:val="0"/>
+          <w:sz w:val="28"/>
+          <w:szCs w:val="28"/>
+          <w:lang w:eastAsia="en-ZA"/>
+          <w14:ligatures w14:val="none"/>
+        </w:rPr>
+      </w:pPr>
+      <w:r>
+        <w:rPr>
+          <w:rFonts w:ascii="Arial" w:eastAsia="Times New Roman" w:hAnsi="Arial" w:cs="Arial"/>
+          <w:color w:val="1F2328"/>
+          <w:kern w:val="0"/>
+          <w:sz w:val="28"/>
+          <w:szCs w:val="28"/>
           <w:lang w:eastAsia="en-ZA"/>
           <w14:ligatures w14:val="none"/>
         </w:rPr>
@@ -2123,18 +2300,22 @@
         <w:shd w:val="clear" w:color="auto" w:fill="FFFFFF"/>
         <w:spacing w:before="60" w:after="100" w:afterAutospacing="1" w:line="240" w:lineRule="auto"/>
         <w:rPr>
-          <w:rFonts w:ascii="Segoe UI" w:eastAsia="Times New Roman" w:hAnsi="Segoe UI" w:cs="Segoe UI"/>
-          <w:color w:val="1F2328"/>
-          <w:kern w:val="0"/>
-          <w:lang w:eastAsia="en-ZA"/>
-          <w14:ligatures w14:val="none"/>
-        </w:rPr>
-      </w:pPr>
-      <w:r>
-        <w:rPr>
-          <w:rFonts w:ascii="Segoe UI" w:eastAsia="Times New Roman" w:hAnsi="Segoe UI" w:cs="Segoe UI"/>
-          <w:color w:val="1F2328"/>
-          <w:kern w:val="0"/>
+          <w:rFonts w:ascii="Arial" w:eastAsia="Times New Roman" w:hAnsi="Arial" w:cs="Arial"/>
+          <w:color w:val="1F2328"/>
+          <w:kern w:val="0"/>
+          <w:sz w:val="28"/>
+          <w:szCs w:val="28"/>
+          <w:lang w:eastAsia="en-ZA"/>
+          <w14:ligatures w14:val="none"/>
+        </w:rPr>
+      </w:pPr>
+      <w:r>
+        <w:rPr>
+          <w:rFonts w:ascii="Arial" w:eastAsia="Times New Roman" w:hAnsi="Arial" w:cs="Arial"/>
+          <w:color w:val="1F2328"/>
+          <w:kern w:val="0"/>
+          <w:sz w:val="28"/>
+          <w:szCs w:val="28"/>
           <w:lang w:eastAsia="en-ZA"/>
           <w14:ligatures w14:val="none"/>
         </w:rPr>
@@ -2150,18 +2331,22 @@
         <w:shd w:val="clear" w:color="auto" w:fill="FFFFFF"/>
         <w:spacing w:before="60" w:after="100" w:afterAutospacing="1" w:line="240" w:lineRule="auto"/>
         <w:rPr>
-          <w:rFonts w:ascii="Segoe UI" w:eastAsia="Times New Roman" w:hAnsi="Segoe UI" w:cs="Segoe UI"/>
-          <w:color w:val="1F2328"/>
-          <w:kern w:val="0"/>
-          <w:lang w:eastAsia="en-ZA"/>
-          <w14:ligatures w14:val="none"/>
-        </w:rPr>
-      </w:pPr>
-      <w:r>
-        <w:rPr>
-          <w:rFonts w:ascii="Segoe UI" w:eastAsia="Times New Roman" w:hAnsi="Segoe UI" w:cs="Segoe UI"/>
-          <w:color w:val="1F2328"/>
-          <w:kern w:val="0"/>
+          <w:rFonts w:ascii="Arial" w:eastAsia="Times New Roman" w:hAnsi="Arial" w:cs="Arial"/>
+          <w:color w:val="1F2328"/>
+          <w:kern w:val="0"/>
+          <w:sz w:val="28"/>
+          <w:szCs w:val="28"/>
+          <w:lang w:eastAsia="en-ZA"/>
+          <w14:ligatures w14:val="none"/>
+        </w:rPr>
+      </w:pPr>
+      <w:r>
+        <w:rPr>
+          <w:rFonts w:ascii="Arial" w:eastAsia="Times New Roman" w:hAnsi="Arial" w:cs="Arial"/>
+          <w:color w:val="1F2328"/>
+          <w:kern w:val="0"/>
+          <w:sz w:val="28"/>
+          <w:szCs w:val="28"/>
           <w:lang w:eastAsia="en-ZA"/>
           <w14:ligatures w14:val="none"/>
         </w:rPr>
@@ -2177,18 +2362,22 @@
         <w:shd w:val="clear" w:color="auto" w:fill="FFFFFF"/>
         <w:spacing w:before="60" w:after="100" w:afterAutospacing="1" w:line="240" w:lineRule="auto"/>
         <w:rPr>
-          <w:rFonts w:ascii="Segoe UI" w:eastAsia="Times New Roman" w:hAnsi="Segoe UI" w:cs="Segoe UI"/>
-          <w:color w:val="1F2328"/>
-          <w:kern w:val="0"/>
-          <w:lang w:eastAsia="en-ZA"/>
-          <w14:ligatures w14:val="none"/>
-        </w:rPr>
-      </w:pPr>
-      <w:r>
-        <w:rPr>
-          <w:rFonts w:ascii="Segoe UI" w:eastAsia="Times New Roman" w:hAnsi="Segoe UI" w:cs="Segoe UI"/>
-          <w:color w:val="1F2328"/>
-          <w:kern w:val="0"/>
+          <w:rFonts w:ascii="Arial" w:eastAsia="Times New Roman" w:hAnsi="Arial" w:cs="Arial"/>
+          <w:color w:val="1F2328"/>
+          <w:kern w:val="0"/>
+          <w:sz w:val="28"/>
+          <w:szCs w:val="28"/>
+          <w:lang w:eastAsia="en-ZA"/>
+          <w14:ligatures w14:val="none"/>
+        </w:rPr>
+      </w:pPr>
+      <w:r>
+        <w:rPr>
+          <w:rFonts w:ascii="Arial" w:eastAsia="Times New Roman" w:hAnsi="Arial" w:cs="Arial"/>
+          <w:color w:val="1F2328"/>
+          <w:kern w:val="0"/>
+          <w:sz w:val="28"/>
+          <w:szCs w:val="28"/>
           <w:lang w:eastAsia="en-ZA"/>
           <w14:ligatures w14:val="none"/>
         </w:rPr>
@@ -2204,18 +2393,22 @@
         <w:shd w:val="clear" w:color="auto" w:fill="FFFFFF"/>
         <w:spacing w:before="60" w:after="100" w:afterAutospacing="1" w:line="240" w:lineRule="auto"/>
         <w:rPr>
-          <w:rFonts w:ascii="Segoe UI" w:eastAsia="Times New Roman" w:hAnsi="Segoe UI" w:cs="Segoe UI"/>
-          <w:color w:val="1F2328"/>
-          <w:kern w:val="0"/>
-          <w:lang w:eastAsia="en-ZA"/>
-          <w14:ligatures w14:val="none"/>
-        </w:rPr>
-      </w:pPr>
-      <w:r>
-        <w:rPr>
-          <w:rFonts w:ascii="Segoe UI" w:eastAsia="Times New Roman" w:hAnsi="Segoe UI" w:cs="Segoe UI"/>
-          <w:color w:val="1F2328"/>
-          <w:kern w:val="0"/>
+          <w:rFonts w:ascii="Arial" w:eastAsia="Times New Roman" w:hAnsi="Arial" w:cs="Arial"/>
+          <w:color w:val="1F2328"/>
+          <w:kern w:val="0"/>
+          <w:sz w:val="28"/>
+          <w:szCs w:val="28"/>
+          <w:lang w:eastAsia="en-ZA"/>
+          <w14:ligatures w14:val="none"/>
+        </w:rPr>
+      </w:pPr>
+      <w:r>
+        <w:rPr>
+          <w:rFonts w:ascii="Arial" w:eastAsia="Times New Roman" w:hAnsi="Arial" w:cs="Arial"/>
+          <w:color w:val="1F2328"/>
+          <w:kern w:val="0"/>
+          <w:sz w:val="28"/>
+          <w:szCs w:val="28"/>
           <w:lang w:eastAsia="en-ZA"/>
           <w14:ligatures w14:val="none"/>
         </w:rPr>
@@ -2231,18 +2424,22 @@
         <w:shd w:val="clear" w:color="auto" w:fill="FFFFFF"/>
         <w:spacing w:before="60" w:after="100" w:afterAutospacing="1" w:line="240" w:lineRule="auto"/>
         <w:rPr>
-          <w:rFonts w:ascii="Segoe UI" w:eastAsia="Times New Roman" w:hAnsi="Segoe UI" w:cs="Segoe UI"/>
-          <w:color w:val="1F2328"/>
-          <w:kern w:val="0"/>
-          <w:lang w:eastAsia="en-ZA"/>
-          <w14:ligatures w14:val="none"/>
-        </w:rPr>
-      </w:pPr>
-      <w:r>
-        <w:rPr>
-          <w:rFonts w:ascii="Segoe UI" w:eastAsia="Times New Roman" w:hAnsi="Segoe UI" w:cs="Segoe UI"/>
-          <w:color w:val="1F2328"/>
-          <w:kern w:val="0"/>
+          <w:rFonts w:ascii="Arial" w:eastAsia="Times New Roman" w:hAnsi="Arial" w:cs="Arial"/>
+          <w:color w:val="1F2328"/>
+          <w:kern w:val="0"/>
+          <w:sz w:val="28"/>
+          <w:szCs w:val="28"/>
+          <w:lang w:eastAsia="en-ZA"/>
+          <w14:ligatures w14:val="none"/>
+        </w:rPr>
+      </w:pPr>
+      <w:r>
+        <w:rPr>
+          <w:rFonts w:ascii="Arial" w:eastAsia="Times New Roman" w:hAnsi="Arial" w:cs="Arial"/>
+          <w:color w:val="1F2328"/>
+          <w:kern w:val="0"/>
+          <w:sz w:val="28"/>
+          <w:szCs w:val="28"/>
           <w:lang w:eastAsia="en-ZA"/>
           <w14:ligatures w14:val="none"/>
         </w:rPr>
@@ -2255,13 +2452,13 @@
         <w:spacing w:before="360" w:after="240" w:line="240" w:lineRule="auto"/>
         <w:outlineLvl w:val="1"/>
         <w:rPr>
-          <w:rFonts w:ascii="Segoe UI" w:eastAsia="Times New Roman" w:hAnsi="Segoe UI" w:cs="Segoe UI"/>
+          <w:rFonts w:ascii="Arial" w:eastAsia="Times New Roman" w:hAnsi="Arial" w:cs="Arial"/>
           <w:b/>
           <w:bCs/>
           <w:color w:val="1F2328"/>
           <w:kern w:val="0"/>
-          <w:sz w:val="36"/>
-          <w:szCs w:val="36"/>
+          <w:sz w:val="28"/>
+          <w:szCs w:val="28"/>
           <w:lang w:eastAsia="en-ZA"/>
           <w14:ligatures w14:val="none"/>
         </w:rPr>
@@ -2273,8 +2470,8 @@
           <w:bCs/>
           <w:color w:val="1F2328"/>
           <w:kern w:val="0"/>
-          <w:sz w:val="36"/>
-          <w:szCs w:val="36"/>
+          <w:sz w:val="28"/>
+          <w:szCs w:val="28"/>
           <w:lang w:eastAsia="en-ZA"/>
           <w14:ligatures w14:val="none"/>
         </w:rPr>
@@ -2283,13 +2480,13 @@
       </w:r>
       <w:r>
         <w:rPr>
-          <w:rFonts w:ascii="Segoe UI" w:eastAsia="Times New Roman" w:hAnsi="Segoe UI" w:cs="Segoe UI"/>
+          <w:rFonts w:ascii="Arial" w:eastAsia="Times New Roman" w:hAnsi="Arial" w:cs="Arial"/>
           <w:b/>
           <w:bCs/>
           <w:color w:val="1F2328"/>
           <w:kern w:val="0"/>
-          <w:sz w:val="36"/>
-          <w:szCs w:val="36"/>
+          <w:sz w:val="28"/>
+          <w:szCs w:val="28"/>
           <w:lang w:eastAsia="en-ZA"/>
           <w14:ligatures w14:val="none"/>
         </w:rPr>
@@ -2305,9 +2502,11 @@
         <w:shd w:val="clear" w:color="auto" w:fill="FFFFFF"/>
         <w:spacing w:before="100" w:beforeAutospacing="1" w:after="100" w:afterAutospacing="1" w:line="240" w:lineRule="auto"/>
         <w:rPr>
-          <w:rFonts w:ascii="Segoe UI" w:eastAsia="Times New Roman" w:hAnsi="Segoe UI" w:cs="Segoe UI"/>
-          <w:color w:val="1F2328"/>
-          <w:kern w:val="0"/>
+          <w:rFonts w:ascii="Arial" w:eastAsia="Times New Roman" w:hAnsi="Arial" w:cs="Arial"/>
+          <w:color w:val="1F2328"/>
+          <w:kern w:val="0"/>
+          <w:sz w:val="28"/>
+          <w:szCs w:val="28"/>
           <w:lang w:eastAsia="en-ZA"/>
           <w14:ligatures w14:val="none"/>
         </w:rPr>
@@ -2315,9 +2514,11 @@
       <w:hyperlink r:id="rId19" w:history="1">
         <w:r>
           <w:rPr>
-            <w:rFonts w:ascii="Segoe UI" w:eastAsia="Times New Roman" w:hAnsi="Segoe UI" w:cs="Segoe UI"/>
+            <w:rFonts w:ascii="Arial" w:eastAsia="Times New Roman" w:hAnsi="Arial" w:cs="Arial"/>
             <w:color w:val="0969DA"/>
             <w:kern w:val="0"/>
+            <w:sz w:val="28"/>
+            <w:szCs w:val="28"/>
             <w:u w:val="single"/>
             <w:lang w:eastAsia="en-ZA"/>
             <w14:ligatures w14:val="none"/>
@@ -2335,18 +2536,22 @@
         <w:shd w:val="clear" w:color="auto" w:fill="FFFFFF"/>
         <w:spacing w:before="60" w:after="100" w:afterAutospacing="1" w:line="240" w:lineRule="auto"/>
         <w:rPr>
-          <w:rFonts w:ascii="Segoe UI" w:eastAsia="Times New Roman" w:hAnsi="Segoe UI" w:cs="Segoe UI"/>
-          <w:color w:val="1F2328"/>
-          <w:kern w:val="0"/>
-          <w:lang w:eastAsia="en-ZA"/>
-          <w14:ligatures w14:val="none"/>
-        </w:rPr>
-      </w:pPr>
-      <w:r>
-        <w:rPr>
-          <w:rFonts w:ascii="Segoe UI" w:eastAsia="Times New Roman" w:hAnsi="Segoe UI" w:cs="Segoe UI"/>
-          <w:color w:val="1F2328"/>
-          <w:kern w:val="0"/>
+          <w:rFonts w:ascii="Arial" w:eastAsia="Times New Roman" w:hAnsi="Arial" w:cs="Arial"/>
+          <w:color w:val="1F2328"/>
+          <w:kern w:val="0"/>
+          <w:sz w:val="28"/>
+          <w:szCs w:val="28"/>
+          <w:lang w:eastAsia="en-ZA"/>
+          <w14:ligatures w14:val="none"/>
+        </w:rPr>
+      </w:pPr>
+      <w:r>
+        <w:rPr>
+          <w:rFonts w:ascii="Arial" w:eastAsia="Times New Roman" w:hAnsi="Arial" w:cs="Arial"/>
+          <w:color w:val="1F2328"/>
+          <w:kern w:val="0"/>
+          <w:sz w:val="28"/>
+          <w:szCs w:val="28"/>
           <w:lang w:eastAsia="en-ZA"/>
           <w14:ligatures w14:val="none"/>
         </w:rPr>
@@ -2362,18 +2567,22 @@
         <w:shd w:val="clear" w:color="auto" w:fill="FFFFFF"/>
         <w:spacing w:before="60" w:after="100" w:afterAutospacing="1" w:line="240" w:lineRule="auto"/>
         <w:rPr>
-          <w:rFonts w:ascii="Segoe UI" w:eastAsia="Times New Roman" w:hAnsi="Segoe UI" w:cs="Segoe UI"/>
-          <w:color w:val="1F2328"/>
-          <w:kern w:val="0"/>
-          <w:lang w:eastAsia="en-ZA"/>
-          <w14:ligatures w14:val="none"/>
-        </w:rPr>
-      </w:pPr>
-      <w:r>
-        <w:rPr>
-          <w:rFonts w:ascii="Segoe UI" w:eastAsia="Times New Roman" w:hAnsi="Segoe UI" w:cs="Segoe UI"/>
-          <w:color w:val="1F2328"/>
-          <w:kern w:val="0"/>
+          <w:rFonts w:ascii="Arial" w:eastAsia="Times New Roman" w:hAnsi="Arial" w:cs="Arial"/>
+          <w:color w:val="1F2328"/>
+          <w:kern w:val="0"/>
+          <w:sz w:val="28"/>
+          <w:szCs w:val="28"/>
+          <w:lang w:eastAsia="en-ZA"/>
+          <w14:ligatures w14:val="none"/>
+        </w:rPr>
+      </w:pPr>
+      <w:r>
+        <w:rPr>
+          <w:rFonts w:ascii="Arial" w:eastAsia="Times New Roman" w:hAnsi="Arial" w:cs="Arial"/>
+          <w:color w:val="1F2328"/>
+          <w:kern w:val="0"/>
+          <w:sz w:val="28"/>
+          <w:szCs w:val="28"/>
           <w:lang w:eastAsia="en-ZA"/>
           <w14:ligatures w14:val="none"/>
         </w:rPr>
@@ -2389,18 +2598,22 @@
         <w:shd w:val="clear" w:color="auto" w:fill="FFFFFF"/>
         <w:spacing w:before="60" w:after="100" w:afterAutospacing="1" w:line="240" w:lineRule="auto"/>
         <w:rPr>
-          <w:rFonts w:ascii="Segoe UI" w:eastAsia="Times New Roman" w:hAnsi="Segoe UI" w:cs="Segoe UI"/>
-          <w:color w:val="1F2328"/>
-          <w:kern w:val="0"/>
-          <w:lang w:eastAsia="en-ZA"/>
-          <w14:ligatures w14:val="none"/>
-        </w:rPr>
-      </w:pPr>
-      <w:r>
-        <w:rPr>
-          <w:rFonts w:ascii="Segoe UI" w:eastAsia="Times New Roman" w:hAnsi="Segoe UI" w:cs="Segoe UI"/>
-          <w:color w:val="1F2328"/>
-          <w:kern w:val="0"/>
+          <w:rFonts w:ascii="Arial" w:eastAsia="Times New Roman" w:hAnsi="Arial" w:cs="Arial"/>
+          <w:color w:val="1F2328"/>
+          <w:kern w:val="0"/>
+          <w:sz w:val="28"/>
+          <w:szCs w:val="28"/>
+          <w:lang w:eastAsia="en-ZA"/>
+          <w14:ligatures w14:val="none"/>
+        </w:rPr>
+      </w:pPr>
+      <w:r>
+        <w:rPr>
+          <w:rFonts w:ascii="Arial" w:eastAsia="Times New Roman" w:hAnsi="Arial" w:cs="Arial"/>
+          <w:color w:val="1F2328"/>
+          <w:kern w:val="0"/>
+          <w:sz w:val="28"/>
+          <w:szCs w:val="28"/>
           <w:lang w:eastAsia="en-ZA"/>
           <w14:ligatures w14:val="none"/>
         </w:rPr>
@@ -2413,13 +2626,13 @@
         <w:spacing w:before="360" w:after="240" w:line="240" w:lineRule="auto"/>
         <w:outlineLvl w:val="1"/>
         <w:rPr>
-          <w:rFonts w:ascii="Segoe UI" w:eastAsia="Times New Roman" w:hAnsi="Segoe UI" w:cs="Segoe UI"/>
+          <w:rFonts w:ascii="Arial" w:eastAsia="Times New Roman" w:hAnsi="Arial" w:cs="Arial"/>
           <w:b/>
           <w:bCs/>
           <w:color w:val="1F2328"/>
           <w:kern w:val="0"/>
-          <w:sz w:val="36"/>
-          <w:szCs w:val="36"/>
+          <w:sz w:val="28"/>
+          <w:szCs w:val="28"/>
           <w:lang w:eastAsia="en-ZA"/>
           <w14:ligatures w14:val="none"/>
         </w:rPr>
@@ -2431,8 +2644,8 @@
           <w:bCs/>
           <w:color w:val="1F2328"/>
           <w:kern w:val="0"/>
-          <w:sz w:val="36"/>
-          <w:szCs w:val="36"/>
+          <w:sz w:val="28"/>
+          <w:szCs w:val="28"/>
           <w:lang w:eastAsia="en-ZA"/>
           <w14:ligatures w14:val="none"/>
         </w:rPr>
@@ -2440,13 +2653,13 @@
       </w:r>
       <w:r>
         <w:rPr>
-          <w:rFonts w:ascii="Segoe UI" w:eastAsia="Times New Roman" w:hAnsi="Segoe UI" w:cs="Segoe UI"/>
+          <w:rFonts w:ascii="Arial" w:eastAsia="Times New Roman" w:hAnsi="Arial" w:cs="Arial"/>
           <w:b/>
           <w:bCs/>
           <w:color w:val="1F2328"/>
           <w:kern w:val="0"/>
-          <w:sz w:val="36"/>
-          <w:szCs w:val="36"/>
+          <w:sz w:val="28"/>
+          <w:szCs w:val="28"/>
           <w:lang w:eastAsia="en-ZA"/>
           <w14:ligatures w14:val="none"/>
         </w:rPr>
@@ -2462,18 +2675,22 @@
         <w:shd w:val="clear" w:color="auto" w:fill="FFFFFF"/>
         <w:spacing w:before="100" w:beforeAutospacing="1" w:after="100" w:afterAutospacing="1" w:line="240" w:lineRule="auto"/>
         <w:rPr>
-          <w:rFonts w:ascii="Segoe UI" w:eastAsia="Times New Roman" w:hAnsi="Segoe UI" w:cs="Segoe UI"/>
-          <w:color w:val="1F2328"/>
-          <w:kern w:val="0"/>
-          <w:lang w:eastAsia="en-ZA"/>
-          <w14:ligatures w14:val="none"/>
-        </w:rPr>
-      </w:pPr>
-      <w:r>
-        <w:rPr>
-          <w:rFonts w:ascii="Segoe UI" w:eastAsia="Times New Roman" w:hAnsi="Segoe UI" w:cs="Segoe UI"/>
-          <w:color w:val="1F2328"/>
-          <w:kern w:val="0"/>
+          <w:rFonts w:ascii="Arial" w:eastAsia="Times New Roman" w:hAnsi="Arial" w:cs="Arial"/>
+          <w:color w:val="1F2328"/>
+          <w:kern w:val="0"/>
+          <w:sz w:val="28"/>
+          <w:szCs w:val="28"/>
+          <w:lang w:eastAsia="en-ZA"/>
+          <w14:ligatures w14:val="none"/>
+        </w:rPr>
+      </w:pPr>
+      <w:r>
+        <w:rPr>
+          <w:rFonts w:ascii="Arial" w:eastAsia="Times New Roman" w:hAnsi="Arial" w:cs="Arial"/>
+          <w:color w:val="1F2328"/>
+          <w:kern w:val="0"/>
+          <w:sz w:val="28"/>
+          <w:szCs w:val="28"/>
           <w:lang w:eastAsia="en-ZA"/>
           <w14:ligatures w14:val="none"/>
         </w:rPr>
@@ -2489,18 +2706,22 @@
         <w:shd w:val="clear" w:color="auto" w:fill="FFFFFF"/>
         <w:spacing w:before="60" w:after="100" w:afterAutospacing="1" w:line="240" w:lineRule="auto"/>
         <w:rPr>
-          <w:rFonts w:ascii="Segoe UI" w:eastAsia="Times New Roman" w:hAnsi="Segoe UI" w:cs="Segoe UI"/>
-          <w:color w:val="1F2328"/>
-          <w:kern w:val="0"/>
-          <w:lang w:eastAsia="en-ZA"/>
-          <w14:ligatures w14:val="none"/>
-        </w:rPr>
-      </w:pPr>
-      <w:r>
-        <w:rPr>
-          <w:rFonts w:ascii="Segoe UI" w:eastAsia="Times New Roman" w:hAnsi="Segoe UI" w:cs="Segoe UI"/>
-          <w:color w:val="1F2328"/>
-          <w:kern w:val="0"/>
+          <w:rFonts w:ascii="Arial" w:eastAsia="Times New Roman" w:hAnsi="Arial" w:cs="Arial"/>
+          <w:color w:val="1F2328"/>
+          <w:kern w:val="0"/>
+          <w:sz w:val="28"/>
+          <w:szCs w:val="28"/>
+          <w:lang w:eastAsia="en-ZA"/>
+          <w14:ligatures w14:val="none"/>
+        </w:rPr>
+      </w:pPr>
+      <w:r>
+        <w:rPr>
+          <w:rFonts w:ascii="Arial" w:eastAsia="Times New Roman" w:hAnsi="Arial" w:cs="Arial"/>
+          <w:color w:val="1F2328"/>
+          <w:kern w:val="0"/>
+          <w:sz w:val="28"/>
+          <w:szCs w:val="28"/>
           <w:lang w:eastAsia="en-ZA"/>
           <w14:ligatures w14:val="none"/>
         </w:rPr>
@@ -2516,18 +2737,22 @@
         <w:shd w:val="clear" w:color="auto" w:fill="FFFFFF"/>
         <w:spacing w:before="60" w:after="100" w:afterAutospacing="1" w:line="240" w:lineRule="auto"/>
         <w:rPr>
-          <w:rFonts w:ascii="Segoe UI" w:eastAsia="Times New Roman" w:hAnsi="Segoe UI" w:cs="Segoe UI"/>
-          <w:color w:val="1F2328"/>
-          <w:kern w:val="0"/>
-          <w:lang w:eastAsia="en-ZA"/>
-          <w14:ligatures w14:val="none"/>
-        </w:rPr>
-      </w:pPr>
-      <w:r>
-        <w:rPr>
-          <w:rFonts w:ascii="Segoe UI" w:eastAsia="Times New Roman" w:hAnsi="Segoe UI" w:cs="Segoe UI"/>
-          <w:color w:val="1F2328"/>
-          <w:kern w:val="0"/>
+          <w:rFonts w:ascii="Arial" w:eastAsia="Times New Roman" w:hAnsi="Arial" w:cs="Arial"/>
+          <w:color w:val="1F2328"/>
+          <w:kern w:val="0"/>
+          <w:sz w:val="28"/>
+          <w:szCs w:val="28"/>
+          <w:lang w:eastAsia="en-ZA"/>
+          <w14:ligatures w14:val="none"/>
+        </w:rPr>
+      </w:pPr>
+      <w:r>
+        <w:rPr>
+          <w:rFonts w:ascii="Arial" w:eastAsia="Times New Roman" w:hAnsi="Arial" w:cs="Arial"/>
+          <w:color w:val="1F2328"/>
+          <w:kern w:val="0"/>
+          <w:sz w:val="28"/>
+          <w:szCs w:val="28"/>
           <w:lang w:eastAsia="en-ZA"/>
           <w14:ligatures w14:val="none"/>
         </w:rPr>
@@ -2540,13 +2765,13 @@
         <w:spacing w:before="360" w:after="240" w:line="240" w:lineRule="auto"/>
         <w:outlineLvl w:val="1"/>
         <w:rPr>
-          <w:rFonts w:ascii="Segoe UI" w:eastAsia="Times New Roman" w:hAnsi="Segoe UI" w:cs="Segoe UI"/>
+          <w:rFonts w:ascii="Arial" w:eastAsia="Times New Roman" w:hAnsi="Arial" w:cs="Arial"/>
           <w:b/>
           <w:bCs/>
           <w:color w:val="1F2328"/>
           <w:kern w:val="0"/>
-          <w:sz w:val="36"/>
-          <w:szCs w:val="36"/>
+          <w:sz w:val="28"/>
+          <w:szCs w:val="28"/>
           <w:lang w:eastAsia="en-ZA"/>
           <w14:ligatures w14:val="none"/>
         </w:rPr>
@@ -2558,8 +2783,8 @@
           <w:bCs/>
           <w:color w:val="1F2328"/>
           <w:kern w:val="0"/>
-          <w:sz w:val="36"/>
-          <w:szCs w:val="36"/>
+          <w:sz w:val="28"/>
+          <w:szCs w:val="28"/>
           <w:lang w:eastAsia="en-ZA"/>
           <w14:ligatures w14:val="none"/>
         </w:rPr>
@@ -2567,13 +2792,13 @@
       </w:r>
       <w:r>
         <w:rPr>
-          <w:rFonts w:ascii="Segoe UI" w:eastAsia="Times New Roman" w:hAnsi="Segoe UI" w:cs="Segoe UI"/>
+          <w:rFonts w:ascii="Arial" w:eastAsia="Times New Roman" w:hAnsi="Arial" w:cs="Arial"/>
           <w:b/>
           <w:bCs/>
           <w:color w:val="1F2328"/>
           <w:kern w:val="0"/>
-          <w:sz w:val="36"/>
-          <w:szCs w:val="36"/>
+          <w:sz w:val="28"/>
+          <w:szCs w:val="28"/>
           <w:lang w:eastAsia="en-ZA"/>
           <w14:ligatures w14:val="none"/>
         </w:rPr>
@@ -2586,8 +2811,8 @@
           <w:bCs/>
           <w:color w:val="1F2328"/>
           <w:kern w:val="0"/>
-          <w:sz w:val="36"/>
-          <w:szCs w:val="36"/>
+          <w:sz w:val="28"/>
+          <w:szCs w:val="28"/>
           <w:lang w:eastAsia="en-ZA"/>
           <w14:ligatures w14:val="none"/>
         </w:rPr>
@@ -2595,13 +2820,13 @@
       </w:r>
       <w:r>
         <w:rPr>
-          <w:rFonts w:ascii="Segoe UI" w:eastAsia="Times New Roman" w:hAnsi="Segoe UI" w:cs="Segoe UI"/>
+          <w:rFonts w:ascii="Arial" w:eastAsia="Times New Roman" w:hAnsi="Arial" w:cs="Arial"/>
           <w:b/>
           <w:bCs/>
           <w:color w:val="1F2328"/>
           <w:kern w:val="0"/>
-          <w:sz w:val="36"/>
-          <w:szCs w:val="36"/>
+          <w:sz w:val="28"/>
+          <w:szCs w:val="28"/>
           <w:lang w:eastAsia="en-ZA"/>
           <w14:ligatures w14:val="none"/>
         </w:rPr>
@@ -2613,18 +2838,22 @@
         <w:shd w:val="clear" w:color="auto" w:fill="FFFFFF"/>
         <w:spacing w:after="240" w:line="240" w:lineRule="auto"/>
         <w:rPr>
-          <w:rFonts w:ascii="Segoe UI" w:eastAsia="Times New Roman" w:hAnsi="Segoe UI" w:cs="Segoe UI"/>
-          <w:color w:val="1F2328"/>
-          <w:kern w:val="0"/>
-          <w:lang w:eastAsia="en-ZA"/>
-          <w14:ligatures w14:val="none"/>
-        </w:rPr>
-      </w:pPr>
-      <w:r>
-        <w:rPr>
-          <w:rFonts w:ascii="Segoe UI" w:eastAsia="Times New Roman" w:hAnsi="Segoe UI" w:cs="Segoe UI"/>
-          <w:color w:val="1F2328"/>
-          <w:kern w:val="0"/>
+          <w:rFonts w:ascii="Arial" w:eastAsia="Times New Roman" w:hAnsi="Arial" w:cs="Arial"/>
+          <w:color w:val="1F2328"/>
+          <w:kern w:val="0"/>
+          <w:sz w:val="28"/>
+          <w:szCs w:val="28"/>
+          <w:lang w:eastAsia="en-ZA"/>
+          <w14:ligatures w14:val="none"/>
+        </w:rPr>
+      </w:pPr>
+      <w:r>
+        <w:rPr>
+          <w:rFonts w:ascii="Arial" w:eastAsia="Times New Roman" w:hAnsi="Arial" w:cs="Arial"/>
+          <w:color w:val="1F2328"/>
+          <w:kern w:val="0"/>
+          <w:sz w:val="28"/>
+          <w:szCs w:val="28"/>
           <w:lang w:eastAsia="en-ZA"/>
           <w14:ligatures w14:val="none"/>
         </w:rPr>
@@ -2637,13 +2866,13 @@
         <w:spacing w:before="360" w:after="240" w:line="240" w:lineRule="auto"/>
         <w:outlineLvl w:val="1"/>
         <w:rPr>
-          <w:rFonts w:ascii="Segoe UI" w:eastAsia="Times New Roman" w:hAnsi="Segoe UI" w:cs="Segoe UI"/>
+          <w:rFonts w:ascii="Arial" w:eastAsia="Times New Roman" w:hAnsi="Arial" w:cs="Arial"/>
           <w:b/>
           <w:bCs/>
           <w:color w:val="1F2328"/>
           <w:kern w:val="0"/>
-          <w:sz w:val="36"/>
-          <w:szCs w:val="36"/>
+          <w:sz w:val="28"/>
+          <w:szCs w:val="28"/>
           <w:lang w:eastAsia="en-ZA"/>
           <w14:ligatures w14:val="none"/>
         </w:rPr>
@@ -2655,8 +2884,8 @@
           <w:bCs/>
           <w:color w:val="1F2328"/>
           <w:kern w:val="0"/>
-          <w:sz w:val="36"/>
-          <w:szCs w:val="36"/>
+          <w:sz w:val="28"/>
+          <w:szCs w:val="28"/>
           <w:lang w:eastAsia="en-ZA"/>
           <w14:ligatures w14:val="none"/>
         </w:rPr>
@@ -2664,13 +2893,13 @@
       </w:r>
       <w:r>
         <w:rPr>
-          <w:rFonts w:ascii="Segoe UI" w:eastAsia="Times New Roman" w:hAnsi="Segoe UI" w:cs="Segoe UI"/>
+          <w:rFonts w:ascii="Arial" w:eastAsia="Times New Roman" w:hAnsi="Arial" w:cs="Arial"/>
           <w:b/>
           <w:bCs/>
           <w:color w:val="1F2328"/>
           <w:kern w:val="0"/>
-          <w:sz w:val="36"/>
-          <w:szCs w:val="36"/>
+          <w:sz w:val="28"/>
+          <w:szCs w:val="28"/>
           <w:lang w:eastAsia="en-ZA"/>
           <w14:ligatures w14:val="none"/>
         </w:rPr>
@@ -2682,25 +2911,239 @@
         <w:shd w:val="clear" w:color="auto" w:fill="FFFFFF"/>
         <w:spacing w:after="0" w:line="240" w:lineRule="auto"/>
         <w:rPr>
-          <w:rFonts w:ascii="Segoe UI" w:eastAsia="Times New Roman" w:hAnsi="Segoe UI" w:cs="Segoe UI"/>
-          <w:color w:val="1F2328"/>
-          <w:kern w:val="0"/>
-          <w:lang w:eastAsia="en-ZA"/>
-          <w14:ligatures w14:val="none"/>
-        </w:rPr>
-      </w:pPr>
-      <w:r>
-        <w:rPr>
-          <w:rFonts w:ascii="Segoe UI" w:eastAsia="Times New Roman" w:hAnsi="Segoe UI" w:cs="Segoe UI"/>
-          <w:color w:val="1F2328"/>
-          <w:kern w:val="0"/>
+          <w:rFonts w:ascii="Arial" w:eastAsia="Times New Roman" w:hAnsi="Arial" w:cs="Arial"/>
+          <w:color w:val="1F2328"/>
+          <w:kern w:val="0"/>
+          <w:sz w:val="28"/>
+          <w:szCs w:val="28"/>
+          <w:lang w:eastAsia="en-ZA"/>
+          <w14:ligatures w14:val="none"/>
+        </w:rPr>
+      </w:pPr>
+      <w:r>
+        <w:rPr>
+          <w:rFonts w:ascii="Arial" w:eastAsia="Times New Roman" w:hAnsi="Arial" w:cs="Arial"/>
+          <w:color w:val="1F2328"/>
+          <w:kern w:val="0"/>
+          <w:sz w:val="28"/>
+          <w:szCs w:val="28"/>
           <w:lang w:eastAsia="en-ZA"/>
           <w14:ligatures w14:val="none"/>
         </w:rPr>
         <w:t>This project is for educational purposes.</w:t>
       </w:r>
     </w:p>
-    <w:p/>
+    <w:p>
+      <w:pPr>
+        <w:rPr>
+          <w:rFonts w:ascii="Arial" w:hAnsi="Arial" w:cs="Arial"/>
+          <w:sz w:val="28"/>
+          <w:szCs w:val="28"/>
+        </w:rPr>
+      </w:pPr>
+    </w:p>
+    <w:p>
+      <w:pPr>
+        <w:rPr>
+          <w:rFonts w:ascii="Arial" w:hAnsi="Arial" w:cs="Arial"/>
+          <w:sz w:val="28"/>
+          <w:szCs w:val="28"/>
+        </w:rPr>
+      </w:pPr>
+    </w:p>
+    <w:p>
+      <w:pPr>
+        <w:rPr>
+          <w:rFonts w:ascii="Arial" w:hAnsi="Arial" w:cs="Arial"/>
+          <w:sz w:val="28"/>
+          <w:szCs w:val="28"/>
+        </w:rPr>
+      </w:pPr>
+    </w:p>
+    <w:p>
+      <w:pPr>
+        <w:rPr>
+          <w:rFonts w:ascii="Arial" w:hAnsi="Arial" w:cs="Arial"/>
+          <w:sz w:val="28"/>
+          <w:szCs w:val="28"/>
+        </w:rPr>
+      </w:pPr>
+    </w:p>
+    <w:p>
+      <w:pPr>
+        <w:rPr>
+          <w:rFonts w:ascii="Arial" w:hAnsi="Arial" w:cs="Arial"/>
+          <w:sz w:val="28"/>
+          <w:szCs w:val="28"/>
+        </w:rPr>
+      </w:pPr>
+    </w:p>
+    <w:p>
+      <w:pPr>
+        <w:rPr>
+          <w:rFonts w:ascii="Arial" w:hAnsi="Arial" w:cs="Arial"/>
+          <w:sz w:val="28"/>
+          <w:szCs w:val="28"/>
+        </w:rPr>
+      </w:pPr>
+    </w:p>
+    <w:p>
+      <w:pPr>
+        <w:rPr>
+          <w:rFonts w:ascii="Arial" w:hAnsi="Arial" w:cs="Arial"/>
+          <w:sz w:val="28"/>
+          <w:szCs w:val="28"/>
+        </w:rPr>
+      </w:pPr>
+    </w:p>
+    <w:p>
+      <w:pPr>
+        <w:rPr>
+          <w:rFonts w:ascii="Arial" w:hAnsi="Arial" w:cs="Arial"/>
+          <w:sz w:val="28"/>
+          <w:szCs w:val="28"/>
+        </w:rPr>
+      </w:pPr>
+    </w:p>
+    <w:p>
+      <w:pPr>
+        <w:rPr>
+          <w:rFonts w:ascii="Arial" w:hAnsi="Arial" w:cs="Arial"/>
+          <w:sz w:val="28"/>
+          <w:szCs w:val="28"/>
+        </w:rPr>
+      </w:pPr>
+    </w:p>
+    <w:p>
+      <w:pPr>
+        <w:rPr>
+          <w:rFonts w:ascii="Arial" w:hAnsi="Arial" w:cs="Arial"/>
+          <w:sz w:val="28"/>
+          <w:szCs w:val="28"/>
+        </w:rPr>
+      </w:pPr>
+    </w:p>
+    <w:p>
+      <w:pPr>
+        <w:rPr>
+          <w:rFonts w:ascii="Arial" w:hAnsi="Arial" w:cs="Arial"/>
+          <w:sz w:val="28"/>
+          <w:szCs w:val="28"/>
+        </w:rPr>
+      </w:pPr>
+    </w:p>
+    <w:p>
+      <w:pPr>
+        <w:rPr>
+          <w:rFonts w:ascii="Arial" w:hAnsi="Arial" w:cs="Arial"/>
+          <w:sz w:val="28"/>
+          <w:szCs w:val="28"/>
+        </w:rPr>
+      </w:pPr>
+    </w:p>
+    <w:p>
+      <w:pPr>
+        <w:rPr>
+          <w:rFonts w:ascii="Arial" w:hAnsi="Arial" w:cs="Arial"/>
+          <w:sz w:val="28"/>
+          <w:szCs w:val="28"/>
+        </w:rPr>
+      </w:pPr>
+    </w:p>
+    <w:p>
+      <w:pPr>
+        <w:rPr>
+          <w:rFonts w:ascii="Arial" w:hAnsi="Arial" w:cs="Arial"/>
+          <w:sz w:val="28"/>
+          <w:szCs w:val="28"/>
+        </w:rPr>
+      </w:pPr>
+    </w:p>
+    <w:p>
+      <w:pPr>
+        <w:rPr>
+          <w:rFonts w:ascii="Arial" w:hAnsi="Arial" w:cs="Arial"/>
+          <w:sz w:val="28"/>
+          <w:szCs w:val="28"/>
+        </w:rPr>
+      </w:pPr>
+    </w:p>
+    <w:p>
+      <w:pPr>
+        <w:rPr>
+          <w:rFonts w:ascii="Arial" w:hAnsi="Arial" w:cs="Arial"/>
+          <w:sz w:val="28"/>
+          <w:szCs w:val="28"/>
+        </w:rPr>
+      </w:pPr>
+    </w:p>
+    <w:p>
+      <w:pPr>
+        <w:rPr>
+          <w:rFonts w:ascii="Arial" w:hAnsi="Arial" w:cs="Arial"/>
+          <w:b/>
+          <w:bCs/>
+          <w:sz w:val="28"/>
+          <w:szCs w:val="28"/>
+          <w:u w:val="single"/>
+        </w:rPr>
+      </w:pPr>
+      <w:r>
+        <w:rPr>
+          <w:rFonts w:ascii="Arial" w:hAnsi="Arial" w:cs="Arial"/>
+          <w:b/>
+          <w:bCs/>
+          <w:sz w:val="28"/>
+          <w:szCs w:val="28"/>
+          <w:u w:val="single"/>
+        </w:rPr>
+        <w:lastRenderedPageBreak/>
+        <w:t>GITHUB LINK</w:t>
+      </w:r>
+    </w:p>
+    <w:p>
+      <w:pPr>
+        <w:rPr>
+          <w:rFonts w:ascii="Arial" w:hAnsi="Arial" w:cs="Arial"/>
+          <w:sz w:val="28"/>
+          <w:szCs w:val="28"/>
+        </w:rPr>
+      </w:pPr>
+      <w:hyperlink r:id="rId20" w:history="1">
+        <w:r>
+          <w:rPr>
+            <w:rStyle w:val="Hyperlink"/>
+            <w:rFonts w:ascii="Arial" w:hAnsi="Arial" w:cs="Arial"/>
+            <w:sz w:val="28"/>
+            <w:szCs w:val="28"/>
+          </w:rPr>
+          <w:t>https://github.com/VNaidoo-DEV/VIRAATNAIDOOIMADASSIGNMENT2</w:t>
+        </w:r>
+      </w:hyperlink>
+    </w:p>
+    <w:p>
+      <w:pPr>
+        <w:rPr>
+          <w:rFonts w:ascii="Arial" w:hAnsi="Arial" w:cs="Arial"/>
+          <w:b/>
+          <w:bCs/>
+          <w:sz w:val="28"/>
+          <w:szCs w:val="28"/>
+          <w:u w:val="single"/>
+        </w:rPr>
+      </w:pPr>
+      <w:r>
+        <w:rPr>
+          <w:rFonts w:ascii="Arial" w:hAnsi="Arial" w:cs="Arial"/>
+          <w:b/>
+          <w:bCs/>
+          <w:sz w:val="28"/>
+          <w:szCs w:val="28"/>
+          <w:u w:val="single"/>
+        </w:rPr>
+        <w:t>YOUTUBE LINK</w:t>
+      </w:r>
+    </w:p>
     <w:sectPr>
       <w:pgSz w:w="11906" w:h="16838"/>
       <w:pgMar w:top="720" w:right="720" w:bottom="720" w:left="720" w:header="708" w:footer="708" w:gutter="0"/>
@@ -5081,6 +5524,29 @@
       <w:spacing w:val="5"/>
     </w:rPr>
   </w:style>
+  <w:style w:type="character" w:styleId="Hyperlink">
+    <w:name w:val="Hyperlink"/>
+    <w:basedOn w:val="DefaultParagraphFont"/>
+    <w:uiPriority w:val="99"/>
+    <w:unhideWhenUsed/>
+    <w:rsid w:val="009B77EF"/>
+    <w:rPr>
+      <w:color w:val="467886" w:themeColor="hyperlink"/>
+      <w:u w:val="single"/>
+    </w:rPr>
+  </w:style>
+  <w:style w:type="character" w:styleId="UnresolvedMention">
+    <w:name w:val="Unresolved Mention"/>
+    <w:basedOn w:val="DefaultParagraphFont"/>
+    <w:uiPriority w:val="99"/>
+    <w:semiHidden/>
+    <w:unhideWhenUsed/>
+    <w:rsid w:val="009B77EF"/>
+    <w:rPr>
+      <w:color w:val="605E5C"/>
+      <w:shd w:val="clear" w:color="auto" w:fill="E1DFDD"/>
+    </w:rPr>
+  </w:style>
 </w:styles>
 </file>
 

</xml_diff>

<commit_message>
Added Github Link, Youtube Link nd References
</commit_message>
<xml_diff>
--- a/ReadME.docx
+++ b/ReadME.docx
@@ -517,6 +517,7 @@
           <w:rFonts w:ascii="Arial" w:eastAsia="Times New Roman" w:hAnsi="Arial" w:cs="Arial"/>
           <w:b/>
           <w:bCs/>
+          <w:noProof/>
           <w:color w:val="1F2328"/>
           <w:kern w:val="36"/>
           <w:sz w:val="28"/>
@@ -529,7 +530,7 @@
             <wp:extent cx="2788920" cy="4075640"/>
             <wp:effectExtent l="0" t="0" r="0" b="1270"/>
             <wp:docPr id="418869628" name="Picture 14" descr="FlashCardScore Screen">
-              <a:hlinkClick xmlns:a="http://schemas.openxmlformats.org/drawingml/2006/main" r:id="rId5" tgtFrame="&quot;_blank&quot;"/>
+              <a:hlinkClick xmlns:a="http://schemas.openxmlformats.org/drawingml/2006/main" r:id="rId6" tgtFrame="&quot;_blank&quot;"/>
             </wp:docPr>
             <wp:cNvGraphicFramePr>
               <a:graphicFrameLocks xmlns:a="http://schemas.openxmlformats.org/drawingml/2006/main" noChangeAspect="1"/>
@@ -539,14 +540,14 @@
                 <pic:pic xmlns:pic="http://schemas.openxmlformats.org/drawingml/2006/picture">
                   <pic:nvPicPr>
                     <pic:cNvPr id="0" name="Picture 36" descr="FlashCardScore Screen">
-                      <a:hlinkClick r:id="rId5" tgtFrame="&quot;_blank&quot;"/>
+                      <a:hlinkClick r:id="rId6" tgtFrame="&quot;_blank&quot;"/>
                     </pic:cNvPr>
                     <pic:cNvPicPr>
                       <a:picLocks noChangeAspect="1" noChangeArrowheads="1"/>
                     </pic:cNvPicPr>
                   </pic:nvPicPr>
                   <pic:blipFill>
-                    <a:blip r:embed="rId6">
+                    <a:blip r:embed="rId7">
                       <a:extLst>
                         <a:ext uri="{28A0092B-C50C-407E-A947-70E740481C1C}">
                           <a14:useLocalDpi xmlns:a14="http://schemas.microsoft.com/office/drawing/2010/main" val="0"/>
@@ -641,6 +642,7 @@
           <w:rFonts w:ascii="Arial" w:eastAsia="Times New Roman" w:hAnsi="Arial" w:cs="Arial"/>
           <w:b/>
           <w:bCs/>
+          <w:noProof/>
           <w:color w:val="1F2328"/>
           <w:kern w:val="36"/>
           <w:sz w:val="28"/>
@@ -653,7 +655,7 @@
             <wp:extent cx="3383280" cy="2552700"/>
             <wp:effectExtent l="0" t="0" r="7620" b="0"/>
             <wp:docPr id="1650699877" name="Picture 13" descr="Quiz Screen ">
-              <a:hlinkClick xmlns:a="http://schemas.openxmlformats.org/drawingml/2006/main" r:id="rId7" tgtFrame="&quot;_blank&quot;"/>
+              <a:hlinkClick xmlns:a="http://schemas.openxmlformats.org/drawingml/2006/main" r:id="rId8" tgtFrame="&quot;_blank&quot;"/>
             </wp:docPr>
             <wp:cNvGraphicFramePr>
               <a:graphicFrameLocks xmlns:a="http://schemas.openxmlformats.org/drawingml/2006/main" noChangeAspect="1"/>
@@ -663,14 +665,14 @@
                 <pic:pic xmlns:pic="http://schemas.openxmlformats.org/drawingml/2006/picture">
                   <pic:nvPicPr>
                     <pic:cNvPr id="0" name="Picture 37" descr="Quiz Screen ">
-                      <a:hlinkClick r:id="rId7" tgtFrame="&quot;_blank&quot;"/>
+                      <a:hlinkClick r:id="rId8" tgtFrame="&quot;_blank&quot;"/>
                     </pic:cNvPr>
                     <pic:cNvPicPr>
                       <a:picLocks noChangeAspect="1" noChangeArrowheads="1"/>
                     </pic:cNvPicPr>
                   </pic:nvPicPr>
                   <pic:blipFill>
-                    <a:blip r:embed="rId8">
+                    <a:blip r:embed="rId9">
                       <a:extLst>
                         <a:ext uri="{28A0092B-C50C-407E-A947-70E740481C1C}">
                           <a14:useLocalDpi xmlns:a14="http://schemas.microsoft.com/office/drawing/2010/main" val="0"/>
@@ -921,6 +923,7 @@
           <w:rFonts w:ascii="Arial" w:eastAsia="Times New Roman" w:hAnsi="Arial" w:cs="Arial"/>
           <w:b/>
           <w:bCs/>
+          <w:noProof/>
           <w:color w:val="1F2328"/>
           <w:kern w:val="36"/>
           <w:sz w:val="28"/>
@@ -933,7 +936,7 @@
             <wp:extent cx="3352800" cy="2499360"/>
             <wp:effectExtent l="0" t="0" r="0" b="0"/>
             <wp:docPr id="2076297043" name="Picture 12" descr="Quiz Screen ">
-              <a:hlinkClick xmlns:a="http://schemas.openxmlformats.org/drawingml/2006/main" r:id="rId9" tgtFrame="&quot;_blank&quot;"/>
+              <a:hlinkClick xmlns:a="http://schemas.openxmlformats.org/drawingml/2006/main" r:id="rId10" tgtFrame="&quot;_blank&quot;"/>
             </wp:docPr>
             <wp:cNvGraphicFramePr>
               <a:graphicFrameLocks xmlns:a="http://schemas.openxmlformats.org/drawingml/2006/main" noChangeAspect="1"/>
@@ -943,14 +946,14 @@
                 <pic:pic xmlns:pic="http://schemas.openxmlformats.org/drawingml/2006/picture">
                   <pic:nvPicPr>
                     <pic:cNvPr id="0" name="Picture 38" descr="Quiz Screen ">
-                      <a:hlinkClick r:id="rId9" tgtFrame="&quot;_blank&quot;"/>
+                      <a:hlinkClick r:id="rId10" tgtFrame="&quot;_blank&quot;"/>
                     </pic:cNvPr>
                     <pic:cNvPicPr>
                       <a:picLocks noChangeAspect="1" noChangeArrowheads="1"/>
                     </pic:cNvPicPr>
                   </pic:nvPicPr>
                   <pic:blipFill>
-                    <a:blip r:embed="rId10">
+                    <a:blip r:embed="rId11">
                       <a:extLst>
                         <a:ext uri="{28A0092B-C50C-407E-A947-70E740481C1C}">
                           <a14:useLocalDpi xmlns:a14="http://schemas.microsoft.com/office/drawing/2010/main" val="0"/>
@@ -1042,6 +1045,7 @@
           <w:rFonts w:ascii="Arial" w:eastAsia="Times New Roman" w:hAnsi="Arial" w:cs="Arial"/>
           <w:b/>
           <w:bCs/>
+          <w:noProof/>
           <w:color w:val="1F2328"/>
           <w:kern w:val="36"/>
           <w:sz w:val="28"/>
@@ -1055,7 +1059,7 @@
             <wp:extent cx="3474720" cy="3063240"/>
             <wp:effectExtent l="0" t="0" r="0" b="3810"/>
             <wp:docPr id="169107674" name="Picture 11" descr="Quiz Screen">
-              <a:hlinkClick xmlns:a="http://schemas.openxmlformats.org/drawingml/2006/main" r:id="rId11" tgtFrame="&quot;_blank&quot;"/>
+              <a:hlinkClick xmlns:a="http://schemas.openxmlformats.org/drawingml/2006/main" r:id="rId12" tgtFrame="&quot;_blank&quot;"/>
             </wp:docPr>
             <wp:cNvGraphicFramePr>
               <a:graphicFrameLocks xmlns:a="http://schemas.openxmlformats.org/drawingml/2006/main" noChangeAspect="1"/>
@@ -1065,14 +1069,14 @@
                 <pic:pic xmlns:pic="http://schemas.openxmlformats.org/drawingml/2006/picture">
                   <pic:nvPicPr>
                     <pic:cNvPr id="0" name="Picture 39" descr="Quiz Screen">
-                      <a:hlinkClick r:id="rId11" tgtFrame="&quot;_blank&quot;"/>
+                      <a:hlinkClick r:id="rId12" tgtFrame="&quot;_blank&quot;"/>
                     </pic:cNvPr>
                     <pic:cNvPicPr>
                       <a:picLocks noChangeAspect="1" noChangeArrowheads="1"/>
                     </pic:cNvPicPr>
                   </pic:nvPicPr>
                   <pic:blipFill>
-                    <a:blip r:embed="rId12">
+                    <a:blip r:embed="rId13">
                       <a:extLst>
                         <a:ext uri="{28A0092B-C50C-407E-A947-70E740481C1C}">
                           <a14:useLocalDpi xmlns:a14="http://schemas.microsoft.com/office/drawing/2010/main" val="0"/>
@@ -1220,6 +1224,7 @@
           <w:rFonts w:ascii="Arial" w:eastAsia="Times New Roman" w:hAnsi="Arial" w:cs="Arial"/>
           <w:b/>
           <w:bCs/>
+          <w:noProof/>
           <w:color w:val="1F2328"/>
           <w:kern w:val="36"/>
           <w:sz w:val="28"/>
@@ -1232,7 +1237,7 @@
             <wp:extent cx="3017520" cy="1996440"/>
             <wp:effectExtent l="0" t="0" r="0" b="3810"/>
             <wp:docPr id="1321307331" name="Picture 10" descr="Score Screen">
-              <a:hlinkClick xmlns:a="http://schemas.openxmlformats.org/drawingml/2006/main" r:id="rId13" tgtFrame="&quot;_blank&quot;"/>
+              <a:hlinkClick xmlns:a="http://schemas.openxmlformats.org/drawingml/2006/main" r:id="rId14" tgtFrame="&quot;_blank&quot;"/>
             </wp:docPr>
             <wp:cNvGraphicFramePr>
               <a:graphicFrameLocks xmlns:a="http://schemas.openxmlformats.org/drawingml/2006/main" noChangeAspect="1"/>
@@ -1242,14 +1247,14 @@
                 <pic:pic xmlns:pic="http://schemas.openxmlformats.org/drawingml/2006/picture">
                   <pic:nvPicPr>
                     <pic:cNvPr id="0" name="Picture 40" descr="Score Screen">
-                      <a:hlinkClick r:id="rId13" tgtFrame="&quot;_blank&quot;"/>
+                      <a:hlinkClick r:id="rId14" tgtFrame="&quot;_blank&quot;"/>
                     </pic:cNvPr>
                     <pic:cNvPicPr>
                       <a:picLocks noChangeAspect="1" noChangeArrowheads="1"/>
                     </pic:cNvPicPr>
                   </pic:nvPicPr>
                   <pic:blipFill>
-                    <a:blip r:embed="rId14">
+                    <a:blip r:embed="rId15">
                       <a:extLst>
                         <a:ext uri="{28A0092B-C50C-407E-A947-70E740481C1C}">
                           <a14:useLocalDpi xmlns:a14="http://schemas.microsoft.com/office/drawing/2010/main" val="0"/>
@@ -1358,6 +1363,7 @@
           <w:rFonts w:ascii="Arial" w:eastAsia="Times New Roman" w:hAnsi="Arial" w:cs="Arial"/>
           <w:b/>
           <w:bCs/>
+          <w:noProof/>
           <w:color w:val="1F2328"/>
           <w:kern w:val="36"/>
           <w:sz w:val="28"/>
@@ -1371,7 +1377,7 @@
             <wp:extent cx="3489960" cy="6400800"/>
             <wp:effectExtent l="0" t="0" r="0" b="0"/>
             <wp:docPr id="1523682989" name="Picture 9" descr="Score Screen">
-              <a:hlinkClick xmlns:a="http://schemas.openxmlformats.org/drawingml/2006/main" r:id="rId15" tgtFrame="&quot;_blank&quot;"/>
+              <a:hlinkClick xmlns:a="http://schemas.openxmlformats.org/drawingml/2006/main" r:id="rId16" tgtFrame="&quot;_blank&quot;"/>
             </wp:docPr>
             <wp:cNvGraphicFramePr>
               <a:graphicFrameLocks xmlns:a="http://schemas.openxmlformats.org/drawingml/2006/main" noChangeAspect="1"/>
@@ -1381,14 +1387,14 @@
                 <pic:pic xmlns:pic="http://schemas.openxmlformats.org/drawingml/2006/picture">
                   <pic:nvPicPr>
                     <pic:cNvPr id="0" name="Picture 41" descr="Score Screen">
-                      <a:hlinkClick r:id="rId15" tgtFrame="&quot;_blank&quot;"/>
+                      <a:hlinkClick r:id="rId16" tgtFrame="&quot;_blank&quot;"/>
                     </pic:cNvPr>
                     <pic:cNvPicPr>
                       <a:picLocks noChangeAspect="1" noChangeArrowheads="1"/>
                     </pic:cNvPicPr>
                   </pic:nvPicPr>
                   <pic:blipFill>
-                    <a:blip r:embed="rId16">
+                    <a:blip r:embed="rId17">
                       <a:extLst>
                         <a:ext uri="{28A0092B-C50C-407E-A947-70E740481C1C}">
                           <a14:useLocalDpi xmlns:a14="http://schemas.microsoft.com/office/drawing/2010/main" val="0"/>
@@ -1464,6 +1470,7 @@
           <w:rFonts w:ascii="Arial" w:eastAsia="Times New Roman" w:hAnsi="Arial" w:cs="Arial"/>
           <w:b/>
           <w:bCs/>
+          <w:noProof/>
           <w:color w:val="1F2328"/>
           <w:kern w:val="36"/>
           <w:sz w:val="28"/>
@@ -1477,7 +1484,7 @@
             <wp:extent cx="3436620" cy="6393180"/>
             <wp:effectExtent l="0" t="0" r="0" b="7620"/>
             <wp:docPr id="1169663557" name="Picture 8" descr="Score Screen">
-              <a:hlinkClick xmlns:a="http://schemas.openxmlformats.org/drawingml/2006/main" r:id="rId17" tgtFrame="&quot;_blank&quot;"/>
+              <a:hlinkClick xmlns:a="http://schemas.openxmlformats.org/drawingml/2006/main" r:id="rId18" tgtFrame="&quot;_blank&quot;"/>
             </wp:docPr>
             <wp:cNvGraphicFramePr>
               <a:graphicFrameLocks xmlns:a="http://schemas.openxmlformats.org/drawingml/2006/main" noChangeAspect="1"/>
@@ -1487,14 +1494,14 @@
                 <pic:pic xmlns:pic="http://schemas.openxmlformats.org/drawingml/2006/picture">
                   <pic:nvPicPr>
                     <pic:cNvPr id="0" name="Picture 42" descr="Score Screen">
-                      <a:hlinkClick r:id="rId17" tgtFrame="&quot;_blank&quot;"/>
+                      <a:hlinkClick r:id="rId18" tgtFrame="&quot;_blank&quot;"/>
                     </pic:cNvPr>
                     <pic:cNvPicPr>
                       <a:picLocks noChangeAspect="1" noChangeArrowheads="1"/>
                     </pic:cNvPicPr>
                   </pic:nvPicPr>
                   <pic:blipFill>
-                    <a:blip r:embed="rId18">
+                    <a:blip r:embed="rId19">
                       <a:extLst>
                         <a:ext uri="{28A0092B-C50C-407E-A947-70E740481C1C}">
                           <a14:useLocalDpi xmlns:a14="http://schemas.microsoft.com/office/drawing/2010/main" val="0"/>
@@ -2494,7 +2501,7 @@
           <w14:ligatures w14:val="none"/>
         </w:rPr>
       </w:pPr>
-      <w:hyperlink r:id="rId19" w:history="1">
+      <w:hyperlink r:id="rId20" w:history="1">
         <w:r>
           <w:rPr>
             <w:rStyle w:val="Hyperlink"/>
@@ -3308,6 +3315,618 @@
           <w:szCs w:val="28"/>
         </w:rPr>
       </w:pPr>
+    </w:p>
+    <w:p>
+      <w:pPr>
+        <w:rPr>
+          <w:rFonts w:ascii="Arial" w:hAnsi="Arial" w:cs="Arial"/>
+          <w:sz w:val="28"/>
+          <w:szCs w:val="28"/>
+        </w:rPr>
+      </w:pPr>
+    </w:p>
+    <w:p>
+      <w:pPr>
+        <w:rPr>
+          <w:rFonts w:ascii="Arial" w:hAnsi="Arial" w:cs="Arial"/>
+          <w:sz w:val="28"/>
+          <w:szCs w:val="28"/>
+        </w:rPr>
+      </w:pPr>
+    </w:p>
+    <w:p>
+      <w:pPr>
+        <w:rPr>
+          <w:rFonts w:ascii="Arial" w:hAnsi="Arial" w:cs="Arial"/>
+          <w:sz w:val="28"/>
+          <w:szCs w:val="28"/>
+        </w:rPr>
+      </w:pPr>
+    </w:p>
+    <w:p>
+      <w:pPr>
+        <w:rPr>
+          <w:rFonts w:ascii="Arial" w:hAnsi="Arial" w:cs="Arial"/>
+          <w:sz w:val="28"/>
+          <w:szCs w:val="28"/>
+        </w:rPr>
+      </w:pPr>
+    </w:p>
+    <w:p>
+      <w:pPr>
+        <w:rPr>
+          <w:rFonts w:ascii="Arial" w:hAnsi="Arial" w:cs="Arial"/>
+          <w:sz w:val="28"/>
+          <w:szCs w:val="28"/>
+        </w:rPr>
+      </w:pPr>
+    </w:p>
+    <w:p>
+      <w:pPr>
+        <w:rPr>
+          <w:rFonts w:ascii="Arial" w:hAnsi="Arial" w:cs="Arial"/>
+          <w:sz w:val="28"/>
+          <w:szCs w:val="28"/>
+        </w:rPr>
+      </w:pPr>
+    </w:p>
+    <w:p>
+      <w:pPr>
+        <w:rPr>
+          <w:rFonts w:ascii="Arial" w:hAnsi="Arial" w:cs="Arial"/>
+          <w:sz w:val="28"/>
+          <w:szCs w:val="28"/>
+        </w:rPr>
+      </w:pPr>
+    </w:p>
+    <w:p>
+      <w:pPr>
+        <w:rPr>
+          <w:rFonts w:ascii="Arial" w:hAnsi="Arial" w:cs="Arial"/>
+          <w:sz w:val="28"/>
+          <w:szCs w:val="28"/>
+        </w:rPr>
+      </w:pPr>
+    </w:p>
+    <w:p>
+      <w:pPr>
+        <w:rPr>
+          <w:rFonts w:ascii="Arial" w:hAnsi="Arial" w:cs="Arial"/>
+          <w:sz w:val="28"/>
+          <w:szCs w:val="28"/>
+        </w:rPr>
+      </w:pPr>
+    </w:p>
+    <w:p>
+      <w:pPr>
+        <w:rPr>
+          <w:rFonts w:ascii="Arial" w:hAnsi="Arial" w:cs="Arial"/>
+          <w:b/>
+          <w:bCs/>
+          <w:sz w:val="32"/>
+          <w:szCs w:val="32"/>
+          <w:u w:val="single"/>
+        </w:rPr>
+      </w:pPr>
+      <w:r>
+        <w:rPr>
+          <w:rFonts w:ascii="Arial" w:hAnsi="Arial" w:cs="Arial"/>
+          <w:b/>
+          <w:bCs/>
+          <w:sz w:val="32"/>
+          <w:szCs w:val="32"/>
+          <w:u w:val="single"/>
+        </w:rPr>
+        <w:lastRenderedPageBreak/>
+        <w:t>GITHUB LINK</w:t>
+      </w:r>
+    </w:p>
+    <w:p>
+      <w:pPr>
+        <w:pStyle w:val="ListParagraph"/>
+        <w:numPr>
+          <w:ilvl w:val="0"/>
+          <w:numId w:val="38"/>
+        </w:numPr>
+        <w:rPr>
+          <w:rFonts w:ascii="Arial" w:hAnsi="Arial" w:cs="Arial"/>
+          <w:sz w:val="28"/>
+          <w:szCs w:val="28"/>
+        </w:rPr>
+      </w:pPr>
+      <w:hyperlink r:id="rId21" w:history="1">
+        <w:r>
+          <w:rPr>
+            <w:rStyle w:val="Hyperlink"/>
+            <w:rFonts w:ascii="Arial" w:hAnsi="Arial" w:cs="Arial"/>
+            <w:sz w:val="28"/>
+            <w:szCs w:val="28"/>
+          </w:rPr>
+          <w:t>https://github.com/VN</w:t>
+        </w:r>
+        <w:r>
+          <w:rPr>
+            <w:rStyle w:val="Hyperlink"/>
+            <w:rFonts w:ascii="Arial" w:hAnsi="Arial" w:cs="Arial"/>
+            <w:sz w:val="28"/>
+            <w:szCs w:val="28"/>
+          </w:rPr>
+          <w:t>a</w:t>
+        </w:r>
+        <w:r>
+          <w:rPr>
+            <w:rStyle w:val="Hyperlink"/>
+            <w:rFonts w:ascii="Arial" w:hAnsi="Arial" w:cs="Arial"/>
+            <w:sz w:val="28"/>
+            <w:szCs w:val="28"/>
+          </w:rPr>
+          <w:t>idoo-DEV/VIRAATNAIDOOIMADASSIGNMENT2</w:t>
+        </w:r>
+      </w:hyperlink>
+    </w:p>
+    <w:p>
+      <w:pPr>
+        <w:rPr>
+          <w:rFonts w:ascii="Arial" w:hAnsi="Arial" w:cs="Arial"/>
+          <w:b/>
+          <w:bCs/>
+          <w:sz w:val="32"/>
+          <w:szCs w:val="32"/>
+          <w:u w:val="single"/>
+        </w:rPr>
+      </w:pPr>
+      <w:r>
+        <w:rPr>
+          <w:rFonts w:ascii="Arial" w:hAnsi="Arial" w:cs="Arial"/>
+          <w:b/>
+          <w:bCs/>
+          <w:sz w:val="32"/>
+          <w:szCs w:val="32"/>
+          <w:u w:val="single"/>
+        </w:rPr>
+        <w:t>YOUTUBE LINK</w:t>
+      </w:r>
+    </w:p>
+    <w:p>
+      <w:pPr>
+        <w:pStyle w:val="ListParagraph"/>
+        <w:numPr>
+          <w:ilvl w:val="0"/>
+          <w:numId w:val="38"/>
+        </w:numPr>
+        <w:rPr>
+          <w:rFonts w:ascii="Arial" w:hAnsi="Arial" w:cs="Arial"/>
+          <w:sz w:val="28"/>
+          <w:szCs w:val="28"/>
+        </w:rPr>
+      </w:pPr>
+      <w:hyperlink r:id="rId22" w:history="1">
+        <w:r>
+          <w:rPr>
+            <w:rStyle w:val="Hyperlink"/>
+            <w:rFonts w:ascii="Arial" w:hAnsi="Arial" w:cs="Arial"/>
+            <w:sz w:val="28"/>
+            <w:szCs w:val="28"/>
+          </w:rPr>
+          <w:t>https://youtu</w:t>
+        </w:r>
+        <w:r>
+          <w:rPr>
+            <w:rStyle w:val="Hyperlink"/>
+            <w:rFonts w:ascii="Arial" w:hAnsi="Arial" w:cs="Arial"/>
+            <w:sz w:val="28"/>
+            <w:szCs w:val="28"/>
+          </w:rPr>
+          <w:t>.</w:t>
+        </w:r>
+        <w:r>
+          <w:rPr>
+            <w:rStyle w:val="Hyperlink"/>
+            <w:rFonts w:ascii="Arial" w:hAnsi="Arial" w:cs="Arial"/>
+            <w:sz w:val="28"/>
+            <w:szCs w:val="28"/>
+          </w:rPr>
+          <w:t>be/dui9zZ25xqU?si=XO5nnX94QitRh02b</w:t>
+        </w:r>
+      </w:hyperlink>
+    </w:p>
+    <w:p>
+      <w:pPr>
+        <w:rPr>
+          <w:rFonts w:ascii="Arial" w:hAnsi="Arial" w:cs="Arial"/>
+          <w:b/>
+          <w:bCs/>
+          <w:sz w:val="32"/>
+          <w:szCs w:val="32"/>
+          <w:u w:val="single"/>
+        </w:rPr>
+      </w:pPr>
+      <w:r>
+        <w:rPr>
+          <w:rFonts w:ascii="Arial" w:hAnsi="Arial" w:cs="Arial"/>
+          <w:b/>
+          <w:bCs/>
+          <w:sz w:val="32"/>
+          <w:szCs w:val="32"/>
+          <w:u w:val="single"/>
+        </w:rPr>
+        <w:t>REFERENCES</w:t>
+      </w:r>
+    </w:p>
+    <w:p>
+      <w:pPr>
+        <w:pStyle w:val="ListParagraph"/>
+        <w:numPr>
+          <w:ilvl w:val="0"/>
+          <w:numId w:val="39"/>
+        </w:numPr>
+        <w:rPr>
+          <w:rFonts w:ascii="Arial" w:hAnsi="Arial" w:cs="Arial"/>
+          <w:sz w:val="28"/>
+          <w:szCs w:val="28"/>
+        </w:rPr>
+      </w:pPr>
+      <w:sdt>
+        <w:sdtPr>
+          <w:rPr>
+            <w:rFonts w:ascii="Arial" w:hAnsi="Arial" w:cs="Arial"/>
+            <w:sz w:val="28"/>
+            <w:szCs w:val="28"/>
+          </w:rPr>
+          <w:id w:val="-1250508428"/>
+          <w:citation/>
+        </w:sdtPr>
+        <w:sdtContent>
+          <w:r>
+            <w:rPr>
+              <w:rFonts w:ascii="Arial" w:hAnsi="Arial" w:cs="Arial"/>
+              <w:sz w:val="28"/>
+              <w:szCs w:val="28"/>
+            </w:rPr>
+            <w:fldChar w:fldCharType="begin"/>
+          </w:r>
+          <w:r>
+            <w:rPr>
+              <w:rFonts w:ascii="Arial" w:hAnsi="Arial" w:cs="Arial"/>
+              <w:sz w:val="28"/>
+              <w:szCs w:val="28"/>
+            </w:rPr>
+            <w:instrText xml:space="preserve"> CITATION Gog262 \l 7177 </w:instrText>
+          </w:r>
+          <w:r>
+            <w:rPr>
+              <w:rFonts w:ascii="Arial" w:hAnsi="Arial" w:cs="Arial"/>
+              <w:sz w:val="28"/>
+              <w:szCs w:val="28"/>
+            </w:rPr>
+            <w:fldChar w:fldCharType="separate"/>
+          </w:r>
+          <w:r>
+            <w:rPr>
+              <w:rFonts w:ascii="Arial" w:hAnsi="Arial" w:cs="Arial"/>
+              <w:noProof/>
+              <w:sz w:val="28"/>
+              <w:szCs w:val="28"/>
+            </w:rPr>
+            <w:t>(IV, 2026)</w:t>
+          </w:r>
+          <w:r>
+            <w:rPr>
+              <w:rFonts w:ascii="Arial" w:hAnsi="Arial" w:cs="Arial"/>
+              <w:sz w:val="28"/>
+              <w:szCs w:val="28"/>
+            </w:rPr>
+            <w:fldChar w:fldCharType="end"/>
+          </w:r>
+        </w:sdtContent>
+      </w:sdt>
+      <w:r>
+        <w:rPr>
+          <w:rFonts w:ascii="Arial" w:hAnsi="Arial" w:cs="Arial"/>
+          <w:sz w:val="28"/>
+          <w:szCs w:val="28"/>
+        </w:rPr>
+        <w:t xml:space="preserve">: </w:t>
+      </w:r>
+      <w:hyperlink r:id="rId23" w:history="1">
+        <w:r>
+          <w:rPr>
+            <w:rStyle w:val="Hyperlink"/>
+            <w:rFonts w:ascii="Arial" w:hAnsi="Arial" w:cs="Arial"/>
+            <w:sz w:val="28"/>
+            <w:szCs w:val="28"/>
+          </w:rPr>
+          <w:t>https://chatgpt.com/share/69eb2892-75c8-83ea-be1d-7c44d37ef5a4</w:t>
+        </w:r>
+      </w:hyperlink>
+    </w:p>
+    <w:p>
+      <w:pPr>
+        <w:pStyle w:val="ListParagraph"/>
+        <w:numPr>
+          <w:ilvl w:val="0"/>
+          <w:numId w:val="39"/>
+        </w:numPr>
+        <w:rPr>
+          <w:rFonts w:ascii="Arial" w:hAnsi="Arial" w:cs="Arial"/>
+          <w:sz w:val="28"/>
+          <w:szCs w:val="28"/>
+        </w:rPr>
+      </w:pPr>
+      <w:sdt>
+        <w:sdtPr>
+          <w:rPr>
+            <w:rFonts w:ascii="Arial" w:hAnsi="Arial" w:cs="Arial"/>
+            <w:sz w:val="28"/>
+            <w:szCs w:val="28"/>
+          </w:rPr>
+          <w:id w:val="-1959557564"/>
+          <w:citation/>
+        </w:sdtPr>
+        <w:sdtContent>
+          <w:r>
+            <w:rPr>
+              <w:rFonts w:ascii="Arial" w:hAnsi="Arial" w:cs="Arial"/>
+              <w:sz w:val="28"/>
+              <w:szCs w:val="28"/>
+            </w:rPr>
+            <w:fldChar w:fldCharType="begin"/>
+          </w:r>
+          <w:r>
+            <w:rPr>
+              <w:rFonts w:ascii="Arial" w:hAnsi="Arial" w:cs="Arial"/>
+              <w:sz w:val="28"/>
+              <w:szCs w:val="28"/>
+            </w:rPr>
+            <w:instrText xml:space="preserve"> CITATION VNa261 \l 7177 </w:instrText>
+          </w:r>
+          <w:r>
+            <w:rPr>
+              <w:rFonts w:ascii="Arial" w:hAnsi="Arial" w:cs="Arial"/>
+              <w:sz w:val="28"/>
+              <w:szCs w:val="28"/>
+            </w:rPr>
+            <w:fldChar w:fldCharType="separate"/>
+          </w:r>
+          <w:r>
+            <w:rPr>
+              <w:rFonts w:ascii="Arial" w:hAnsi="Arial" w:cs="Arial"/>
+              <w:noProof/>
+              <w:sz w:val="28"/>
+              <w:szCs w:val="28"/>
+            </w:rPr>
+            <w:t>(VNaidoo-DEV, 2026)</w:t>
+          </w:r>
+          <w:r>
+            <w:rPr>
+              <w:rFonts w:ascii="Arial" w:hAnsi="Arial" w:cs="Arial"/>
+              <w:sz w:val="28"/>
+              <w:szCs w:val="28"/>
+            </w:rPr>
+            <w:fldChar w:fldCharType="end"/>
+          </w:r>
+        </w:sdtContent>
+      </w:sdt>
+      <w:r>
+        <w:rPr>
+          <w:rFonts w:ascii="Arial" w:hAnsi="Arial" w:cs="Arial"/>
+          <w:sz w:val="28"/>
+          <w:szCs w:val="28"/>
+        </w:rPr>
+        <w:t>:</w:t>
+      </w:r>
+      <w:r>
+        <w:t xml:space="preserve"> </w:t>
+      </w:r>
+      <w:hyperlink r:id="rId24" w:history="1">
+        <w:r>
+          <w:rPr>
+            <w:rStyle w:val="Hyperlink"/>
+            <w:rFonts w:ascii="Arial" w:hAnsi="Arial" w:cs="Arial"/>
+            <w:sz w:val="28"/>
+            <w:szCs w:val="28"/>
+          </w:rPr>
+          <w:t>https://github.com/VNaidoo-DEV/VIRAATNAIDOOIMADASSIGNMENT2</w:t>
+        </w:r>
+      </w:hyperlink>
+    </w:p>
+    <w:p>
+      <w:pPr>
+        <w:pStyle w:val="ListParagraph"/>
+        <w:numPr>
+          <w:ilvl w:val="0"/>
+          <w:numId w:val="39"/>
+        </w:numPr>
+        <w:rPr>
+          <w:rFonts w:ascii="Arial" w:hAnsi="Arial" w:cs="Arial"/>
+          <w:sz w:val="28"/>
+          <w:szCs w:val="28"/>
+        </w:rPr>
+      </w:pPr>
+      <w:sdt>
+        <w:sdtPr>
+          <w:rPr>
+            <w:rFonts w:ascii="Arial" w:hAnsi="Arial" w:cs="Arial"/>
+            <w:sz w:val="28"/>
+            <w:szCs w:val="28"/>
+          </w:rPr>
+          <w:id w:val="-1262298061"/>
+          <w:citation/>
+        </w:sdtPr>
+        <w:sdtContent>
+          <w:r>
+            <w:rPr>
+              <w:rFonts w:ascii="Arial" w:hAnsi="Arial" w:cs="Arial"/>
+              <w:sz w:val="28"/>
+              <w:szCs w:val="28"/>
+            </w:rPr>
+            <w:fldChar w:fldCharType="begin"/>
+          </w:r>
+          <w:r>
+            <w:rPr>
+              <w:rFonts w:ascii="Arial" w:hAnsi="Arial" w:cs="Arial"/>
+              <w:sz w:val="28"/>
+              <w:szCs w:val="28"/>
+            </w:rPr>
+            <w:instrText xml:space="preserve"> CITATION Git23 \l 7177 </w:instrText>
+          </w:r>
+          <w:r>
+            <w:rPr>
+              <w:rFonts w:ascii="Arial" w:hAnsi="Arial" w:cs="Arial"/>
+              <w:sz w:val="28"/>
+              <w:szCs w:val="28"/>
+            </w:rPr>
+            <w:fldChar w:fldCharType="separate"/>
+          </w:r>
+          <w:r>
+            <w:rPr>
+              <w:rFonts w:ascii="Arial" w:hAnsi="Arial" w:cs="Arial"/>
+              <w:noProof/>
+              <w:sz w:val="28"/>
+              <w:szCs w:val="28"/>
+            </w:rPr>
+            <w:t>(Github, 2023)</w:t>
+          </w:r>
+          <w:r>
+            <w:rPr>
+              <w:rFonts w:ascii="Arial" w:hAnsi="Arial" w:cs="Arial"/>
+              <w:sz w:val="28"/>
+              <w:szCs w:val="28"/>
+            </w:rPr>
+            <w:fldChar w:fldCharType="end"/>
+          </w:r>
+        </w:sdtContent>
+      </w:sdt>
+      <w:r>
+        <w:rPr>
+          <w:rFonts w:ascii="Arial" w:hAnsi="Arial" w:cs="Arial"/>
+          <w:sz w:val="28"/>
+          <w:szCs w:val="28"/>
+        </w:rPr>
+        <w:t>:</w:t>
+      </w:r>
+      <w:r>
+        <w:t xml:space="preserve"> </w:t>
+      </w:r>
+      <w:hyperlink r:id="rId25" w:history="1">
+        <w:r>
+          <w:rPr>
+            <w:rStyle w:val="Hyperlink"/>
+            <w:rFonts w:ascii="Arial" w:hAnsi="Arial" w:cs="Arial"/>
+            <w:sz w:val="28"/>
+            <w:szCs w:val="28"/>
+          </w:rPr>
+          <w:t>https://kotlinlang.org/docs/exceptions.html</w:t>
+        </w:r>
+      </w:hyperlink>
+    </w:p>
+    <w:p>
+      <w:pPr>
+        <w:pStyle w:val="ListParagraph"/>
+        <w:numPr>
+          <w:ilvl w:val="0"/>
+          <w:numId w:val="39"/>
+        </w:numPr>
+        <w:rPr>
+          <w:rFonts w:ascii="Arial" w:hAnsi="Arial" w:cs="Arial"/>
+          <w:sz w:val="28"/>
+          <w:szCs w:val="28"/>
+        </w:rPr>
+      </w:pPr>
+      <w:sdt>
+        <w:sdtPr>
+          <w:rPr>
+            <w:rFonts w:ascii="Arial" w:hAnsi="Arial" w:cs="Arial"/>
+            <w:sz w:val="28"/>
+            <w:szCs w:val="28"/>
+          </w:rPr>
+          <w:id w:val="-1297763041"/>
+          <w:citation/>
+        </w:sdtPr>
+        <w:sdtContent>
+          <w:r>
+            <w:rPr>
+              <w:rFonts w:ascii="Arial" w:hAnsi="Arial" w:cs="Arial"/>
+              <w:sz w:val="28"/>
+              <w:szCs w:val="28"/>
+            </w:rPr>
+            <w:fldChar w:fldCharType="begin"/>
+          </w:r>
+          <w:r>
+            <w:rPr>
+              <w:rFonts w:ascii="Arial" w:hAnsi="Arial" w:cs="Arial"/>
+              <w:sz w:val="28"/>
+              <w:szCs w:val="28"/>
+            </w:rPr>
+            <w:instrText xml:space="preserve"> CITATION Ste17 \l 7177 </w:instrText>
+          </w:r>
+          <w:r>
+            <w:rPr>
+              <w:rFonts w:ascii="Arial" w:hAnsi="Arial" w:cs="Arial"/>
+              <w:sz w:val="28"/>
+              <w:szCs w:val="28"/>
+            </w:rPr>
+            <w:fldChar w:fldCharType="separate"/>
+          </w:r>
+          <w:r>
+            <w:rPr>
+              <w:rFonts w:ascii="Arial" w:hAnsi="Arial" w:cs="Arial"/>
+              <w:noProof/>
+              <w:sz w:val="28"/>
+              <w:szCs w:val="28"/>
+            </w:rPr>
+            <w:t>(Stephen Samuel, 2017)</w:t>
+          </w:r>
+          <w:r>
+            <w:rPr>
+              <w:rFonts w:ascii="Arial" w:hAnsi="Arial" w:cs="Arial"/>
+              <w:sz w:val="28"/>
+              <w:szCs w:val="28"/>
+            </w:rPr>
+            <w:fldChar w:fldCharType="end"/>
+          </w:r>
+        </w:sdtContent>
+      </w:sdt>
+      <w:r>
+        <w:rPr>
+          <w:rFonts w:ascii="Arial" w:hAnsi="Arial" w:cs="Arial"/>
+          <w:sz w:val="28"/>
+          <w:szCs w:val="28"/>
+        </w:rPr>
+        <w:t>:</w:t>
+      </w:r>
+      <w:r>
+        <w:t xml:space="preserve"> </w:t>
+      </w:r>
+      <w:hyperlink r:id="rId26" w:history="1">
+        <w:r>
+          <w:rPr>
+            <w:rStyle w:val="Hyperlink"/>
+            <w:rFonts w:ascii="Arial" w:hAnsi="Arial" w:cs="Arial"/>
+            <w:sz w:val="28"/>
+            <w:szCs w:val="28"/>
+          </w:rPr>
+          <w:t>https://books.google.co.za/books?hl=en&amp;lr=&amp;id=x08oDwAAQBAJ&amp;oi=fnd&amp;pg=PP1&amp;dq=kotl</w:t>
+        </w:r>
+        <w:r>
+          <w:rPr>
+            <w:rStyle w:val="Hyperlink"/>
+            <w:rFonts w:ascii="Arial" w:hAnsi="Arial" w:cs="Arial"/>
+            <w:sz w:val="28"/>
+            <w:szCs w:val="28"/>
+          </w:rPr>
+          <w:t>i</w:t>
+        </w:r>
+        <w:r>
+          <w:rPr>
+            <w:rStyle w:val="Hyperlink"/>
+            <w:rFonts w:ascii="Arial" w:hAnsi="Arial" w:cs="Arial"/>
+            <w:sz w:val="28"/>
+            <w:szCs w:val="28"/>
+          </w:rPr>
+          <w:t>n+2016+download&amp;ots=--LRg2uX2L&amp;sig=ku0hrctfgvaZniHLuE4MuRALRGI&amp;redir_esc=y&amp;safe=strict#v=onepage&amp;q&amp;f=false</w:t>
+        </w:r>
+      </w:hyperlink>
     </w:p>
     <w:sectPr>
       <w:pgSz w:w="11906" w:h="16838"/>
@@ -3471,6 +4090,119 @@
     </w:lvl>
   </w:abstractNum>
   <w:abstractNum w:abstractNumId="1" w15:restartNumberingAfterBreak="0">
+    <w:nsid w:val="00A43166"/>
+    <w:multiLevelType w:val="hybridMultilevel"/>
+    <w:tmpl w:val="A7143372"/>
+    <w:lvl w:ilvl="0" w:tplc="1C090001">
+      <w:start w:val="1"/>
+      <w:numFmt w:val="bullet"/>
+      <w:lvlText w:val=""/>
+      <w:lvlJc w:val="left"/>
+      <w:pPr>
+        <w:ind w:left="720" w:hanging="360"/>
+      </w:pPr>
+      <w:rPr>
+        <w:rFonts w:ascii="Symbol" w:hAnsi="Symbol" w:hint="default"/>
+      </w:rPr>
+    </w:lvl>
+    <w:lvl w:ilvl="1" w:tplc="1C090003" w:tentative="1">
+      <w:start w:val="1"/>
+      <w:numFmt w:val="bullet"/>
+      <w:lvlText w:val="o"/>
+      <w:lvlJc w:val="left"/>
+      <w:pPr>
+        <w:ind w:left="1440" w:hanging="360"/>
+      </w:pPr>
+      <w:rPr>
+        <w:rFonts w:ascii="Courier New" w:hAnsi="Courier New" w:cs="Courier New" w:hint="default"/>
+      </w:rPr>
+    </w:lvl>
+    <w:lvl w:ilvl="2" w:tplc="1C090005" w:tentative="1">
+      <w:start w:val="1"/>
+      <w:numFmt w:val="bullet"/>
+      <w:lvlText w:val=""/>
+      <w:lvlJc w:val="left"/>
+      <w:pPr>
+        <w:ind w:left="2160" w:hanging="360"/>
+      </w:pPr>
+      <w:rPr>
+        <w:rFonts w:ascii="Wingdings" w:hAnsi="Wingdings" w:hint="default"/>
+      </w:rPr>
+    </w:lvl>
+    <w:lvl w:ilvl="3" w:tplc="1C090001" w:tentative="1">
+      <w:start w:val="1"/>
+      <w:numFmt w:val="bullet"/>
+      <w:lvlText w:val=""/>
+      <w:lvlJc w:val="left"/>
+      <w:pPr>
+        <w:ind w:left="2880" w:hanging="360"/>
+      </w:pPr>
+      <w:rPr>
+        <w:rFonts w:ascii="Symbol" w:hAnsi="Symbol" w:hint="default"/>
+      </w:rPr>
+    </w:lvl>
+    <w:lvl w:ilvl="4" w:tplc="1C090003" w:tentative="1">
+      <w:start w:val="1"/>
+      <w:numFmt w:val="bullet"/>
+      <w:lvlText w:val="o"/>
+      <w:lvlJc w:val="left"/>
+      <w:pPr>
+        <w:ind w:left="3600" w:hanging="360"/>
+      </w:pPr>
+      <w:rPr>
+        <w:rFonts w:ascii="Courier New" w:hAnsi="Courier New" w:cs="Courier New" w:hint="default"/>
+      </w:rPr>
+    </w:lvl>
+    <w:lvl w:ilvl="5" w:tplc="1C090005" w:tentative="1">
+      <w:start w:val="1"/>
+      <w:numFmt w:val="bullet"/>
+      <w:lvlText w:val=""/>
+      <w:lvlJc w:val="left"/>
+      <w:pPr>
+        <w:ind w:left="4320" w:hanging="360"/>
+      </w:pPr>
+      <w:rPr>
+        <w:rFonts w:ascii="Wingdings" w:hAnsi="Wingdings" w:hint="default"/>
+      </w:rPr>
+    </w:lvl>
+    <w:lvl w:ilvl="6" w:tplc="1C090001" w:tentative="1">
+      <w:start w:val="1"/>
+      <w:numFmt w:val="bullet"/>
+      <w:lvlText w:val=""/>
+      <w:lvlJc w:val="left"/>
+      <w:pPr>
+        <w:ind w:left="5040" w:hanging="360"/>
+      </w:pPr>
+      <w:rPr>
+        <w:rFonts w:ascii="Symbol" w:hAnsi="Symbol" w:hint="default"/>
+      </w:rPr>
+    </w:lvl>
+    <w:lvl w:ilvl="7" w:tplc="1C090003" w:tentative="1">
+      <w:start w:val="1"/>
+      <w:numFmt w:val="bullet"/>
+      <w:lvlText w:val="o"/>
+      <w:lvlJc w:val="left"/>
+      <w:pPr>
+        <w:ind w:left="5760" w:hanging="360"/>
+      </w:pPr>
+      <w:rPr>
+        <w:rFonts w:ascii="Courier New" w:hAnsi="Courier New" w:cs="Courier New" w:hint="default"/>
+      </w:rPr>
+    </w:lvl>
+    <w:lvl w:ilvl="8" w:tplc="1C090005" w:tentative="1">
+      <w:start w:val="1"/>
+      <w:numFmt w:val="bullet"/>
+      <w:lvlText w:val=""/>
+      <w:lvlJc w:val="left"/>
+      <w:pPr>
+        <w:ind w:left="6480" w:hanging="360"/>
+      </w:pPr>
+      <w:rPr>
+        <w:rFonts w:ascii="Wingdings" w:hAnsi="Wingdings" w:hint="default"/>
+      </w:rPr>
+    </w:lvl>
+  </w:abstractNum>
+  <w:abstractNum w:abstractNumId="2" w15:restartNumberingAfterBreak="0">
     <w:nsid w:val="01CF0B1D"/>
     <w:multiLevelType w:val="multilevel"/>
     <w:tmpl w:val="030EB388"/>
@@ -3619,7 +4351,7 @@
       </w:rPr>
     </w:lvl>
   </w:abstractNum>
-  <w:abstractNum w:abstractNumId="2" w15:restartNumberingAfterBreak="0">
+  <w:abstractNum w:abstractNumId="3" w15:restartNumberingAfterBreak="0">
     <w:nsid w:val="065476D5"/>
     <w:multiLevelType w:val="multilevel"/>
     <w:tmpl w:val="13BA24FE"/>
@@ -3768,7 +4500,7 @@
       </w:rPr>
     </w:lvl>
   </w:abstractNum>
-  <w:abstractNum w:abstractNumId="3" w15:restartNumberingAfterBreak="0">
+  <w:abstractNum w:abstractNumId="4" w15:restartNumberingAfterBreak="0">
     <w:nsid w:val="0C9A10B1"/>
     <w:multiLevelType w:val="multilevel"/>
     <w:tmpl w:val="2938C482"/>
@@ -3881,7 +4613,7 @@
       </w:pPr>
     </w:lvl>
   </w:abstractNum>
-  <w:abstractNum w:abstractNumId="4" w15:restartNumberingAfterBreak="0">
+  <w:abstractNum w:abstractNumId="5" w15:restartNumberingAfterBreak="0">
     <w:nsid w:val="0F0612F6"/>
     <w:multiLevelType w:val="multilevel"/>
     <w:tmpl w:val="3AFE7DEA"/>
@@ -4030,7 +4762,120 @@
       </w:rPr>
     </w:lvl>
   </w:abstractNum>
-  <w:abstractNum w:abstractNumId="5" w15:restartNumberingAfterBreak="0">
+  <w:abstractNum w:abstractNumId="6" w15:restartNumberingAfterBreak="0">
+    <w:nsid w:val="113142BD"/>
+    <w:multiLevelType w:val="hybridMultilevel"/>
+    <w:tmpl w:val="24D44C4C"/>
+    <w:lvl w:ilvl="0" w:tplc="1C090001">
+      <w:start w:val="1"/>
+      <w:numFmt w:val="bullet"/>
+      <w:lvlText w:val=""/>
+      <w:lvlJc w:val="left"/>
+      <w:pPr>
+        <w:ind w:left="720" w:hanging="360"/>
+      </w:pPr>
+      <w:rPr>
+        <w:rFonts w:ascii="Symbol" w:hAnsi="Symbol" w:hint="default"/>
+      </w:rPr>
+    </w:lvl>
+    <w:lvl w:ilvl="1" w:tplc="1C090003" w:tentative="1">
+      <w:start w:val="1"/>
+      <w:numFmt w:val="bullet"/>
+      <w:lvlText w:val="o"/>
+      <w:lvlJc w:val="left"/>
+      <w:pPr>
+        <w:ind w:left="1440" w:hanging="360"/>
+      </w:pPr>
+      <w:rPr>
+        <w:rFonts w:ascii="Courier New" w:hAnsi="Courier New" w:cs="Courier New" w:hint="default"/>
+      </w:rPr>
+    </w:lvl>
+    <w:lvl w:ilvl="2" w:tplc="1C090005" w:tentative="1">
+      <w:start w:val="1"/>
+      <w:numFmt w:val="bullet"/>
+      <w:lvlText w:val=""/>
+      <w:lvlJc w:val="left"/>
+      <w:pPr>
+        <w:ind w:left="2160" w:hanging="360"/>
+      </w:pPr>
+      <w:rPr>
+        <w:rFonts w:ascii="Wingdings" w:hAnsi="Wingdings" w:hint="default"/>
+      </w:rPr>
+    </w:lvl>
+    <w:lvl w:ilvl="3" w:tplc="1C090001" w:tentative="1">
+      <w:start w:val="1"/>
+      <w:numFmt w:val="bullet"/>
+      <w:lvlText w:val=""/>
+      <w:lvlJc w:val="left"/>
+      <w:pPr>
+        <w:ind w:left="2880" w:hanging="360"/>
+      </w:pPr>
+      <w:rPr>
+        <w:rFonts w:ascii="Symbol" w:hAnsi="Symbol" w:hint="default"/>
+      </w:rPr>
+    </w:lvl>
+    <w:lvl w:ilvl="4" w:tplc="1C090003" w:tentative="1">
+      <w:start w:val="1"/>
+      <w:numFmt w:val="bullet"/>
+      <w:lvlText w:val="o"/>
+      <w:lvlJc w:val="left"/>
+      <w:pPr>
+        <w:ind w:left="3600" w:hanging="360"/>
+      </w:pPr>
+      <w:rPr>
+        <w:rFonts w:ascii="Courier New" w:hAnsi="Courier New" w:cs="Courier New" w:hint="default"/>
+      </w:rPr>
+    </w:lvl>
+    <w:lvl w:ilvl="5" w:tplc="1C090005" w:tentative="1">
+      <w:start w:val="1"/>
+      <w:numFmt w:val="bullet"/>
+      <w:lvlText w:val=""/>
+      <w:lvlJc w:val="left"/>
+      <w:pPr>
+        <w:ind w:left="4320" w:hanging="360"/>
+      </w:pPr>
+      <w:rPr>
+        <w:rFonts w:ascii="Wingdings" w:hAnsi="Wingdings" w:hint="default"/>
+      </w:rPr>
+    </w:lvl>
+    <w:lvl w:ilvl="6" w:tplc="1C090001" w:tentative="1">
+      <w:start w:val="1"/>
+      <w:numFmt w:val="bullet"/>
+      <w:lvlText w:val=""/>
+      <w:lvlJc w:val="left"/>
+      <w:pPr>
+        <w:ind w:left="5040" w:hanging="360"/>
+      </w:pPr>
+      <w:rPr>
+        <w:rFonts w:ascii="Symbol" w:hAnsi="Symbol" w:hint="default"/>
+      </w:rPr>
+    </w:lvl>
+    <w:lvl w:ilvl="7" w:tplc="1C090003" w:tentative="1">
+      <w:start w:val="1"/>
+      <w:numFmt w:val="bullet"/>
+      <w:lvlText w:val="o"/>
+      <w:lvlJc w:val="left"/>
+      <w:pPr>
+        <w:ind w:left="5760" w:hanging="360"/>
+      </w:pPr>
+      <w:rPr>
+        <w:rFonts w:ascii="Courier New" w:hAnsi="Courier New" w:cs="Courier New" w:hint="default"/>
+      </w:rPr>
+    </w:lvl>
+    <w:lvl w:ilvl="8" w:tplc="1C090005" w:tentative="1">
+      <w:start w:val="1"/>
+      <w:numFmt w:val="bullet"/>
+      <w:lvlText w:val=""/>
+      <w:lvlJc w:val="left"/>
+      <w:pPr>
+        <w:ind w:left="6480" w:hanging="360"/>
+      </w:pPr>
+      <w:rPr>
+        <w:rFonts w:ascii="Wingdings" w:hAnsi="Wingdings" w:hint="default"/>
+      </w:rPr>
+    </w:lvl>
+  </w:abstractNum>
+  <w:abstractNum w:abstractNumId="7" w15:restartNumberingAfterBreak="0">
     <w:nsid w:val="13D92C79"/>
     <w:multiLevelType w:val="multilevel"/>
     <w:tmpl w:val="9FF27C6E"/>
@@ -4179,7 +5024,7 @@
       </w:rPr>
     </w:lvl>
   </w:abstractNum>
-  <w:abstractNum w:abstractNumId="6" w15:restartNumberingAfterBreak="0">
+  <w:abstractNum w:abstractNumId="8" w15:restartNumberingAfterBreak="0">
     <w:nsid w:val="17D801B8"/>
     <w:multiLevelType w:val="multilevel"/>
     <w:tmpl w:val="32C28368"/>
@@ -4328,7 +5173,7 @@
       </w:rPr>
     </w:lvl>
   </w:abstractNum>
-  <w:abstractNum w:abstractNumId="7" w15:restartNumberingAfterBreak="0">
+  <w:abstractNum w:abstractNumId="9" w15:restartNumberingAfterBreak="0">
     <w:nsid w:val="19FA342B"/>
     <w:multiLevelType w:val="multilevel"/>
     <w:tmpl w:val="47247C06"/>
@@ -4477,7 +5322,7 @@
       </w:rPr>
     </w:lvl>
   </w:abstractNum>
-  <w:abstractNum w:abstractNumId="8" w15:restartNumberingAfterBreak="0">
+  <w:abstractNum w:abstractNumId="10" w15:restartNumberingAfterBreak="0">
     <w:nsid w:val="1BC16910"/>
     <w:multiLevelType w:val="multilevel"/>
     <w:tmpl w:val="BC1E681E"/>
@@ -4626,7 +5471,7 @@
       </w:rPr>
     </w:lvl>
   </w:abstractNum>
-  <w:abstractNum w:abstractNumId="9" w15:restartNumberingAfterBreak="0">
+  <w:abstractNum w:abstractNumId="11" w15:restartNumberingAfterBreak="0">
     <w:nsid w:val="21F30DA7"/>
     <w:multiLevelType w:val="multilevel"/>
     <w:tmpl w:val="F7AE747C"/>
@@ -4775,7 +5620,7 @@
       </w:rPr>
     </w:lvl>
   </w:abstractNum>
-  <w:abstractNum w:abstractNumId="10" w15:restartNumberingAfterBreak="0">
+  <w:abstractNum w:abstractNumId="12" w15:restartNumberingAfterBreak="0">
     <w:nsid w:val="26BB0B49"/>
     <w:multiLevelType w:val="multilevel"/>
     <w:tmpl w:val="511E7C56"/>
@@ -4924,7 +5769,7 @@
       </w:rPr>
     </w:lvl>
   </w:abstractNum>
-  <w:abstractNum w:abstractNumId="11" w15:restartNumberingAfterBreak="0">
+  <w:abstractNum w:abstractNumId="13" w15:restartNumberingAfterBreak="0">
     <w:nsid w:val="27D855A2"/>
     <w:multiLevelType w:val="multilevel"/>
     <w:tmpl w:val="D9E25EC0"/>
@@ -5073,7 +5918,7 @@
       </w:rPr>
     </w:lvl>
   </w:abstractNum>
-  <w:abstractNum w:abstractNumId="12" w15:restartNumberingAfterBreak="0">
+  <w:abstractNum w:abstractNumId="14" w15:restartNumberingAfterBreak="0">
     <w:nsid w:val="2A5C4291"/>
     <w:multiLevelType w:val="multilevel"/>
     <w:tmpl w:val="ECEA93DE"/>
@@ -5222,7 +6067,7 @@
       </w:rPr>
     </w:lvl>
   </w:abstractNum>
-  <w:abstractNum w:abstractNumId="13" w15:restartNumberingAfterBreak="0">
+  <w:abstractNum w:abstractNumId="15" w15:restartNumberingAfterBreak="0">
     <w:nsid w:val="2AF47AC5"/>
     <w:multiLevelType w:val="multilevel"/>
     <w:tmpl w:val="315AB122"/>
@@ -5371,7 +6216,7 @@
       </w:rPr>
     </w:lvl>
   </w:abstractNum>
-  <w:abstractNum w:abstractNumId="14" w15:restartNumberingAfterBreak="0">
+  <w:abstractNum w:abstractNumId="16" w15:restartNumberingAfterBreak="0">
     <w:nsid w:val="2BAD5457"/>
     <w:multiLevelType w:val="multilevel"/>
     <w:tmpl w:val="B0E01DDC"/>
@@ -5484,7 +6329,7 @@
       </w:pPr>
     </w:lvl>
   </w:abstractNum>
-  <w:abstractNum w:abstractNumId="15" w15:restartNumberingAfterBreak="0">
+  <w:abstractNum w:abstractNumId="17" w15:restartNumberingAfterBreak="0">
     <w:nsid w:val="2F9C2E10"/>
     <w:multiLevelType w:val="multilevel"/>
     <w:tmpl w:val="977850D8"/>
@@ -5633,7 +6478,7 @@
       </w:rPr>
     </w:lvl>
   </w:abstractNum>
-  <w:abstractNum w:abstractNumId="16" w15:restartNumberingAfterBreak="0">
+  <w:abstractNum w:abstractNumId="18" w15:restartNumberingAfterBreak="0">
     <w:nsid w:val="30492F53"/>
     <w:multiLevelType w:val="multilevel"/>
     <w:tmpl w:val="9BACBF40"/>
@@ -5782,7 +6627,7 @@
       </w:rPr>
     </w:lvl>
   </w:abstractNum>
-  <w:abstractNum w:abstractNumId="17" w15:restartNumberingAfterBreak="0">
+  <w:abstractNum w:abstractNumId="19" w15:restartNumberingAfterBreak="0">
     <w:nsid w:val="430B30D4"/>
     <w:multiLevelType w:val="multilevel"/>
     <w:tmpl w:val="F36401A4"/>
@@ -5931,7 +6776,7 @@
       </w:rPr>
     </w:lvl>
   </w:abstractNum>
-  <w:abstractNum w:abstractNumId="18" w15:restartNumberingAfterBreak="0">
+  <w:abstractNum w:abstractNumId="20" w15:restartNumberingAfterBreak="0">
     <w:nsid w:val="481F17D0"/>
     <w:multiLevelType w:val="multilevel"/>
     <w:tmpl w:val="984C129E"/>
@@ -6080,7 +6925,7 @@
       </w:rPr>
     </w:lvl>
   </w:abstractNum>
-  <w:abstractNum w:abstractNumId="19" w15:restartNumberingAfterBreak="0">
+  <w:abstractNum w:abstractNumId="21" w15:restartNumberingAfterBreak="0">
     <w:nsid w:val="4C592CFC"/>
     <w:multiLevelType w:val="multilevel"/>
     <w:tmpl w:val="E91A2B6A"/>
@@ -6193,7 +7038,93 @@
       </w:pPr>
     </w:lvl>
   </w:abstractNum>
-  <w:abstractNum w:abstractNumId="20" w15:restartNumberingAfterBreak="0">
+  <w:abstractNum w:abstractNumId="22" w15:restartNumberingAfterBreak="0">
+    <w:nsid w:val="4CA510B1"/>
+    <w:multiLevelType w:val="hybridMultilevel"/>
+    <w:tmpl w:val="17EAF5A2"/>
+    <w:lvl w:ilvl="0" w:tplc="1C09000F">
+      <w:start w:val="1"/>
+      <w:numFmt w:val="decimal"/>
+      <w:lvlText w:val="%1."/>
+      <w:lvlJc w:val="left"/>
+      <w:pPr>
+        <w:ind w:left="720" w:hanging="360"/>
+      </w:pPr>
+    </w:lvl>
+    <w:lvl w:ilvl="1" w:tplc="1C090019" w:tentative="1">
+      <w:start w:val="1"/>
+      <w:numFmt w:val="lowerLetter"/>
+      <w:lvlText w:val="%2."/>
+      <w:lvlJc w:val="left"/>
+      <w:pPr>
+        <w:ind w:left="1440" w:hanging="360"/>
+      </w:pPr>
+    </w:lvl>
+    <w:lvl w:ilvl="2" w:tplc="1C09001B" w:tentative="1">
+      <w:start w:val="1"/>
+      <w:numFmt w:val="lowerRoman"/>
+      <w:lvlText w:val="%3."/>
+      <w:lvlJc w:val="right"/>
+      <w:pPr>
+        <w:ind w:left="2160" w:hanging="180"/>
+      </w:pPr>
+    </w:lvl>
+    <w:lvl w:ilvl="3" w:tplc="1C09000F" w:tentative="1">
+      <w:start w:val="1"/>
+      <w:numFmt w:val="decimal"/>
+      <w:lvlText w:val="%4."/>
+      <w:lvlJc w:val="left"/>
+      <w:pPr>
+        <w:ind w:left="2880" w:hanging="360"/>
+      </w:pPr>
+    </w:lvl>
+    <w:lvl w:ilvl="4" w:tplc="1C090019" w:tentative="1">
+      <w:start w:val="1"/>
+      <w:numFmt w:val="lowerLetter"/>
+      <w:lvlText w:val="%5."/>
+      <w:lvlJc w:val="left"/>
+      <w:pPr>
+        <w:ind w:left="3600" w:hanging="360"/>
+      </w:pPr>
+    </w:lvl>
+    <w:lvl w:ilvl="5" w:tplc="1C09001B" w:tentative="1">
+      <w:start w:val="1"/>
+      <w:numFmt w:val="lowerRoman"/>
+      <w:lvlText w:val="%6."/>
+      <w:lvlJc w:val="right"/>
+      <w:pPr>
+        <w:ind w:left="4320" w:hanging="180"/>
+      </w:pPr>
+    </w:lvl>
+    <w:lvl w:ilvl="6" w:tplc="1C09000F" w:tentative="1">
+      <w:start w:val="1"/>
+      <w:numFmt w:val="decimal"/>
+      <w:lvlText w:val="%7."/>
+      <w:lvlJc w:val="left"/>
+      <w:pPr>
+        <w:ind w:left="5040" w:hanging="360"/>
+      </w:pPr>
+    </w:lvl>
+    <w:lvl w:ilvl="7" w:tplc="1C090019" w:tentative="1">
+      <w:start w:val="1"/>
+      <w:numFmt w:val="lowerLetter"/>
+      <w:lvlText w:val="%8."/>
+      <w:lvlJc w:val="left"/>
+      <w:pPr>
+        <w:ind w:left="5760" w:hanging="360"/>
+      </w:pPr>
+    </w:lvl>
+    <w:lvl w:ilvl="8" w:tplc="1C09001B" w:tentative="1">
+      <w:start w:val="1"/>
+      <w:numFmt w:val="lowerRoman"/>
+      <w:lvlText w:val="%9."/>
+      <w:lvlJc w:val="right"/>
+      <w:pPr>
+        <w:ind w:left="6480" w:hanging="180"/>
+      </w:pPr>
+    </w:lvl>
+  </w:abstractNum>
+  <w:abstractNum w:abstractNumId="23" w15:restartNumberingAfterBreak="0">
     <w:nsid w:val="52721940"/>
     <w:multiLevelType w:val="multilevel"/>
     <w:tmpl w:val="A8ECDB3E"/>
@@ -6306,7 +7237,7 @@
       </w:pPr>
     </w:lvl>
   </w:abstractNum>
-  <w:abstractNum w:abstractNumId="21" w15:restartNumberingAfterBreak="0">
+  <w:abstractNum w:abstractNumId="24" w15:restartNumberingAfterBreak="0">
     <w:nsid w:val="54EA498A"/>
     <w:multiLevelType w:val="multilevel"/>
     <w:tmpl w:val="144C03E0"/>
@@ -6455,7 +7386,7 @@
       </w:rPr>
     </w:lvl>
   </w:abstractNum>
-  <w:abstractNum w:abstractNumId="22" w15:restartNumberingAfterBreak="0">
+  <w:abstractNum w:abstractNumId="25" w15:restartNumberingAfterBreak="0">
     <w:nsid w:val="561066FD"/>
     <w:multiLevelType w:val="multilevel"/>
     <w:tmpl w:val="9912D1EA"/>
@@ -6604,7 +7535,7 @@
       </w:rPr>
     </w:lvl>
   </w:abstractNum>
-  <w:abstractNum w:abstractNumId="23" w15:restartNumberingAfterBreak="0">
+  <w:abstractNum w:abstractNumId="26" w15:restartNumberingAfterBreak="0">
     <w:nsid w:val="5BCF56C6"/>
     <w:multiLevelType w:val="multilevel"/>
     <w:tmpl w:val="69B82E3E"/>
@@ -6753,7 +7684,7 @@
       </w:rPr>
     </w:lvl>
   </w:abstractNum>
-  <w:abstractNum w:abstractNumId="24" w15:restartNumberingAfterBreak="0">
+  <w:abstractNum w:abstractNumId="27" w15:restartNumberingAfterBreak="0">
     <w:nsid w:val="5CD35104"/>
     <w:multiLevelType w:val="multilevel"/>
     <w:tmpl w:val="BF36F284"/>
@@ -6902,7 +7833,7 @@
       </w:rPr>
     </w:lvl>
   </w:abstractNum>
-  <w:abstractNum w:abstractNumId="25" w15:restartNumberingAfterBreak="0">
+  <w:abstractNum w:abstractNumId="28" w15:restartNumberingAfterBreak="0">
     <w:nsid w:val="5ED55E1C"/>
     <w:multiLevelType w:val="multilevel"/>
     <w:tmpl w:val="431CE166"/>
@@ -7051,7 +7982,7 @@
       </w:rPr>
     </w:lvl>
   </w:abstractNum>
-  <w:abstractNum w:abstractNumId="26" w15:restartNumberingAfterBreak="0">
+  <w:abstractNum w:abstractNumId="29" w15:restartNumberingAfterBreak="0">
     <w:nsid w:val="61DC10B7"/>
     <w:multiLevelType w:val="multilevel"/>
     <w:tmpl w:val="F21468EE"/>
@@ -7200,7 +8131,7 @@
       </w:rPr>
     </w:lvl>
   </w:abstractNum>
-  <w:abstractNum w:abstractNumId="27" w15:restartNumberingAfterBreak="0">
+  <w:abstractNum w:abstractNumId="30" w15:restartNumberingAfterBreak="0">
     <w:nsid w:val="627D3450"/>
     <w:multiLevelType w:val="multilevel"/>
     <w:tmpl w:val="2DD223AA"/>
@@ -7313,7 +8244,7 @@
       </w:pPr>
     </w:lvl>
   </w:abstractNum>
-  <w:abstractNum w:abstractNumId="28" w15:restartNumberingAfterBreak="0">
+  <w:abstractNum w:abstractNumId="31" w15:restartNumberingAfterBreak="0">
     <w:nsid w:val="645442E9"/>
     <w:multiLevelType w:val="multilevel"/>
     <w:tmpl w:val="663C734A"/>
@@ -7462,7 +8393,7 @@
       </w:rPr>
     </w:lvl>
   </w:abstractNum>
-  <w:abstractNum w:abstractNumId="29" w15:restartNumberingAfterBreak="0">
+  <w:abstractNum w:abstractNumId="32" w15:restartNumberingAfterBreak="0">
     <w:nsid w:val="674F0A26"/>
     <w:multiLevelType w:val="multilevel"/>
     <w:tmpl w:val="06F8C15E"/>
@@ -7611,7 +8542,7 @@
       </w:rPr>
     </w:lvl>
   </w:abstractNum>
-  <w:abstractNum w:abstractNumId="30" w15:restartNumberingAfterBreak="0">
+  <w:abstractNum w:abstractNumId="33" w15:restartNumberingAfterBreak="0">
     <w:nsid w:val="698E486E"/>
     <w:multiLevelType w:val="multilevel"/>
     <w:tmpl w:val="AB92A982"/>
@@ -7760,7 +8691,7 @@
       </w:rPr>
     </w:lvl>
   </w:abstractNum>
-  <w:abstractNum w:abstractNumId="31" w15:restartNumberingAfterBreak="0">
+  <w:abstractNum w:abstractNumId="34" w15:restartNumberingAfterBreak="0">
     <w:nsid w:val="6BD16E5B"/>
     <w:multiLevelType w:val="multilevel"/>
     <w:tmpl w:val="F086D5DE"/>
@@ -7909,7 +8840,7 @@
       </w:rPr>
     </w:lvl>
   </w:abstractNum>
-  <w:abstractNum w:abstractNumId="32" w15:restartNumberingAfterBreak="0">
+  <w:abstractNum w:abstractNumId="35" w15:restartNumberingAfterBreak="0">
     <w:nsid w:val="705C493C"/>
     <w:multiLevelType w:val="multilevel"/>
     <w:tmpl w:val="A6661594"/>
@@ -8022,7 +8953,7 @@
       </w:pPr>
     </w:lvl>
   </w:abstractNum>
-  <w:abstractNum w:abstractNumId="33" w15:restartNumberingAfterBreak="0">
+  <w:abstractNum w:abstractNumId="36" w15:restartNumberingAfterBreak="0">
     <w:nsid w:val="741111B8"/>
     <w:multiLevelType w:val="multilevel"/>
     <w:tmpl w:val="F5EE7028"/>
@@ -8171,7 +9102,7 @@
       </w:rPr>
     </w:lvl>
   </w:abstractNum>
-  <w:abstractNum w:abstractNumId="34" w15:restartNumberingAfterBreak="0">
+  <w:abstractNum w:abstractNumId="37" w15:restartNumberingAfterBreak="0">
     <w:nsid w:val="7689331E"/>
     <w:multiLevelType w:val="multilevel"/>
     <w:tmpl w:val="8E82754E"/>
@@ -8320,7 +9251,7 @@
       </w:rPr>
     </w:lvl>
   </w:abstractNum>
-  <w:abstractNum w:abstractNumId="35" w15:restartNumberingAfterBreak="0">
+  <w:abstractNum w:abstractNumId="38" w15:restartNumberingAfterBreak="0">
     <w:nsid w:val="7840111C"/>
     <w:multiLevelType w:val="multilevel"/>
     <w:tmpl w:val="458EE88C"/>
@@ -8470,112 +9401,121 @@
     </w:lvl>
   </w:abstractNum>
   <w:num w:numId="1" w16cid:durableId="209347183">
-    <w:abstractNumId w:val="5"/>
+    <w:abstractNumId w:val="7"/>
   </w:num>
   <w:num w:numId="2" w16cid:durableId="1227572510">
-    <w:abstractNumId w:val="6"/>
+    <w:abstractNumId w:val="8"/>
   </w:num>
   <w:num w:numId="3" w16cid:durableId="1189761973">
+    <w:abstractNumId w:val="28"/>
+  </w:num>
+  <w:num w:numId="4" w16cid:durableId="1159931208">
+    <w:abstractNumId w:val="9"/>
+  </w:num>
+  <w:num w:numId="5" w16cid:durableId="1915973506">
+    <w:abstractNumId w:val="32"/>
+  </w:num>
+  <w:num w:numId="6" w16cid:durableId="502282697">
+    <w:abstractNumId w:val="11"/>
+  </w:num>
+  <w:num w:numId="7" w16cid:durableId="1832021445">
+    <w:abstractNumId w:val="2"/>
+  </w:num>
+  <w:num w:numId="8" w16cid:durableId="420296117">
+    <w:abstractNumId w:val="35"/>
+  </w:num>
+  <w:num w:numId="9" w16cid:durableId="1815180444">
+    <w:abstractNumId w:val="16"/>
+  </w:num>
+  <w:num w:numId="10" w16cid:durableId="1732651839">
+    <w:abstractNumId w:val="29"/>
+  </w:num>
+  <w:num w:numId="11" w16cid:durableId="206138587">
+    <w:abstractNumId w:val="15"/>
+  </w:num>
+  <w:num w:numId="12" w16cid:durableId="1336151392">
     <w:abstractNumId w:val="25"/>
   </w:num>
-  <w:num w:numId="4" w16cid:durableId="1159931208">
-    <w:abstractNumId w:val="7"/>
-  </w:num>
-  <w:num w:numId="5" w16cid:durableId="1915973506">
-    <w:abstractNumId w:val="29"/>
-  </w:num>
-  <w:num w:numId="6" w16cid:durableId="502282697">
-    <w:abstractNumId w:val="9"/>
-  </w:num>
-  <w:num w:numId="7" w16cid:durableId="1832021445">
-    <w:abstractNumId w:val="1"/>
-  </w:num>
-  <w:num w:numId="8" w16cid:durableId="420296117">
-    <w:abstractNumId w:val="32"/>
-  </w:num>
-  <w:num w:numId="9" w16cid:durableId="1815180444">
-    <w:abstractNumId w:val="14"/>
-  </w:num>
-  <w:num w:numId="10" w16cid:durableId="1732651839">
-    <w:abstractNumId w:val="26"/>
-  </w:num>
-  <w:num w:numId="11" w16cid:durableId="206138587">
-    <w:abstractNumId w:val="13"/>
-  </w:num>
-  <w:num w:numId="12" w16cid:durableId="1336151392">
-    <w:abstractNumId w:val="22"/>
-  </w:num>
   <w:num w:numId="13" w16cid:durableId="962612418">
-    <w:abstractNumId w:val="17"/>
+    <w:abstractNumId w:val="19"/>
   </w:num>
   <w:num w:numId="14" w16cid:durableId="1691294812">
     <w:abstractNumId w:val="0"/>
   </w:num>
   <w:num w:numId="15" w16cid:durableId="2079862242">
-    <w:abstractNumId w:val="15"/>
+    <w:abstractNumId w:val="17"/>
   </w:num>
   <w:num w:numId="16" w16cid:durableId="419106484">
+    <w:abstractNumId w:val="34"/>
+  </w:num>
+  <w:num w:numId="17" w16cid:durableId="1907572159">
+    <w:abstractNumId w:val="21"/>
+  </w:num>
+  <w:num w:numId="18" w16cid:durableId="914508438">
+    <w:abstractNumId w:val="3"/>
+  </w:num>
+  <w:num w:numId="19" w16cid:durableId="1044596755">
+    <w:abstractNumId w:val="13"/>
+  </w:num>
+  <w:num w:numId="20" w16cid:durableId="1294679266">
+    <w:abstractNumId w:val="23"/>
+  </w:num>
+  <w:num w:numId="21" w16cid:durableId="1856384527">
+    <w:abstractNumId w:val="38"/>
+  </w:num>
+  <w:num w:numId="22" w16cid:durableId="140660229">
+    <w:abstractNumId w:val="14"/>
+  </w:num>
+  <w:num w:numId="23" w16cid:durableId="810757107">
     <w:abstractNumId w:val="31"/>
   </w:num>
-  <w:num w:numId="17" w16cid:durableId="1907572159">
-    <w:abstractNumId w:val="19"/>
+  <w:num w:numId="24" w16cid:durableId="282003418">
+    <w:abstractNumId w:val="24"/>
   </w:num>
-  <w:num w:numId="18" w16cid:durableId="914508438">
-    <w:abstractNumId w:val="2"/>
+  <w:num w:numId="25" w16cid:durableId="1490906649">
+    <w:abstractNumId w:val="37"/>
   </w:num>
-  <w:num w:numId="19" w16cid:durableId="1044596755">
-    <w:abstractNumId w:val="11"/>
+  <w:num w:numId="26" w16cid:durableId="162472489">
+    <w:abstractNumId w:val="5"/>
   </w:num>
-  <w:num w:numId="20" w16cid:durableId="1294679266">
+  <w:num w:numId="27" w16cid:durableId="628360344">
+    <w:abstractNumId w:val="12"/>
+  </w:num>
+  <w:num w:numId="28" w16cid:durableId="629943236">
+    <w:abstractNumId w:val="26"/>
+  </w:num>
+  <w:num w:numId="29" w16cid:durableId="1346322004">
     <w:abstractNumId w:val="20"/>
   </w:num>
-  <w:num w:numId="21" w16cid:durableId="1856384527">
-    <w:abstractNumId w:val="35"/>
+  <w:num w:numId="30" w16cid:durableId="1360858293">
+    <w:abstractNumId w:val="30"/>
   </w:num>
-  <w:num w:numId="22" w16cid:durableId="140660229">
-    <w:abstractNumId w:val="12"/>
+  <w:num w:numId="31" w16cid:durableId="1434590555">
+    <w:abstractNumId w:val="18"/>
   </w:num>
-  <w:num w:numId="23" w16cid:durableId="810757107">
-    <w:abstractNumId w:val="28"/>
+  <w:num w:numId="32" w16cid:durableId="81614113">
+    <w:abstractNumId w:val="36"/>
   </w:num>
-  <w:num w:numId="24" w16cid:durableId="282003418">
-    <w:abstractNumId w:val="21"/>
-  </w:num>
-  <w:num w:numId="25" w16cid:durableId="1490906649">
-    <w:abstractNumId w:val="34"/>
-  </w:num>
-  <w:num w:numId="26" w16cid:durableId="162472489">
+  <w:num w:numId="33" w16cid:durableId="886646980">
     <w:abstractNumId w:val="4"/>
   </w:num>
-  <w:num w:numId="27" w16cid:durableId="628360344">
+  <w:num w:numId="34" w16cid:durableId="1611352564">
     <w:abstractNumId w:val="10"/>
   </w:num>
-  <w:num w:numId="28" w16cid:durableId="629943236">
-    <w:abstractNumId w:val="23"/>
-  </w:num>
-  <w:num w:numId="29" w16cid:durableId="1346322004">
-    <w:abstractNumId w:val="18"/>
-  </w:num>
-  <w:num w:numId="30" w16cid:durableId="1360858293">
+  <w:num w:numId="35" w16cid:durableId="609434443">
     <w:abstractNumId w:val="27"/>
   </w:num>
-  <w:num w:numId="31" w16cid:durableId="1434590555">
-    <w:abstractNumId w:val="16"/>
-  </w:num>
-  <w:num w:numId="32" w16cid:durableId="81614113">
+  <w:num w:numId="36" w16cid:durableId="888685656">
     <w:abstractNumId w:val="33"/>
   </w:num>
-  <w:num w:numId="33" w16cid:durableId="886646980">
-    <w:abstractNumId w:val="3"/>
+  <w:num w:numId="37" w16cid:durableId="1661033097">
+    <w:abstractNumId w:val="1"/>
   </w:num>
-  <w:num w:numId="34" w16cid:durableId="1611352564">
-    <w:abstractNumId w:val="8"/>
+  <w:num w:numId="38" w16cid:durableId="302737521">
+    <w:abstractNumId w:val="6"/>
   </w:num>
-  <w:num w:numId="35" w16cid:durableId="609434443">
-    <w:abstractNumId w:val="24"/>
-  </w:num>
-  <w:num w:numId="36" w16cid:durableId="888685656">
-    <w:abstractNumId w:val="30"/>
+  <w:num w:numId="39" w16cid:durableId="1964337587">
+    <w:abstractNumId w:val="22"/>
   </w:num>
 </w:numbering>
 </file>
@@ -9183,6 +10123,7 @@
   <w:style w:type="character" w:default="1" w:styleId="DefaultParagraphFont">
     <w:name w:val="Default Paragraph Font"/>
     <w:uiPriority w:val="1"/>
+    <w:semiHidden/>
     <w:unhideWhenUsed/>
   </w:style>
   <w:style w:type="table" w:default="1" w:styleId="TableNormal">
@@ -9519,6 +10460,18 @@
       <w:shd w:val="clear" w:color="auto" w:fill="E1DFDD"/>
     </w:rPr>
   </w:style>
+  <w:style w:type="character" w:styleId="FollowedHyperlink">
+    <w:name w:val="FollowedHyperlink"/>
+    <w:basedOn w:val="DefaultParagraphFont"/>
+    <w:uiPriority w:val="99"/>
+    <w:semiHidden/>
+    <w:unhideWhenUsed/>
+    <w:rsid w:val="00C1519F"/>
+    <w:rPr>
+      <w:color w:val="96607D" w:themeColor="followedHyperlink"/>
+      <w:u w:val="single"/>
+    </w:rPr>
+  </w:style>
 </w:styles>
 </file>
 
@@ -9835,4 +10788,93 @@
     </a:ext>
   </a:extLst>
 </a:theme>
+</file>
+
+<file path=customXml/item1.xml><?xml version="1.0" encoding="utf-8"?>
+<b:Sources xmlns:b="http://schemas.openxmlformats.org/officeDocument/2006/bibliography" xmlns="http://schemas.openxmlformats.org/officeDocument/2006/bibliography" SelectedStyle="\HarvardAnglia2008OfficeOnline.xsl" StyleName="Harvard - Anglia" Version="2008">
+  <b:Source>
+    <b:Tag>Gog262</b:Tag>
+    <b:SourceType>InternetSite</b:SourceType>
+    <b:Guid>{F276A5B9-462E-4722-BCA9-EE7F44392F83}</b:Guid>
+    <b:Author>
+      <b:Author>
+        <b:NameList>
+          <b:Person>
+            <b:Last>IV</b:Last>
+            <b:First>Gogeta</b:First>
+          </b:Person>
+        </b:NameList>
+      </b:Author>
+    </b:Author>
+    <b:Title>IMAD ASSIGNMENT 2</b:Title>
+    <b:Year>2026</b:Year>
+    <b:YearAccessed>2026</b:YearAccessed>
+    <b:MonthAccessed>04</b:MonthAccessed>
+    <b:DayAccessed>24</b:DayAccessed>
+    <b:URL>https://chatgpt.com/share/69eb2892-75c8-83ea-be1d-7c44d37ef5a4</b:URL>
+    <b:RefOrder>1</b:RefOrder>
+  </b:Source>
+  <b:Source>
+    <b:Tag>VNa261</b:Tag>
+    <b:SourceType>InternetSite</b:SourceType>
+    <b:Guid>{94FB3D70-C500-4E0D-AE0E-5CD720EC8E2E}</b:Guid>
+    <b:Author>
+      <b:Author>
+        <b:Corporate>VNaidoo-DEV</b:Corporate>
+      </b:Author>
+    </b:Author>
+    <b:Title>VIRAATNAIDOOIMADASSIGNMENT2</b:Title>
+    <b:Year>2026</b:Year>
+    <b:YearAccessed>2026</b:YearAccessed>
+    <b:MonthAccessed>04</b:MonthAccessed>
+    <b:DayAccessed>24</b:DayAccessed>
+    <b:URL>https://github.com/VNaidoo-DEV/VIRAATNAIDOOIMADASSIGNMENT2</b:URL>
+    <b:RefOrder>2</b:RefOrder>
+  </b:Source>
+  <b:Source>
+    <b:Tag>Git23</b:Tag>
+    <b:SourceType>InternetSite</b:SourceType>
+    <b:Guid>{263400DF-1B1F-4A2B-A6B4-F2562473EA83}</b:Guid>
+    <b:Author>
+      <b:Author>
+        <b:NameList>
+          <b:Person>
+            <b:Last>Github</b:Last>
+          </b:Person>
+        </b:NameList>
+      </b:Author>
+    </b:Author>
+    <b:Title>Exception and error handling</b:Title>
+    <b:Year>2023</b:Year>
+    <b:YearAccessed>2026</b:YearAccessed>
+    <b:MonthAccessed>04</b:MonthAccessed>
+    <b:DayAccessed>19</b:DayAccessed>
+    <b:URL>https://kotlinlang.org/docs/exceptions.html</b:URL>
+    <b:RefOrder>3</b:RefOrder>
+  </b:Source>
+  <b:Source>
+    <b:Tag>Ste17</b:Tag>
+    <b:SourceType>Book</b:SourceType>
+    <b:Guid>{B177985F-B86A-4C18-A798-8AD4C07F31BB}</b:Guid>
+    <b:Title>Programming Kotlin</b:Title>
+    <b:Year>2017</b:Year>
+    <b:Author>
+      <b:Author>
+        <b:Corporate>Stephen Samuel</b:Corporate>
+      </b:Author>
+    </b:Author>
+    <b:City>Birmingham</b:City>
+    <b:Publisher>Packt Publishing Ltd</b:Publisher>
+    <b:Edition>1st</b:Edition>
+    <b:RefOrder>4</b:RefOrder>
+  </b:Source>
+</b:Sources>
+</file>
+
+<file path=customXml/itemProps1.xml><?xml version="1.0" encoding="utf-8"?>
+<ds:datastoreItem xmlns:ds="http://schemas.openxmlformats.org/officeDocument/2006/customXml" ds:itemID="{15F3240B-3CDB-42B2-A42A-59934CEED95C}">
+  <ds:schemaRefs>
+    <ds:schemaRef ds:uri="http://schemas.openxmlformats.org/officeDocument/2006/bibliography"/>
+  </ds:schemaRefs>
+</ds:datastoreItem>
 </file>
</xml_diff>